<commit_message>
fix: arrumando documento base, correção no pre registo
</commit_message>
<xml_diff>
--- a/backend/storage/app/base_documents/guarulhos/relatorioFct.docx
+++ b/backend/storage/app/base_documents/guarulhos/relatorioFct.docx
@@ -1,27 +1,23 @@
 
 <file path=word/document.xml><?xml version="1.0" encoding="utf-8"?>
-<w:document xmlns:o="urn:schemas-microsoft-com:office:office" xmlns:r="http://schemas.openxmlformats.org/officeDocument/2006/relationships" xmlns:v="urn:schemas-microsoft-com:vml" xmlns:w="http://schemas.openxmlformats.org/wordprocessingml/2006/main" xmlns:w10="urn:schemas-microsoft-com:office:word" xmlns:wp="http://schemas.openxmlformats.org/drawingml/2006/wordprocessingDrawing" xmlns:pic="http://schemas.openxmlformats.org/drawingml/2006/picture" xmlns:wps="http://schemas.microsoft.com/office/word/2010/wordprocessingShape" xmlns:wpg="http://schemas.microsoft.com/office/word/2010/wordprocessingGroup" xmlns:mc="http://schemas.openxmlformats.org/markup-compatibility/2006" xmlns:wp14="http://schemas.microsoft.com/office/word/2010/wordprocessingDrawing" xmlns:w14="http://schemas.microsoft.com/office/word/2010/wordml" xmlns:w15="http://schemas.microsoft.com/office/word/2012/wordml" mc:Ignorable="w14 wp14 w15">
+<w:document xmlns:wpc="http://schemas.microsoft.com/office/word/2010/wordprocessingCanvas" xmlns:cx="http://schemas.microsoft.com/office/drawing/2014/chartex" xmlns:cx1="http://schemas.microsoft.com/office/drawing/2015/9/8/chartex" xmlns:cx2="http://schemas.microsoft.com/office/drawing/2015/10/21/chartex" xmlns:cx3="http://schemas.microsoft.com/office/drawing/2016/5/9/chartex" xmlns:cx4="http://schemas.microsoft.com/office/drawing/2016/5/10/chartex" xmlns:cx5="http://schemas.microsoft.com/office/drawing/2016/5/11/chartex" xmlns:cx6="http://schemas.microsoft.com/office/drawing/2016/5/12/chartex" xmlns:cx7="http://schemas.microsoft.com/office/drawing/2016/5/13/chartex" xmlns:cx8="http://schemas.microsoft.com/office/drawing/2016/5/14/chartex" xmlns:mc="http://schemas.openxmlformats.org/markup-compatibility/2006" xmlns:aink="http://schemas.microsoft.com/office/drawing/2016/ink" xmlns:am3d="http://schemas.microsoft.com/office/drawing/2017/model3d" xmlns:o="urn:schemas-microsoft-com:office:office" xmlns:oel="http://schemas.microsoft.com/office/2019/extlst" xmlns:r="http://schemas.openxmlformats.org/officeDocument/2006/relationships" xmlns:m="http://schemas.openxmlformats.org/officeDocument/2006/math" xmlns:v="urn:schemas-microsoft-com:vml" xmlns:wp14="http://schemas.microsoft.com/office/word/2010/wordprocessingDrawing" xmlns:wp="http://schemas.openxmlformats.org/drawingml/2006/wordprocessingDrawing" xmlns:w10="urn:schemas-microsoft-com:office:word" xmlns:w="http://schemas.openxmlformats.org/wordprocessingml/2006/main" xmlns:w14="http://schemas.microsoft.com/office/word/2010/wordml" xmlns:w15="http://schemas.microsoft.com/office/word/2012/wordml" xmlns:w16cex="http://schemas.microsoft.com/office/word/2018/wordml/cex" xmlns:w16cid="http://schemas.microsoft.com/office/word/2016/wordml/cid" xmlns:w16="http://schemas.microsoft.com/office/word/2018/wordml" xmlns:w16du="http://schemas.microsoft.com/office/word/2023/wordml/word16du" xmlns:w16sdtdh="http://schemas.microsoft.com/office/word/2020/wordml/sdtdatahash" xmlns:w16sdtfl="http://schemas.microsoft.com/office/word/2024/wordml/sdtformatlock" xmlns:w16se="http://schemas.microsoft.com/office/word/2015/wordml/symex" xmlns:wpg="http://schemas.microsoft.com/office/word/2010/wordprocessingGroup" xmlns:wpi="http://schemas.microsoft.com/office/word/2010/wordprocessingInk" xmlns:wne="http://schemas.microsoft.com/office/word/2006/wordml" xmlns:wps="http://schemas.microsoft.com/office/word/2010/wordprocessingShape" mc:Ignorable="w14 w15 w16se w16cid w16 w16cex w16sdtdh w16sdtfl w16du wp14">
   <w:body>
     <w:tbl>
       <w:tblPr>
         <w:tblW w:w="4347" w:type="dxa"/>
-        <w:jc w:val="left"/>
-        <w:tblInd w:w="0" w:type="dxa"/>
         <w:tblLayout w:type="fixed"/>
         <w:tblCellMar>
-          <w:top w:w="0" w:type="dxa"/>
           <w:left w:w="10" w:type="dxa"/>
-          <w:bottom w:w="0" w:type="dxa"/>
           <w:right w:w="10" w:type="dxa"/>
         </w:tblCellMar>
-        <w:tblLook w:val="04a0" w:noHBand="0" w:noVBand="1" w:firstColumn="1" w:lastRow="0" w:lastColumn="0" w:firstRow="1"/>
+        <w:tblLook w:val="04A0" w:firstRow="1" w:lastRow="0" w:firstColumn="1" w:lastColumn="0" w:noHBand="0" w:noVBand="1"/>
       </w:tblPr>
       <w:tblGrid>
         <w:gridCol w:w="4347"/>
       </w:tblGrid>
       <w:tr>
         <w:trPr>
-          <w:trHeight w:val="786" w:hRule="atLeast"/>
+          <w:trHeight w:val="786"/>
         </w:trPr>
         <w:tc>
           <w:tcPr>
@@ -32,25 +28,17 @@
               <w:bottom w:val="single" w:sz="4" w:space="0" w:color="000000"/>
               <w:right w:val="single" w:sz="4" w:space="0" w:color="000000"/>
             </w:tcBorders>
-            <w:shd w:color="auto" w:fill="F2F2F2" w:val="clear"/>
+            <w:shd w:val="clear" w:color="auto" w:fill="F2F2F2"/>
           </w:tcPr>
           <w:p>
             <w:pPr>
-              <w:pStyle w:val="Normal"/>
               <w:rPr>
                 <w:lang w:val="pt-PT"/>
               </w:rPr>
             </w:pPr>
-            <w:r>
-              <w:rPr>
-                <w:lang w:val="pt-PT"/>
-              </w:rPr>
-            </w:r>
           </w:p>
           <w:p>
             <w:pPr>
-              <w:pStyle w:val="Normal"/>
-              <w:spacing w:before="0" w:after="160"/>
               <w:rPr>
                 <w:lang w:val="pt-PT"/>
               </w:rPr>
@@ -69,33 +57,23 @@
     </w:tbl>
     <w:p>
       <w:pPr>
-        <w:pStyle w:val="Normal"/>
         <w:rPr>
           <w:lang w:val="pt-PT"/>
         </w:rPr>
       </w:pPr>
-      <w:r>
-        <w:rPr>
-          <w:lang w:val="pt-PT"/>
-        </w:rPr>
-      </w:r>
     </w:p>
     <w:tbl>
       <w:tblPr>
         <w:tblW w:w="8494" w:type="dxa"/>
-        <w:jc w:val="left"/>
-        <w:tblInd w:w="0" w:type="dxa"/>
         <w:tblLayout w:type="fixed"/>
         <w:tblCellMar>
-          <w:top w:w="0" w:type="dxa"/>
           <w:left w:w="10" w:type="dxa"/>
-          <w:bottom w:w="0" w:type="dxa"/>
           <w:right w:w="10" w:type="dxa"/>
         </w:tblCellMar>
-        <w:tblLook w:val="04a0" w:noHBand="0" w:noVBand="1" w:firstColumn="1" w:lastRow="0" w:lastColumn="0" w:firstRow="1"/>
+        <w:tblLook w:val="04A0" w:firstRow="1" w:lastRow="0" w:firstColumn="1" w:lastColumn="0" w:noHBand="0" w:noVBand="1"/>
       </w:tblPr>
       <w:tblGrid>
-        <w:gridCol w:w="2156"/>
+        <w:gridCol w:w="2157"/>
         <w:gridCol w:w="574"/>
         <w:gridCol w:w="1049"/>
         <w:gridCol w:w="1279"/>
@@ -105,7 +83,7 @@
       </w:tblGrid>
       <w:tr>
         <w:trPr>
-          <w:trHeight w:val="419" w:hRule="atLeast"/>
+          <w:trHeight w:val="419"/>
         </w:trPr>
         <w:tc>
           <w:tcPr>
@@ -117,13 +95,11 @@
               <w:bottom w:val="single" w:sz="4" w:space="0" w:color="000000"/>
               <w:right w:val="single" w:sz="4" w:space="0" w:color="000000"/>
             </w:tcBorders>
-            <w:shd w:color="auto" w:fill="F2F2F2" w:val="clear"/>
+            <w:shd w:val="clear" w:color="auto" w:fill="F2F2F2"/>
             <w:vAlign w:val="center"/>
           </w:tcPr>
           <w:p>
             <w:pPr>
-              <w:pStyle w:val="Normal"/>
-              <w:spacing w:before="0" w:after="160"/>
               <w:rPr>
                 <w:lang w:val="pt-PT"/>
               </w:rPr>
@@ -141,7 +117,7 @@
       </w:tr>
       <w:tr>
         <w:trPr>
-          <w:trHeight w:val="694" w:hRule="atLeast"/>
+          <w:trHeight w:val="694"/>
         </w:trPr>
         <w:tc>
           <w:tcPr>
@@ -155,14 +131,6 @@
             <w:vAlign w:val="center"/>
           </w:tcPr>
           <w:p>
-            <w:pPr>
-              <w:pStyle w:val="Normal"/>
-              <w:widowControl/>
-              <w:bidi w:val="0"/>
-              <w:spacing w:lineRule="auto" w:line="259" w:before="0" w:after="160"/>
-              <w:jc w:val="left"/>
-              <w:rPr/>
-            </w:pPr>
             <w:r>
               <w:rPr>
                 <w:b/>
@@ -186,8 +154,6 @@
           </w:tcPr>
           <w:p>
             <w:pPr>
-              <w:pStyle w:val="Normal"/>
-              <w:bidi w:val="0"/>
               <w:rPr>
                 <w:lang w:val="pt-PT"/>
               </w:rPr>
@@ -210,7 +176,6 @@
           </w:p>
           <w:p>
             <w:pPr>
-              <w:pStyle w:val="Normal"/>
               <w:rPr>
                 <w:lang w:val="pt-PT"/>
               </w:rPr>
@@ -225,10 +190,6 @@
             </w:r>
             <w:r>
               <w:rPr>
-                <w:b w:val="false"/>
-                <w:bCs w:val="false"/>
-                <w:strike w:val="false"/>
-                <w:dstrike w:val="false"/>
                 <w:u w:val="single"/>
                 <w:lang w:val="pt-PT"/>
               </w:rPr>
@@ -237,8 +198,6 @@
           </w:p>
           <w:p>
             <w:pPr>
-              <w:pStyle w:val="Normal"/>
-              <w:spacing w:before="0" w:after="160"/>
               <w:rPr>
                 <w:lang w:val="pt-PT"/>
               </w:rPr>
@@ -253,8 +212,6 @@
             </w:r>
             <w:r>
               <w:rPr>
-                <w:b w:val="false"/>
-                <w:bCs w:val="false"/>
                 <w:u w:val="single"/>
                 <w:lang w:val="pt-PT"/>
               </w:rPr>
@@ -265,7 +222,7 @@
       </w:tr>
       <w:tr>
         <w:trPr>
-          <w:trHeight w:val="402" w:hRule="atLeast"/>
+          <w:trHeight w:val="402"/>
         </w:trPr>
         <w:tc>
           <w:tcPr>
@@ -279,14 +236,6 @@
             <w:vAlign w:val="center"/>
           </w:tcPr>
           <w:p>
-            <w:pPr>
-              <w:pStyle w:val="Normal"/>
-              <w:widowControl/>
-              <w:bidi w:val="0"/>
-              <w:spacing w:lineRule="auto" w:line="259" w:before="0" w:after="160"/>
-              <w:jc w:val="left"/>
-              <w:rPr/>
-            </w:pPr>
             <w:r>
               <w:rPr>
                 <w:b/>
@@ -309,10 +258,6 @@
             <w:vAlign w:val="center"/>
           </w:tcPr>
           <w:p>
-            <w:pPr>
-              <w:pStyle w:val="Normal"/>
-              <w:rPr/>
-            </w:pPr>
             <w:r>
               <w:rPr>
                 <w:b/>
@@ -322,19 +267,12 @@
             </w:r>
             <w:r>
               <w:rPr>
-                <w:b w:val="false"/>
-                <w:bCs w:val="false"/>
                 <w:u w:val="single"/>
               </w:rPr>
               <w:t>${studentName}</w:t>
             </w:r>
           </w:p>
           <w:p>
-            <w:pPr>
-              <w:pStyle w:val="Normal"/>
-              <w:spacing w:before="0" w:after="160"/>
-              <w:rPr/>
-            </w:pPr>
             <w:r>
               <w:rPr>
                 <w:b/>
@@ -344,8 +282,6 @@
             </w:r>
             <w:r>
               <w:rPr>
-                <w:b w:val="false"/>
-                <w:bCs w:val="false"/>
                 <w:u w:val="single"/>
               </w:rPr>
               <w:t>${studentPhone}</w:t>
@@ -355,7 +291,7 @@
       </w:tr>
       <w:tr>
         <w:trPr>
-          <w:trHeight w:val="551" w:hRule="atLeast"/>
+          <w:trHeight w:val="551"/>
         </w:trPr>
         <w:tc>
           <w:tcPr>
@@ -369,14 +305,6 @@
             <w:vAlign w:val="center"/>
           </w:tcPr>
           <w:p>
-            <w:pPr>
-              <w:pStyle w:val="Normal"/>
-              <w:widowControl/>
-              <w:bidi w:val="0"/>
-              <w:spacing w:lineRule="auto" w:line="259" w:before="0" w:after="160"/>
-              <w:jc w:val="left"/>
-              <w:rPr/>
-            </w:pPr>
             <w:r>
               <w:rPr>
                 <w:b/>
@@ -399,8 +327,6 @@
           </w:tcPr>
           <w:p>
             <w:pPr>
-              <w:pStyle w:val="Normal"/>
-              <w:bidi w:val="0"/>
               <w:rPr>
                 <w:lang w:val="pt-PT"/>
               </w:rPr>
@@ -416,8 +342,6 @@
           </w:p>
           <w:p>
             <w:pPr>
-              <w:pStyle w:val="Normal"/>
-              <w:bidi w:val="0"/>
               <w:rPr>
                 <w:lang w:val="pt-PT"/>
               </w:rPr>
@@ -439,9 +363,6 @@
           </w:p>
           <w:p>
             <w:pPr>
-              <w:pStyle w:val="Normal"/>
-              <w:bidi w:val="0"/>
-              <w:spacing w:before="0" w:after="160"/>
               <w:rPr>
                 <w:lang w:val="pt-PT"/>
               </w:rPr>
@@ -465,7 +386,7 @@
       </w:tr>
       <w:tr>
         <w:trPr>
-          <w:trHeight w:val="301" w:hRule="atLeast"/>
+          <w:trHeight w:val="301"/>
         </w:trPr>
         <w:tc>
           <w:tcPr>
@@ -480,16 +401,7 @@
             <w:vAlign w:val="center"/>
           </w:tcPr>
           <w:p>
-            <w:pPr>
-              <w:pStyle w:val="Normal"/>
-              <w:widowControl/>
-              <w:bidi w:val="0"/>
-              <w:spacing w:lineRule="auto" w:line="259" w:before="0" w:after="160"/>
-              <w:jc w:val="left"/>
-              <w:rPr/>
-            </w:pPr>
-            <w:r>
-              <w:rPr/>
+            <w:r>
               <w:t>REGISTO DE PRESENÇAS</w:t>
             </w:r>
           </w:p>
@@ -507,16 +419,7 @@
             <w:vAlign w:val="center"/>
           </w:tcPr>
           <w:p>
-            <w:pPr>
-              <w:pStyle w:val="Normal"/>
-              <w:widowControl/>
-              <w:bidi w:val="0"/>
-              <w:spacing w:lineRule="auto" w:line="259" w:before="0" w:after="160"/>
-              <w:jc w:val="left"/>
-              <w:rPr/>
-            </w:pPr>
-            <w:r>
-              <w:rPr/>
+            <w:r>
               <w:t>Dias</w:t>
             </w:r>
           </w:p>
@@ -534,26 +437,12 @@
             <w:vAlign w:val="center"/>
           </w:tcPr>
           <w:p>
-            <w:pPr>
-              <w:pStyle w:val="Normal"/>
-              <w:rPr/>
-            </w:pPr>
-            <w:r>
-              <w:rPr/>
+            <w:r>
               <w:t>Presenças</w:t>
             </w:r>
           </w:p>
           <w:p>
-            <w:pPr>
-              <w:pStyle w:val="Normal"/>
-              <w:widowControl/>
-              <w:bidi w:val="0"/>
-              <w:spacing w:lineRule="auto" w:line="259" w:before="0" w:after="160"/>
-              <w:jc w:val="left"/>
-              <w:rPr/>
-            </w:pPr>
-            <w:r>
-              <w:rPr/>
+            <w:r>
               <w:t>(Horas)</w:t>
             </w:r>
           </w:p>
@@ -571,17 +460,11 @@
             <w:vAlign w:val="center"/>
           </w:tcPr>
           <w:p>
-            <w:pPr>
-              <w:pStyle w:val="Normal"/>
-              <w:widowControl/>
-              <w:bidi w:val="0"/>
-              <w:spacing w:lineRule="auto" w:line="259" w:before="0" w:after="160"/>
-              <w:jc w:val="left"/>
-              <w:rPr/>
-            </w:pPr>
-            <w:r>
-              <w:rPr/>
-              <w:t>FALTAS (Horas)</w:t>
+            <w:r>
+              <w:t>Atividades</w:t>
+            </w:r>
+            <w:r>
+              <w:t xml:space="preserve"> </w:t>
             </w:r>
           </w:p>
         </w:tc>
@@ -598,16 +481,7 @@
             <w:vAlign w:val="center"/>
           </w:tcPr>
           <w:p>
-            <w:pPr>
-              <w:pStyle w:val="Normal"/>
-              <w:widowControl/>
-              <w:bidi w:val="0"/>
-              <w:spacing w:lineRule="auto" w:line="259" w:before="0" w:after="160"/>
-              <w:jc w:val="left"/>
-              <w:rPr/>
-            </w:pPr>
-            <w:r>
-              <w:rPr/>
+            <w:r>
               <w:t>Observações</w:t>
             </w:r>
           </w:p>
@@ -615,12 +489,12 @@
       </w:tr>
       <w:tr>
         <w:trPr>
-          <w:trHeight w:val="345" w:hRule="atLeast"/>
+          <w:trHeight w:val="345"/>
         </w:trPr>
         <w:tc>
           <w:tcPr>
             <w:tcW w:w="2156" w:type="dxa"/>
-            <w:vMerge w:val="continue"/>
+            <w:vMerge/>
             <w:tcBorders>
               <w:top w:val="single" w:sz="4" w:space="0" w:color="000000"/>
               <w:left w:val="single" w:sz="4" w:space="0" w:color="000000"/>
@@ -635,21 +509,12 @@
             </w:tcMar>
             <w:vAlign w:val="center"/>
           </w:tcPr>
-          <w:p>
-            <w:pPr>
-              <w:pStyle w:val="Normal"/>
-              <w:spacing w:before="0" w:after="160"/>
-              <w:rPr/>
-            </w:pPr>
-            <w:r>
-              <w:rPr/>
-            </w:r>
-          </w:p>
+          <w:p/>
         </w:tc>
         <w:tc>
           <w:tcPr>
             <w:tcW w:w="574" w:type="dxa"/>
-            <w:vMerge w:val="continue"/>
+            <w:vMerge/>
             <w:tcBorders>
               <w:top w:val="single" w:sz="4" w:space="0" w:color="000000"/>
               <w:left w:val="single" w:sz="4" w:space="0" w:color="000000"/>
@@ -664,21 +529,12 @@
             </w:tcMar>
             <w:vAlign w:val="center"/>
           </w:tcPr>
-          <w:p>
-            <w:pPr>
-              <w:pStyle w:val="Normal"/>
-              <w:spacing w:before="0" w:after="160"/>
-              <w:rPr/>
-            </w:pPr>
-            <w:r>
-              <w:rPr/>
-            </w:r>
-          </w:p>
+          <w:p/>
         </w:tc>
         <w:tc>
           <w:tcPr>
             <w:tcW w:w="1049" w:type="dxa"/>
-            <w:vMerge w:val="continue"/>
+            <w:vMerge/>
             <w:tcBorders>
               <w:top w:val="single" w:sz="4" w:space="0" w:color="000000"/>
               <w:left w:val="single" w:sz="4" w:space="0" w:color="000000"/>
@@ -693,16 +549,7 @@
             </w:tcMar>
             <w:vAlign w:val="center"/>
           </w:tcPr>
-          <w:p>
-            <w:pPr>
-              <w:pStyle w:val="Normal"/>
-              <w:spacing w:before="0" w:after="160"/>
-              <w:rPr/>
-            </w:pPr>
-            <w:r>
-              <w:rPr/>
-            </w:r>
-          </w:p>
+          <w:p/>
         </w:tc>
         <w:tc>
           <w:tcPr>
@@ -716,17 +563,8 @@
             <w:vAlign w:val="center"/>
           </w:tcPr>
           <w:p>
-            <w:pPr>
-              <w:pStyle w:val="Normal"/>
-              <w:widowControl/>
-              <w:bidi w:val="0"/>
-              <w:spacing w:lineRule="auto" w:line="259" w:before="0" w:after="160"/>
-              <w:jc w:val="left"/>
-              <w:rPr/>
-            </w:pPr>
-            <w:r>
-              <w:rPr/>
-              <w:t>Justificadas</w:t>
+            <w:r>
+              <w:t>Título da Atividade</w:t>
             </w:r>
           </w:p>
         </w:tc>
@@ -743,24 +581,15 @@
             <w:vAlign w:val="center"/>
           </w:tcPr>
           <w:p>
-            <w:pPr>
-              <w:pStyle w:val="Normal"/>
-              <w:widowControl/>
-              <w:bidi w:val="0"/>
-              <w:spacing w:lineRule="auto" w:line="259" w:before="0" w:after="160"/>
-              <w:jc w:val="left"/>
-              <w:rPr/>
-            </w:pPr>
-            <w:r>
-              <w:rPr/>
-              <w:t>Injustificadas</w:t>
+            <w:r>
+              <w:t>Anotações</w:t>
             </w:r>
           </w:p>
         </w:tc>
         <w:tc>
           <w:tcPr>
             <w:tcW w:w="2250" w:type="dxa"/>
-            <w:vMerge w:val="continue"/>
+            <w:vMerge/>
             <w:tcBorders>
               <w:top w:val="single" w:sz="4" w:space="0" w:color="000000"/>
               <w:left w:val="single" w:sz="4" w:space="0" w:color="000000"/>
@@ -775,26 +604,17 @@
             </w:tcMar>
             <w:vAlign w:val="center"/>
           </w:tcPr>
-          <w:p>
-            <w:pPr>
-              <w:pStyle w:val="Normal"/>
-              <w:spacing w:before="0" w:after="160"/>
-              <w:rPr/>
-            </w:pPr>
-            <w:r>
-              <w:rPr/>
-            </w:r>
-          </w:p>
+          <w:p/>
         </w:tc>
       </w:tr>
       <w:tr>
         <w:trPr>
-          <w:trHeight w:val="340" w:hRule="atLeast"/>
+          <w:trHeight w:val="340"/>
         </w:trPr>
         <w:tc>
           <w:tcPr>
             <w:tcW w:w="2156" w:type="dxa"/>
-            <w:vMerge w:val="continue"/>
+            <w:vMerge/>
             <w:tcBorders>
               <w:top w:val="single" w:sz="4" w:space="0" w:color="000000"/>
               <w:left w:val="single" w:sz="4" w:space="0" w:color="000000"/>
@@ -809,16 +629,7 @@
             </w:tcMar>
             <w:vAlign w:val="center"/>
           </w:tcPr>
-          <w:p>
-            <w:pPr>
-              <w:pStyle w:val="Normal"/>
-              <w:spacing w:before="0" w:after="160"/>
-              <w:rPr/>
-            </w:pPr>
-            <w:r>
-              <w:rPr/>
-            </w:r>
-          </w:p>
+          <w:p/>
         </w:tc>
         <w:tc>
           <w:tcPr>
@@ -832,13 +643,7 @@
             <w:vAlign w:val="center"/>
           </w:tcPr>
           <w:p>
-            <w:pPr>
-              <w:pStyle w:val="Normal"/>
-              <w:spacing w:before="0" w:after="160"/>
-              <w:rPr/>
-            </w:pPr>
-            <w:r>
-              <w:rPr/>
+            <w:r>
               <w:t>${date}</w:t>
             </w:r>
           </w:p>
@@ -855,13 +660,7 @@
             <w:vAlign w:val="center"/>
           </w:tcPr>
           <w:p>
-            <w:pPr>
-              <w:pStyle w:val="Normal"/>
-              <w:spacing w:before="0" w:after="160"/>
-              <w:rPr/>
-            </w:pPr>
-            <w:r>
-              <w:rPr/>
+            <w:r>
               <w:t>${hours}</w:t>
             </w:r>
           </w:p>
@@ -878,21 +677,13 @@
             <w:vAlign w:val="center"/>
           </w:tcPr>
           <w:p>
-            <w:pPr>
-              <w:pStyle w:val="Normal"/>
-              <w:spacing w:before="0" w:after="160"/>
-              <w:rPr/>
-            </w:pPr>
-            <w:r>
-              <w:rPr/>
+            <w:r>
               <w:t>${</w:t>
             </w:r>
             <w:r>
-              <w:rPr/>
-              <w:t>justification</w:t>
-            </w:r>
-            <w:r>
-              <w:rPr/>
+              <w:t>title</w:t>
+            </w:r>
+            <w:r>
               <w:t>}</w:t>
             </w:r>
           </w:p>
@@ -910,16 +701,14 @@
             <w:vAlign w:val="center"/>
           </w:tcPr>
           <w:p>
-            <w:pPr>
-              <w:pStyle w:val="Normal"/>
-              <w:widowControl/>
-              <w:bidi w:val="0"/>
-              <w:spacing w:lineRule="auto" w:line="259" w:before="0" w:after="160"/>
-              <w:jc w:val="left"/>
-              <w:rPr/>
-            </w:pPr>
-            <w:r>
-              <w:rPr/>
+            <w:r>
+              <w:t>${</w:t>
+            </w:r>
+            <w:r>
+              <w:t>description</w:t>
+            </w:r>
+            <w:r>
+              <w:t>}</w:t>
             </w:r>
           </w:p>
         </w:tc>
@@ -935,66 +724,27 @@
             <w:vAlign w:val="center"/>
           </w:tcPr>
           <w:p>
-            <w:pPr>
-              <w:pStyle w:val="Normal"/>
-              <w:spacing w:before="0" w:after="160"/>
-              <w:rPr/>
-            </w:pPr>
-            <w:r>
-              <w:rPr/>
+            <w:r>
+              <w:t>${justification}</w:t>
             </w:r>
           </w:p>
         </w:tc>
       </w:tr>
       <w:tr>
         <w:trPr>
-          <w:trHeight w:val="399" w:hRule="atLeast"/>
+          <w:trHeight w:val="399"/>
         </w:trPr>
         <w:tc>
           <w:tcPr>
             <w:tcW w:w="2730" w:type="dxa"/>
             <w:gridSpan w:val="2"/>
-            <w:tcBorders/>
-            <w:vAlign w:val="center"/>
-          </w:tcPr>
-          <w:p>
-            <w:pPr>
-              <w:pStyle w:val="Normal"/>
-              <w:rPr/>
-            </w:pPr>
-            <w:r>
-              <w:rPr/>
-            </w:r>
-          </w:p>
-          <w:p>
-            <w:pPr>
-              <w:pStyle w:val="Normal"/>
-              <w:rPr/>
-            </w:pPr>
-            <w:r>
-              <w:rPr/>
-            </w:r>
-          </w:p>
-          <w:p>
-            <w:pPr>
-              <w:pStyle w:val="Normal"/>
-              <w:rPr/>
-            </w:pPr>
-            <w:r>
-              <w:rPr/>
-            </w:r>
-          </w:p>
-          <w:p>
-            <w:pPr>
-              <w:pStyle w:val="Normal"/>
-              <w:widowControl/>
-              <w:bidi w:val="0"/>
-              <w:spacing w:lineRule="auto" w:line="259" w:before="0" w:after="160"/>
-              <w:jc w:val="left"/>
-              <w:rPr/>
-            </w:pPr>
-            <w:r>
-              <w:rPr/>
+            <w:vAlign w:val="center"/>
+          </w:tcPr>
+          <w:p/>
+          <w:p/>
+          <w:p/>
+          <w:p>
+            <w:r>
               <w:t>O aluno</w:t>
             </w:r>
           </w:p>
@@ -1003,52 +753,31 @@
           <w:tcPr>
             <w:tcW w:w="2921" w:type="dxa"/>
             <w:gridSpan w:val="3"/>
-            <w:tcBorders/>
             <w:vAlign w:val="center"/>
           </w:tcPr>
           <w:p>
             <w:pPr>
-              <w:pStyle w:val="Normal"/>
               <w:rPr>
                 <w:lang w:val="pt-BR"/>
               </w:rPr>
             </w:pPr>
-            <w:r>
+          </w:p>
+          <w:p>
+            <w:pPr>
               <w:rPr>
                 <w:lang w:val="pt-BR"/>
               </w:rPr>
-            </w:r>
+            </w:pPr>
           </w:p>
           <w:p>
             <w:pPr>
-              <w:pStyle w:val="Normal"/>
               <w:rPr>
                 <w:lang w:val="pt-BR"/>
               </w:rPr>
             </w:pPr>
-            <w:r>
-              <w:rPr>
-                <w:lang w:val="pt-BR"/>
-              </w:rPr>
-            </w:r>
           </w:p>
           <w:p>
             <w:pPr>
-              <w:pStyle w:val="Normal"/>
-              <w:rPr>
-                <w:lang w:val="pt-BR"/>
-              </w:rPr>
-            </w:pPr>
-            <w:r>
-              <w:rPr>
-                <w:lang w:val="pt-BR"/>
-              </w:rPr>
-            </w:r>
-          </w:p>
-          <w:p>
-            <w:pPr>
-              <w:pStyle w:val="Normal"/>
-              <w:spacing w:before="0" w:after="160"/>
               <w:rPr>
                 <w:lang w:val="pt-PT"/>
               </w:rPr>
@@ -1065,59 +794,31 @@
           <w:tcPr>
             <w:tcW w:w="2842" w:type="dxa"/>
             <w:gridSpan w:val="2"/>
-            <w:tcBorders/>
             <w:vAlign w:val="center"/>
           </w:tcPr>
           <w:p>
             <w:pPr>
-              <w:pStyle w:val="Normal"/>
               <w:rPr>
                 <w:lang w:val="pt-PT"/>
               </w:rPr>
             </w:pPr>
-            <w:r>
-              <w:rPr>
-                <w:lang w:val="pt-PT"/>
-              </w:rPr>
-            </w:r>
           </w:p>
           <w:p>
             <w:pPr>
-              <w:pStyle w:val="Normal"/>
               <w:rPr>
                 <w:lang w:val="pt-PT"/>
               </w:rPr>
             </w:pPr>
-            <w:r>
-              <w:rPr>
-                <w:lang w:val="pt-PT"/>
-              </w:rPr>
-            </w:r>
           </w:p>
           <w:p>
             <w:pPr>
-              <w:pStyle w:val="Normal"/>
               <w:rPr>
                 <w:lang w:val="pt-PT"/>
               </w:rPr>
             </w:pPr>
-            <w:r>
-              <w:rPr>
-                <w:lang w:val="pt-PT"/>
-              </w:rPr>
-            </w:r>
-          </w:p>
-          <w:p>
-            <w:pPr>
-              <w:pStyle w:val="Normal"/>
-              <w:widowControl/>
-              <w:bidi w:val="0"/>
-              <w:spacing w:lineRule="auto" w:line="259" w:before="0" w:after="160"/>
-              <w:jc w:val="left"/>
-              <w:rPr/>
-            </w:pPr>
-            <w:r>
-              <w:rPr/>
+          </w:p>
+          <w:p>
+            <w:r>
               <w:t>A Empresa</w:t>
             </w:r>
           </w:p>
@@ -1125,26 +826,16 @@
       </w:tr>
       <w:tr>
         <w:trPr>
-          <w:trHeight w:val="399" w:hRule="atLeast"/>
+          <w:trHeight w:val="399"/>
         </w:trPr>
         <w:tc>
           <w:tcPr>
             <w:tcW w:w="2730" w:type="dxa"/>
             <w:gridSpan w:val="2"/>
-            <w:tcBorders/>
-            <w:vAlign w:val="center"/>
-          </w:tcPr>
-          <w:p>
-            <w:pPr>
-              <w:pStyle w:val="Normal"/>
-              <w:widowControl/>
-              <w:bidi w:val="0"/>
-              <w:spacing w:lineRule="auto" w:line="259" w:before="0" w:after="160"/>
-              <w:jc w:val="left"/>
-              <w:rPr/>
-            </w:pPr>
-            <w:r>
-              <w:rPr/>
+            <w:vAlign w:val="center"/>
+          </w:tcPr>
+          <w:p>
+            <w:r>
               <w:t>_______________________</w:t>
             </w:r>
           </w:p>
@@ -1153,20 +844,10 @@
           <w:tcPr>
             <w:tcW w:w="2921" w:type="dxa"/>
             <w:gridSpan w:val="3"/>
-            <w:tcBorders/>
-            <w:vAlign w:val="center"/>
-          </w:tcPr>
-          <w:p>
-            <w:pPr>
-              <w:pStyle w:val="Normal"/>
-              <w:widowControl/>
-              <w:bidi w:val="0"/>
-              <w:spacing w:lineRule="auto" w:line="259" w:before="0" w:after="160"/>
-              <w:jc w:val="left"/>
-              <w:rPr/>
-            </w:pPr>
-            <w:r>
-              <w:rPr/>
+            <w:vAlign w:val="center"/>
+          </w:tcPr>
+          <w:p>
+            <w:r>
               <w:t>__________________________</w:t>
             </w:r>
           </w:p>
@@ -1175,20 +856,10 @@
           <w:tcPr>
             <w:tcW w:w="2842" w:type="dxa"/>
             <w:gridSpan w:val="2"/>
-            <w:tcBorders/>
-            <w:vAlign w:val="center"/>
-          </w:tcPr>
-          <w:p>
-            <w:pPr>
-              <w:pStyle w:val="Normal"/>
-              <w:widowControl/>
-              <w:bidi w:val="0"/>
-              <w:spacing w:lineRule="auto" w:line="259" w:before="0" w:after="160"/>
-              <w:jc w:val="left"/>
-              <w:rPr/>
-            </w:pPr>
-            <w:r>
-              <w:rPr/>
+            <w:vAlign w:val="center"/>
+          </w:tcPr>
+          <w:p>
+            <w:r>
               <w:t>_________________________</w:t>
             </w:r>
           </w:p>
@@ -1196,49 +867,32 @@
       </w:tr>
     </w:tbl>
     <w:p>
-      <w:pPr>
-        <w:pStyle w:val="Normal"/>
-        <w:rPr/>
-      </w:pPr>
       <w:r>
-        <w:rPr/>
         <w:br/>
+      </w:r>
+      <w:r>
         <w:tab/>
         <w:t>Em __/__/____                           Em __/__/____                                Em __/__/____</w:t>
       </w:r>
     </w:p>
-    <w:p>
-      <w:pPr>
-        <w:pStyle w:val="Normal"/>
-        <w:widowControl/>
-        <w:bidi w:val="0"/>
-        <w:spacing w:lineRule="auto" w:line="259" w:before="0" w:after="160"/>
-        <w:jc w:val="left"/>
-        <w:rPr/>
-      </w:pPr>
-      <w:r>
-        <w:rPr/>
-      </w:r>
-    </w:p>
+    <w:p/>
     <w:sectPr>
-      <w:type w:val="nextPage"/>
       <w:pgSz w:w="11906" w:h="16838"/>
-      <w:pgMar w:left="1701" w:right="1701" w:gutter="0" w:header="0" w:top="1417" w:footer="0" w:bottom="1417"/>
-      <w:pgNumType w:fmt="decimal"/>
-      <w:formProt w:val="false"/>
-      <w:textDirection w:val="lrTb"/>
-      <w:docGrid w:type="default" w:linePitch="360" w:charSpace="4096"/>
+      <w:pgMar w:top="1417" w:right="1701" w:bottom="1417" w:left="1701" w:header="0" w:footer="0" w:gutter="0"/>
+      <w:cols w:space="720"/>
+      <w:formProt w:val="0"/>
+      <w:docGrid w:linePitch="360" w:charSpace="4096"/>
     </w:sectPr>
   </w:body>
 </w:document>
 </file>
 
 <file path=word/styles.xml><?xml version="1.0" encoding="utf-8"?>
-<w:styles xmlns:w="http://schemas.openxmlformats.org/wordprocessingml/2006/main" xmlns:w14="http://schemas.microsoft.com/office/word/2010/wordml" xmlns:mc="http://schemas.openxmlformats.org/markup-compatibility/2006" mc:Ignorable="w14">
+<w:styles xmlns:mc="http://schemas.openxmlformats.org/markup-compatibility/2006" xmlns:r="http://schemas.openxmlformats.org/officeDocument/2006/relationships" xmlns:w="http://schemas.openxmlformats.org/wordprocessingml/2006/main" xmlns:w14="http://schemas.microsoft.com/office/word/2010/wordml" xmlns:w15="http://schemas.microsoft.com/office/word/2012/wordml" xmlns:w16cex="http://schemas.microsoft.com/office/word/2018/wordml/cex" xmlns:w16cid="http://schemas.microsoft.com/office/word/2016/wordml/cid" xmlns:w16="http://schemas.microsoft.com/office/word/2018/wordml" xmlns:w16du="http://schemas.microsoft.com/office/word/2023/wordml/word16du" xmlns:w16sdtdh="http://schemas.microsoft.com/office/word/2020/wordml/sdtdatahash" xmlns:w16sdtfl="http://schemas.microsoft.com/office/word/2024/wordml/sdtformatlock" xmlns:w16se="http://schemas.microsoft.com/office/word/2015/wordml/symex" mc:Ignorable="w14 w15 w16se w16cid w16 w16cex w16sdtdh w16sdtfl w16du">
   <w:docDefaults>
     <w:rPrDefault>
       <w:rPr>
-        <w:rFonts w:ascii="Calibri" w:hAnsi="Calibri" w:eastAsia="Calibri" w:cs="" w:asciiTheme="minorHAnsi" w:cstheme="minorBidi" w:eastAsiaTheme="minorHAnsi" w:hAnsiTheme="minorHAnsi"/>
+        <w:rFonts w:asciiTheme="minorHAnsi" w:eastAsiaTheme="minorHAnsi" w:hAnsiTheme="minorHAnsi" w:cstheme="minorBidi"/>
         <w:kern w:val="2"/>
         <w:sz w:val="22"/>
         <w:szCs w:val="22"/>
@@ -1248,21 +902,21 @@
     </w:rPrDefault>
     <w:pPrDefault>
       <w:pPr>
-        <w:suppressAutoHyphens w:val="true"/>
+        <w:suppressAutoHyphens/>
       </w:pPr>
     </w:pPrDefault>
   </w:docDefaults>
   <w:latentStyles w:defLockedState="0" w:defUIPriority="99" w:defSemiHidden="0" w:defUnhideWhenUsed="0" w:defQFormat="0" w:count="376">
     <w:lsdException w:name="Normal" w:uiPriority="0" w:qFormat="1"/>
     <w:lsdException w:name="heading 1" w:uiPriority="9" w:qFormat="1"/>
-    <w:lsdException w:name="heading 2" w:uiPriority="9" w:semiHidden="1" w:unhideWhenUsed="1" w:qFormat="1"/>
-    <w:lsdException w:name="heading 3" w:uiPriority="9" w:semiHidden="1" w:unhideWhenUsed="1" w:qFormat="1"/>
-    <w:lsdException w:name="heading 4" w:uiPriority="9" w:semiHidden="1" w:unhideWhenUsed="1" w:qFormat="1"/>
-    <w:lsdException w:name="heading 5" w:uiPriority="9" w:semiHidden="1" w:unhideWhenUsed="1" w:qFormat="1"/>
-    <w:lsdException w:name="heading 6" w:uiPriority="9" w:semiHidden="1" w:unhideWhenUsed="1" w:qFormat="1"/>
-    <w:lsdException w:name="heading 7" w:uiPriority="9" w:semiHidden="1" w:unhideWhenUsed="1" w:qFormat="1"/>
-    <w:lsdException w:name="heading 8" w:uiPriority="9" w:semiHidden="1" w:unhideWhenUsed="1" w:qFormat="1"/>
-    <w:lsdException w:name="heading 9" w:uiPriority="9" w:semiHidden="1" w:unhideWhenUsed="1" w:qFormat="1"/>
+    <w:lsdException w:name="heading 2" w:semiHidden="1" w:uiPriority="9" w:unhideWhenUsed="1" w:qFormat="1"/>
+    <w:lsdException w:name="heading 3" w:semiHidden="1" w:uiPriority="9" w:unhideWhenUsed="1" w:qFormat="1"/>
+    <w:lsdException w:name="heading 4" w:semiHidden="1" w:uiPriority="9" w:unhideWhenUsed="1" w:qFormat="1"/>
+    <w:lsdException w:name="heading 5" w:semiHidden="1" w:uiPriority="9" w:unhideWhenUsed="1" w:qFormat="1"/>
+    <w:lsdException w:name="heading 6" w:semiHidden="1" w:uiPriority="9" w:unhideWhenUsed="1" w:qFormat="1"/>
+    <w:lsdException w:name="heading 7" w:semiHidden="1" w:uiPriority="9" w:unhideWhenUsed="1" w:qFormat="1"/>
+    <w:lsdException w:name="heading 8" w:semiHidden="1" w:uiPriority="9" w:unhideWhenUsed="1" w:qFormat="1"/>
+    <w:lsdException w:name="heading 9" w:semiHidden="1" w:uiPriority="9" w:unhideWhenUsed="1" w:qFormat="1"/>
     <w:lsdException w:name="index 1" w:semiHidden="1" w:unhideWhenUsed="1"/>
     <w:lsdException w:name="index 2" w:semiHidden="1" w:unhideWhenUsed="1"/>
     <w:lsdException w:name="index 3" w:semiHidden="1" w:unhideWhenUsed="1"/>
@@ -1272,22 +926,22 @@
     <w:lsdException w:name="index 7" w:semiHidden="1" w:unhideWhenUsed="1"/>
     <w:lsdException w:name="index 8" w:semiHidden="1" w:unhideWhenUsed="1"/>
     <w:lsdException w:name="index 9" w:semiHidden="1" w:unhideWhenUsed="1"/>
-    <w:lsdException w:name="toc 1" w:uiPriority="39" w:semiHidden="1" w:unhideWhenUsed="1"/>
-    <w:lsdException w:name="toc 2" w:uiPriority="39" w:semiHidden="1" w:unhideWhenUsed="1"/>
-    <w:lsdException w:name="toc 3" w:uiPriority="39" w:semiHidden="1" w:unhideWhenUsed="1"/>
-    <w:lsdException w:name="toc 4" w:uiPriority="39" w:semiHidden="1" w:unhideWhenUsed="1"/>
-    <w:lsdException w:name="toc 5" w:uiPriority="39" w:semiHidden="1" w:unhideWhenUsed="1"/>
-    <w:lsdException w:name="toc 6" w:uiPriority="39" w:semiHidden="1" w:unhideWhenUsed="1"/>
-    <w:lsdException w:name="toc 7" w:uiPriority="39" w:semiHidden="1" w:unhideWhenUsed="1"/>
-    <w:lsdException w:name="toc 8" w:uiPriority="39" w:semiHidden="1" w:unhideWhenUsed="1"/>
-    <w:lsdException w:name="toc 9" w:uiPriority="39" w:semiHidden="1" w:unhideWhenUsed="1"/>
+    <w:lsdException w:name="toc 1" w:semiHidden="1" w:uiPriority="39" w:unhideWhenUsed="1"/>
+    <w:lsdException w:name="toc 2" w:semiHidden="1" w:uiPriority="39" w:unhideWhenUsed="1"/>
+    <w:lsdException w:name="toc 3" w:semiHidden="1" w:uiPriority="39" w:unhideWhenUsed="1"/>
+    <w:lsdException w:name="toc 4" w:semiHidden="1" w:uiPriority="39" w:unhideWhenUsed="1"/>
+    <w:lsdException w:name="toc 5" w:semiHidden="1" w:uiPriority="39" w:unhideWhenUsed="1"/>
+    <w:lsdException w:name="toc 6" w:semiHidden="1" w:uiPriority="39" w:unhideWhenUsed="1"/>
+    <w:lsdException w:name="toc 7" w:semiHidden="1" w:uiPriority="39" w:unhideWhenUsed="1"/>
+    <w:lsdException w:name="toc 8" w:semiHidden="1" w:uiPriority="39" w:unhideWhenUsed="1"/>
+    <w:lsdException w:name="toc 9" w:semiHidden="1" w:uiPriority="39" w:unhideWhenUsed="1"/>
     <w:lsdException w:name="Normal Indent" w:semiHidden="1" w:unhideWhenUsed="1"/>
     <w:lsdException w:name="footnote text" w:semiHidden="1" w:unhideWhenUsed="1"/>
     <w:lsdException w:name="annotation text" w:semiHidden="1" w:unhideWhenUsed="1"/>
     <w:lsdException w:name="header" w:semiHidden="1" w:unhideWhenUsed="1"/>
     <w:lsdException w:name="footer" w:semiHidden="1" w:unhideWhenUsed="1"/>
     <w:lsdException w:name="index heading" w:semiHidden="1" w:unhideWhenUsed="1"/>
-    <w:lsdException w:name="caption" w:uiPriority="35" w:semiHidden="1" w:unhideWhenUsed="1" w:qFormat="1"/>
+    <w:lsdException w:name="caption" w:semiHidden="1" w:uiPriority="35" w:unhideWhenUsed="1" w:qFormat="1"/>
     <w:lsdException w:name="table of figures" w:semiHidden="1" w:unhideWhenUsed="1"/>
     <w:lsdException w:name="envelope address" w:semiHidden="1" w:unhideWhenUsed="1"/>
     <w:lsdException w:name="envelope return" w:semiHidden="1" w:unhideWhenUsed="1"/>
@@ -1318,7 +972,7 @@
     <w:lsdException w:name="Title" w:uiPriority="10" w:qFormat="1"/>
     <w:lsdException w:name="Closing" w:semiHidden="1" w:unhideWhenUsed="1"/>
     <w:lsdException w:name="Signature" w:semiHidden="1" w:unhideWhenUsed="1"/>
-    <w:lsdException w:name="Default Paragraph Font" w:uiPriority="1" w:semiHidden="1" w:unhideWhenUsed="1"/>
+    <w:lsdException w:name="Default Paragraph Font" w:semiHidden="1" w:uiPriority="1" w:unhideWhenUsed="1"/>
     <w:lsdException w:name="Body Text" w:semiHidden="1" w:unhideWhenUsed="1"/>
     <w:lsdException w:name="Body Text Indent" w:semiHidden="1" w:unhideWhenUsed="1"/>
     <w:lsdException w:name="List Continue" w:semiHidden="1" w:unhideWhenUsed="1"/>
@@ -1518,8 +1172,8 @@
     <w:lsdException w:name="Subtle Reference" w:uiPriority="31" w:qFormat="1"/>
     <w:lsdException w:name="Intense Reference" w:uiPriority="32" w:qFormat="1"/>
     <w:lsdException w:name="Book Title" w:uiPriority="33" w:qFormat="1"/>
-    <w:lsdException w:name="Bibliography" w:uiPriority="37" w:semiHidden="1" w:unhideWhenUsed="1"/>
-    <w:lsdException w:name="TOC Heading" w:uiPriority="39" w:semiHidden="1" w:unhideWhenUsed="1" w:qFormat="1"/>
+    <w:lsdException w:name="Bibliography" w:semiHidden="1" w:uiPriority="37" w:unhideWhenUsed="1"/>
+    <w:lsdException w:name="TOC Heading" w:semiHidden="1" w:uiPriority="39" w:unhideWhenUsed="1" w:qFormat="1"/>
     <w:lsdException w:name="Plain Table 1" w:uiPriority="41"/>
     <w:lsdException w:name="Plain Table 2" w:uiPriority="42"/>
     <w:lsdException w:name="Plain Table 3" w:uiPriority="43"/>
@@ -1630,49 +1284,39 @@
     <w:lsdException w:name="Unresolved Mention" w:semiHidden="1" w:unhideWhenUsed="1"/>
     <w:lsdException w:name="Smart Link" w:semiHidden="1" w:unhideWhenUsed="1"/>
   </w:latentStyles>
-  <w:style w:type="paragraph" w:styleId="Normal" w:default="1">
+  <w:style w:type="paragraph" w:default="1" w:styleId="Normal">
     <w:name w:val="Normal"/>
     <w:qFormat/>
-    <w:rsid w:val="00c07d19"/>
+    <w:rsid w:val="00C07D19"/>
     <w:pPr>
-      <w:widowControl/>
-      <w:suppressAutoHyphens w:val="true"/>
-      <w:bidi w:val="0"/>
-      <w:spacing w:lineRule="auto" w:line="259" w:before="0" w:after="160"/>
-      <w:jc w:val="left"/>
+      <w:spacing w:after="160" w:line="259" w:lineRule="auto"/>
     </w:pPr>
     <w:rPr>
-      <w:rFonts w:ascii="Calibri" w:hAnsi="Calibri" w:eastAsia="Calibri" w:cs="" w:asciiTheme="minorHAnsi" w:cstheme="minorBidi" w:eastAsiaTheme="minorHAnsi" w:hAnsiTheme="minorHAnsi"/>
-      <w:color w:val="auto"/>
-      <w:kern w:val="2"/>
-      <w:sz w:val="22"/>
-      <w:szCs w:val="22"/>
-      <w:lang w:val="en-US" w:eastAsia="en-US" w:bidi="ar-SA"/>
-      <w14:ligatures w14:val="standardContextual"/>
-    </w:rPr>
-  </w:style>
-  <w:style w:type="paragraph" w:styleId="Heading1">
+      <w:lang w:val="en-US"/>
+    </w:rPr>
+  </w:style>
+  <w:style w:type="paragraph" w:styleId="Ttulo1">
     <w:name w:val="heading 1"/>
     <w:basedOn w:val="Normal"/>
     <w:next w:val="Normal"/>
     <w:link w:val="Ttulo1Char"/>
     <w:uiPriority w:val="9"/>
     <w:qFormat/>
-    <w:rsid w:val="00c07d19"/>
+    <w:rsid w:val="00C07D19"/>
     <w:pPr>
-      <w:keepNext w:val="true"/>
+      <w:keepNext/>
       <w:keepLines/>
       <w:spacing w:before="360" w:after="80"/>
       <w:outlineLvl w:val="0"/>
     </w:pPr>
     <w:rPr>
-      <w:rFonts w:ascii="Calibri Light" w:hAnsi="Calibri Light" w:eastAsia="" w:cs="" w:asciiTheme="majorHAnsi" w:cstheme="majorBidi" w:eastAsiaTheme="majorEastAsia" w:hAnsiTheme="majorHAnsi"/>
-      <w:color w:themeColor="accent1" w:themeShade="bf" w:val="2F5496"/>
+      <w:rFonts w:asciiTheme="majorHAnsi" w:eastAsiaTheme="majorEastAsia" w:hAnsiTheme="majorHAnsi" w:cstheme="majorBidi"/>
+      <w:color w:val="2F5496" w:themeColor="accent1" w:themeShade="BF"/>
       <w:sz w:val="40"/>
       <w:szCs w:val="40"/>
     </w:rPr>
   </w:style>
-  <w:style w:type="paragraph" w:styleId="Heading2">
+  <w:style w:type="paragraph" w:styleId="Ttulo2">
     <w:name w:val="heading 2"/>
     <w:basedOn w:val="Normal"/>
     <w:next w:val="Normal"/>
@@ -1681,21 +1325,21 @@
     <w:semiHidden/>
     <w:unhideWhenUsed/>
     <w:qFormat/>
-    <w:rsid w:val="00c07d19"/>
+    <w:rsid w:val="00C07D19"/>
     <w:pPr>
-      <w:keepNext w:val="true"/>
+      <w:keepNext/>
       <w:keepLines/>
       <w:spacing w:before="160" w:after="80"/>
       <w:outlineLvl w:val="1"/>
     </w:pPr>
     <w:rPr>
-      <w:rFonts w:ascii="Calibri Light" w:hAnsi="Calibri Light" w:eastAsia="" w:cs="" w:asciiTheme="majorHAnsi" w:cstheme="majorBidi" w:eastAsiaTheme="majorEastAsia" w:hAnsiTheme="majorHAnsi"/>
-      <w:color w:themeColor="accent1" w:themeShade="bf" w:val="2F5496"/>
+      <w:rFonts w:asciiTheme="majorHAnsi" w:eastAsiaTheme="majorEastAsia" w:hAnsiTheme="majorHAnsi" w:cstheme="majorBidi"/>
+      <w:color w:val="2F5496" w:themeColor="accent1" w:themeShade="BF"/>
       <w:sz w:val="32"/>
       <w:szCs w:val="32"/>
     </w:rPr>
   </w:style>
-  <w:style w:type="paragraph" w:styleId="Heading3">
+  <w:style w:type="paragraph" w:styleId="Ttulo3">
     <w:name w:val="heading 3"/>
     <w:basedOn w:val="Normal"/>
     <w:next w:val="Normal"/>
@@ -1704,21 +1348,21 @@
     <w:semiHidden/>
     <w:unhideWhenUsed/>
     <w:qFormat/>
-    <w:rsid w:val="00c07d19"/>
+    <w:rsid w:val="00C07D19"/>
     <w:pPr>
-      <w:keepNext w:val="true"/>
+      <w:keepNext/>
       <w:keepLines/>
       <w:spacing w:before="160" w:after="80"/>
       <w:outlineLvl w:val="2"/>
     </w:pPr>
     <w:rPr>
-      <w:rFonts w:eastAsia="" w:cs="" w:cstheme="majorBidi" w:eastAsiaTheme="majorEastAsia"/>
-      <w:color w:themeColor="accent1" w:themeShade="bf" w:val="2F5496"/>
+      <w:rFonts w:eastAsiaTheme="majorEastAsia" w:cstheme="majorBidi"/>
+      <w:color w:val="2F5496" w:themeColor="accent1" w:themeShade="BF"/>
       <w:sz w:val="28"/>
       <w:szCs w:val="28"/>
     </w:rPr>
   </w:style>
-  <w:style w:type="paragraph" w:styleId="Heading4">
+  <w:style w:type="paragraph" w:styleId="Ttulo4">
     <w:name w:val="heading 4"/>
     <w:basedOn w:val="Normal"/>
     <w:next w:val="Normal"/>
@@ -1727,21 +1371,21 @@
     <w:semiHidden/>
     <w:unhideWhenUsed/>
     <w:qFormat/>
-    <w:rsid w:val="00c07d19"/>
+    <w:rsid w:val="00C07D19"/>
     <w:pPr>
-      <w:keepNext w:val="true"/>
+      <w:keepNext/>
       <w:keepLines/>
       <w:spacing w:before="80" w:after="40"/>
       <w:outlineLvl w:val="3"/>
     </w:pPr>
     <w:rPr>
-      <w:rFonts w:eastAsia="" w:cs="" w:cstheme="majorBidi" w:eastAsiaTheme="majorEastAsia"/>
+      <w:rFonts w:eastAsiaTheme="majorEastAsia" w:cstheme="majorBidi"/>
       <w:i/>
       <w:iCs/>
-      <w:color w:themeColor="accent1" w:themeShade="bf" w:val="2F5496"/>
-    </w:rPr>
-  </w:style>
-  <w:style w:type="paragraph" w:styleId="Heading5">
+      <w:color w:val="2F5496" w:themeColor="accent1" w:themeShade="BF"/>
+    </w:rPr>
+  </w:style>
+  <w:style w:type="paragraph" w:styleId="Ttulo5">
     <w:name w:val="heading 5"/>
     <w:basedOn w:val="Normal"/>
     <w:next w:val="Normal"/>
@@ -1750,19 +1394,19 @@
     <w:semiHidden/>
     <w:unhideWhenUsed/>
     <w:qFormat/>
-    <w:rsid w:val="00c07d19"/>
+    <w:rsid w:val="00C07D19"/>
     <w:pPr>
-      <w:keepNext w:val="true"/>
+      <w:keepNext/>
       <w:keepLines/>
       <w:spacing w:before="80" w:after="40"/>
       <w:outlineLvl w:val="4"/>
     </w:pPr>
     <w:rPr>
-      <w:rFonts w:eastAsia="" w:cs="" w:cstheme="majorBidi" w:eastAsiaTheme="majorEastAsia"/>
-      <w:color w:themeColor="accent1" w:themeShade="bf" w:val="2F5496"/>
-    </w:rPr>
-  </w:style>
-  <w:style w:type="paragraph" w:styleId="Heading6">
+      <w:rFonts w:eastAsiaTheme="majorEastAsia" w:cstheme="majorBidi"/>
+      <w:color w:val="2F5496" w:themeColor="accent1" w:themeShade="BF"/>
+    </w:rPr>
+  </w:style>
+  <w:style w:type="paragraph" w:styleId="Ttulo6">
     <w:name w:val="heading 6"/>
     <w:basedOn w:val="Normal"/>
     <w:next w:val="Normal"/>
@@ -1771,21 +1415,21 @@
     <w:semiHidden/>
     <w:unhideWhenUsed/>
     <w:qFormat/>
-    <w:rsid w:val="00c07d19"/>
+    <w:rsid w:val="00C07D19"/>
     <w:pPr>
-      <w:keepNext w:val="true"/>
+      <w:keepNext/>
       <w:keepLines/>
       <w:spacing w:before="40" w:after="0"/>
       <w:outlineLvl w:val="5"/>
     </w:pPr>
     <w:rPr>
-      <w:rFonts w:eastAsia="" w:cs="" w:cstheme="majorBidi" w:eastAsiaTheme="majorEastAsia"/>
+      <w:rFonts w:eastAsiaTheme="majorEastAsia" w:cstheme="majorBidi"/>
       <w:i/>
       <w:iCs/>
-      <w:color w:themeColor="text1" w:themeTint="a6" w:val="595959"/>
-    </w:rPr>
-  </w:style>
-  <w:style w:type="paragraph" w:styleId="Heading7">
+      <w:color w:val="595959" w:themeColor="text1" w:themeTint="A6"/>
+    </w:rPr>
+  </w:style>
+  <w:style w:type="paragraph" w:styleId="Ttulo7">
     <w:name w:val="heading 7"/>
     <w:basedOn w:val="Normal"/>
     <w:next w:val="Normal"/>
@@ -1794,19 +1438,19 @@
     <w:semiHidden/>
     <w:unhideWhenUsed/>
     <w:qFormat/>
-    <w:rsid w:val="00c07d19"/>
+    <w:rsid w:val="00C07D19"/>
     <w:pPr>
-      <w:keepNext w:val="true"/>
+      <w:keepNext/>
       <w:keepLines/>
       <w:spacing w:before="40" w:after="0"/>
       <w:outlineLvl w:val="6"/>
     </w:pPr>
     <w:rPr>
-      <w:rFonts w:eastAsia="" w:cs="" w:cstheme="majorBidi" w:eastAsiaTheme="majorEastAsia"/>
-      <w:color w:themeColor="text1" w:themeTint="a6" w:val="595959"/>
-    </w:rPr>
-  </w:style>
-  <w:style w:type="paragraph" w:styleId="Heading8">
+      <w:rFonts w:eastAsiaTheme="majorEastAsia" w:cstheme="majorBidi"/>
+      <w:color w:val="595959" w:themeColor="text1" w:themeTint="A6"/>
+    </w:rPr>
+  </w:style>
+  <w:style w:type="paragraph" w:styleId="Ttulo8">
     <w:name w:val="heading 8"/>
     <w:basedOn w:val="Normal"/>
     <w:next w:val="Normal"/>
@@ -1815,21 +1459,21 @@
     <w:semiHidden/>
     <w:unhideWhenUsed/>
     <w:qFormat/>
-    <w:rsid w:val="00c07d19"/>
+    <w:rsid w:val="00C07D19"/>
     <w:pPr>
-      <w:keepNext w:val="true"/>
+      <w:keepNext/>
       <w:keepLines/>
-      <w:spacing w:before="0" w:after="0"/>
+      <w:spacing w:after="0"/>
       <w:outlineLvl w:val="7"/>
     </w:pPr>
     <w:rPr>
-      <w:rFonts w:eastAsia="" w:cs="" w:cstheme="majorBidi" w:eastAsiaTheme="majorEastAsia"/>
+      <w:rFonts w:eastAsiaTheme="majorEastAsia" w:cstheme="majorBidi"/>
       <w:i/>
       <w:iCs/>
-      <w:color w:themeColor="text1" w:themeTint="d8" w:val="272727"/>
-    </w:rPr>
-  </w:style>
-  <w:style w:type="paragraph" w:styleId="Heading9">
+      <w:color w:val="272727" w:themeColor="text1" w:themeTint="D8"/>
+    </w:rPr>
+  </w:style>
+  <w:style w:type="paragraph" w:styleId="Ttulo9">
     <w:name w:val="heading 9"/>
     <w:basedOn w:val="Normal"/>
     <w:next w:val="Normal"/>
@@ -1838,406 +1482,23 @@
     <w:semiHidden/>
     <w:unhideWhenUsed/>
     <w:qFormat/>
-    <w:rsid w:val="00c07d19"/>
+    <w:rsid w:val="00C07D19"/>
     <w:pPr>
-      <w:keepNext w:val="true"/>
+      <w:keepNext/>
       <w:keepLines/>
-      <w:spacing w:before="0" w:after="0"/>
+      <w:spacing w:after="0"/>
       <w:outlineLvl w:val="8"/>
     </w:pPr>
     <w:rPr>
-      <w:rFonts w:eastAsia="" w:cs="" w:cstheme="majorBidi" w:eastAsiaTheme="majorEastAsia"/>
-      <w:color w:themeColor="text1" w:themeTint="d8" w:val="272727"/>
-    </w:rPr>
-  </w:style>
-  <w:style w:type="character" w:styleId="DefaultParagraphFont" w:default="1">
+      <w:rFonts w:eastAsiaTheme="majorEastAsia" w:cstheme="majorBidi"/>
+      <w:color w:val="272727" w:themeColor="text1" w:themeTint="D8"/>
+    </w:rPr>
+  </w:style>
+  <w:style w:type="character" w:default="1" w:styleId="Fontepargpadro">
     <w:name w:val="Default Paragraph Font"/>
     <w:uiPriority w:val="1"/>
     <w:semiHidden/>
     <w:unhideWhenUsed/>
-    <w:qFormat/>
-    <w:rPr/>
-  </w:style>
-  <w:style w:type="character" w:styleId="Ttulo1Char" w:customStyle="1">
-    <w:name w:val="Título 1 Char"/>
-    <w:basedOn w:val="DefaultParagraphFont"/>
-    <w:uiPriority w:val="9"/>
-    <w:qFormat/>
-    <w:rsid w:val="00c07d19"/>
-    <w:rPr>
-      <w:rFonts w:ascii="Calibri Light" w:hAnsi="Calibri Light" w:eastAsia="" w:cs="" w:asciiTheme="majorHAnsi" w:cstheme="majorBidi" w:eastAsiaTheme="majorEastAsia" w:hAnsiTheme="majorHAnsi"/>
-      <w:color w:themeColor="accent1" w:themeShade="bf" w:val="2F5496"/>
-      <w:sz w:val="40"/>
-      <w:szCs w:val="40"/>
-    </w:rPr>
-  </w:style>
-  <w:style w:type="character" w:styleId="Ttulo2Char" w:customStyle="1">
-    <w:name w:val="Título 2 Char"/>
-    <w:basedOn w:val="DefaultParagraphFont"/>
-    <w:uiPriority w:val="9"/>
-    <w:semiHidden/>
-    <w:qFormat/>
-    <w:rsid w:val="00c07d19"/>
-    <w:rPr>
-      <w:rFonts w:ascii="Calibri Light" w:hAnsi="Calibri Light" w:eastAsia="" w:cs="" w:asciiTheme="majorHAnsi" w:cstheme="majorBidi" w:eastAsiaTheme="majorEastAsia" w:hAnsiTheme="majorHAnsi"/>
-      <w:color w:themeColor="accent1" w:themeShade="bf" w:val="2F5496"/>
-      <w:sz w:val="32"/>
-      <w:szCs w:val="32"/>
-    </w:rPr>
-  </w:style>
-  <w:style w:type="character" w:styleId="Ttulo3Char" w:customStyle="1">
-    <w:name w:val="Título 3 Char"/>
-    <w:basedOn w:val="DefaultParagraphFont"/>
-    <w:uiPriority w:val="9"/>
-    <w:semiHidden/>
-    <w:qFormat/>
-    <w:rsid w:val="00c07d19"/>
-    <w:rPr>
-      <w:rFonts w:eastAsia="" w:cs="" w:cstheme="majorBidi" w:eastAsiaTheme="majorEastAsia"/>
-      <w:color w:themeColor="accent1" w:themeShade="bf" w:val="2F5496"/>
-      <w:sz w:val="28"/>
-      <w:szCs w:val="28"/>
-    </w:rPr>
-  </w:style>
-  <w:style w:type="character" w:styleId="Ttulo4Char" w:customStyle="1">
-    <w:name w:val="Título 4 Char"/>
-    <w:basedOn w:val="DefaultParagraphFont"/>
-    <w:uiPriority w:val="9"/>
-    <w:semiHidden/>
-    <w:qFormat/>
-    <w:rsid w:val="00c07d19"/>
-    <w:rPr>
-      <w:rFonts w:eastAsia="" w:cs="" w:cstheme="majorBidi" w:eastAsiaTheme="majorEastAsia"/>
-      <w:i/>
-      <w:iCs/>
-      <w:color w:themeColor="accent1" w:themeShade="bf" w:val="2F5496"/>
-    </w:rPr>
-  </w:style>
-  <w:style w:type="character" w:styleId="Ttulo5Char" w:customStyle="1">
-    <w:name w:val="Título 5 Char"/>
-    <w:basedOn w:val="DefaultParagraphFont"/>
-    <w:uiPriority w:val="9"/>
-    <w:semiHidden/>
-    <w:qFormat/>
-    <w:rsid w:val="00c07d19"/>
-    <w:rPr>
-      <w:rFonts w:eastAsia="" w:cs="" w:cstheme="majorBidi" w:eastAsiaTheme="majorEastAsia"/>
-      <w:color w:themeColor="accent1" w:themeShade="bf" w:val="2F5496"/>
-    </w:rPr>
-  </w:style>
-  <w:style w:type="character" w:styleId="Ttulo6Char" w:customStyle="1">
-    <w:name w:val="Título 6 Char"/>
-    <w:basedOn w:val="DefaultParagraphFont"/>
-    <w:uiPriority w:val="9"/>
-    <w:semiHidden/>
-    <w:qFormat/>
-    <w:rsid w:val="00c07d19"/>
-    <w:rPr>
-      <w:rFonts w:eastAsia="" w:cs="" w:cstheme="majorBidi" w:eastAsiaTheme="majorEastAsia"/>
-      <w:i/>
-      <w:iCs/>
-      <w:color w:themeColor="text1" w:themeTint="a6" w:val="595959"/>
-    </w:rPr>
-  </w:style>
-  <w:style w:type="character" w:styleId="Ttulo7Char" w:customStyle="1">
-    <w:name w:val="Título 7 Char"/>
-    <w:basedOn w:val="DefaultParagraphFont"/>
-    <w:uiPriority w:val="9"/>
-    <w:semiHidden/>
-    <w:qFormat/>
-    <w:rsid w:val="00c07d19"/>
-    <w:rPr>
-      <w:rFonts w:eastAsia="" w:cs="" w:cstheme="majorBidi" w:eastAsiaTheme="majorEastAsia"/>
-      <w:color w:themeColor="text1" w:themeTint="a6" w:val="595959"/>
-    </w:rPr>
-  </w:style>
-  <w:style w:type="character" w:styleId="Ttulo8Char" w:customStyle="1">
-    <w:name w:val="Título 8 Char"/>
-    <w:basedOn w:val="DefaultParagraphFont"/>
-    <w:uiPriority w:val="9"/>
-    <w:semiHidden/>
-    <w:qFormat/>
-    <w:rsid w:val="00c07d19"/>
-    <w:rPr>
-      <w:rFonts w:eastAsia="" w:cs="" w:cstheme="majorBidi" w:eastAsiaTheme="majorEastAsia"/>
-      <w:i/>
-      <w:iCs/>
-      <w:color w:themeColor="text1" w:themeTint="d8" w:val="272727"/>
-    </w:rPr>
-  </w:style>
-  <w:style w:type="character" w:styleId="Ttulo9Char" w:customStyle="1">
-    <w:name w:val="Título 9 Char"/>
-    <w:basedOn w:val="DefaultParagraphFont"/>
-    <w:uiPriority w:val="9"/>
-    <w:semiHidden/>
-    <w:qFormat/>
-    <w:rsid w:val="00c07d19"/>
-    <w:rPr>
-      <w:rFonts w:eastAsia="" w:cs="" w:cstheme="majorBidi" w:eastAsiaTheme="majorEastAsia"/>
-      <w:color w:themeColor="text1" w:themeTint="d8" w:val="272727"/>
-    </w:rPr>
-  </w:style>
-  <w:style w:type="character" w:styleId="TtuloChar" w:customStyle="1">
-    <w:name w:val="Título Char"/>
-    <w:basedOn w:val="DefaultParagraphFont"/>
-    <w:uiPriority w:val="10"/>
-    <w:qFormat/>
-    <w:rsid w:val="00c07d19"/>
-    <w:rPr>
-      <w:rFonts w:ascii="Calibri Light" w:hAnsi="Calibri Light" w:eastAsia="" w:cs="" w:asciiTheme="majorHAnsi" w:cstheme="majorBidi" w:eastAsiaTheme="majorEastAsia" w:hAnsiTheme="majorHAnsi"/>
-      <w:spacing w:val="-10"/>
-      <w:kern w:val="2"/>
-      <w:sz w:val="56"/>
-      <w:szCs w:val="56"/>
-    </w:rPr>
-  </w:style>
-  <w:style w:type="character" w:styleId="SubttuloChar" w:customStyle="1">
-    <w:name w:val="Subtítulo Char"/>
-    <w:basedOn w:val="DefaultParagraphFont"/>
-    <w:uiPriority w:val="11"/>
-    <w:qFormat/>
-    <w:rsid w:val="00c07d19"/>
-    <w:rPr>
-      <w:rFonts w:eastAsia="" w:cs="" w:cstheme="majorBidi" w:eastAsiaTheme="majorEastAsia"/>
-      <w:color w:themeColor="text1" w:themeTint="a6" w:val="595959"/>
-      <w:spacing w:val="15"/>
-      <w:sz w:val="28"/>
-      <w:szCs w:val="28"/>
-    </w:rPr>
-  </w:style>
-  <w:style w:type="character" w:styleId="CitaoChar" w:customStyle="1">
-    <w:name w:val="Citação Char"/>
-    <w:basedOn w:val="DefaultParagraphFont"/>
-    <w:link w:val="Quote"/>
-    <w:uiPriority w:val="29"/>
-    <w:qFormat/>
-    <w:rsid w:val="00c07d19"/>
-    <w:rPr>
-      <w:i/>
-      <w:iCs/>
-      <w:color w:themeColor="text1" w:themeTint="bf" w:val="404040"/>
-    </w:rPr>
-  </w:style>
-  <w:style w:type="character" w:styleId="IntenseEmphasis">
-    <w:name w:val="Intense Emphasis"/>
-    <w:basedOn w:val="DefaultParagraphFont"/>
-    <w:uiPriority w:val="21"/>
-    <w:qFormat/>
-    <w:rsid w:val="00c07d19"/>
-    <w:rPr>
-      <w:i/>
-      <w:iCs/>
-      <w:color w:themeColor="accent1" w:themeShade="bf" w:val="2F5496"/>
-    </w:rPr>
-  </w:style>
-  <w:style w:type="character" w:styleId="CitaoIntensaChar" w:customStyle="1">
-    <w:name w:val="Citação Intensa Char"/>
-    <w:basedOn w:val="DefaultParagraphFont"/>
-    <w:link w:val="IntenseQuote"/>
-    <w:uiPriority w:val="30"/>
-    <w:qFormat/>
-    <w:rsid w:val="00c07d19"/>
-    <w:rPr>
-      <w:i/>
-      <w:iCs/>
-      <w:color w:themeColor="accent1" w:themeShade="bf" w:val="2F5496"/>
-    </w:rPr>
-  </w:style>
-  <w:style w:type="character" w:styleId="IntenseReference">
-    <w:name w:val="Intense Reference"/>
-    <w:basedOn w:val="DefaultParagraphFont"/>
-    <w:uiPriority w:val="32"/>
-    <w:qFormat/>
-    <w:rsid w:val="00c07d19"/>
-    <w:rPr>
-      <w:b/>
-      <w:bCs/>
-      <w:smallCaps/>
-      <w:color w:themeColor="accent1" w:themeShade="bf" w:val="2F5496"/>
-      <w:spacing w:val="5"/>
-    </w:rPr>
-  </w:style>
-  <w:style w:type="paragraph" w:styleId="Ttulo">
-    <w:name w:val="Título"/>
-    <w:basedOn w:val="Normal"/>
-    <w:next w:val="BodyText"/>
-    <w:qFormat/>
-    <w:pPr>
-      <w:keepNext w:val="true"/>
-      <w:spacing w:before="240" w:after="120"/>
-    </w:pPr>
-    <w:rPr>
-      <w:rFonts w:ascii="Liberation Sans" w:hAnsi="Liberation Sans" w:eastAsia="Noto Sans CJK SC" w:cs="Noto Sans Devanagari"/>
-      <w:sz w:val="28"/>
-      <w:szCs w:val="28"/>
-    </w:rPr>
-  </w:style>
-  <w:style w:type="paragraph" w:styleId="BodyText">
-    <w:name w:val="Body Text"/>
-    <w:basedOn w:val="Normal"/>
-    <w:pPr>
-      <w:spacing w:lineRule="auto" w:line="276" w:before="0" w:after="140"/>
-    </w:pPr>
-    <w:rPr/>
-  </w:style>
-  <w:style w:type="paragraph" w:styleId="List">
-    <w:name w:val="List"/>
-    <w:basedOn w:val="BodyText"/>
-    <w:pPr/>
-    <w:rPr>
-      <w:rFonts w:cs="Noto Sans Devanagari"/>
-    </w:rPr>
-  </w:style>
-  <w:style w:type="paragraph" w:styleId="Caption">
-    <w:name w:val="caption"/>
-    <w:basedOn w:val="Normal"/>
-    <w:qFormat/>
-    <w:pPr>
-      <w:suppressLineNumbers/>
-      <w:spacing w:before="120" w:after="120"/>
-    </w:pPr>
-    <w:rPr>
-      <w:rFonts w:cs="Noto Sans Devanagari"/>
-      <w:i/>
-      <w:iCs/>
-      <w:sz w:val="24"/>
-      <w:szCs w:val="24"/>
-    </w:rPr>
-  </w:style>
-  <w:style w:type="paragraph" w:styleId="ndice">
-    <w:name w:val="Índice"/>
-    <w:basedOn w:val="Normal"/>
-    <w:qFormat/>
-    <w:pPr>
-      <w:suppressLineNumbers/>
-    </w:pPr>
-    <w:rPr>
-      <w:rFonts w:cs="Noto Sans Devanagari"/>
-    </w:rPr>
-  </w:style>
-  <w:style w:type="paragraph" w:styleId="Ttulouser">
-    <w:name w:val="Título (user)"/>
-    <w:basedOn w:val="Normal"/>
-    <w:next w:val="BodyText"/>
-    <w:qFormat/>
-    <w:pPr>
-      <w:keepNext w:val="true"/>
-      <w:spacing w:before="240" w:after="120"/>
-    </w:pPr>
-    <w:rPr>
-      <w:rFonts w:ascii="Liberation Sans" w:hAnsi="Liberation Sans" w:eastAsia="Noto Sans CJK SC" w:cs="Noto Sans Devanagari"/>
-      <w:sz w:val="28"/>
-      <w:szCs w:val="28"/>
-    </w:rPr>
-  </w:style>
-  <w:style w:type="paragraph" w:styleId="ndiceuser">
-    <w:name w:val="Índice (user)"/>
-    <w:basedOn w:val="Normal"/>
-    <w:qFormat/>
-    <w:pPr>
-      <w:suppressLineNumbers/>
-    </w:pPr>
-    <w:rPr>
-      <w:rFonts w:cs="Noto Sans Devanagari"/>
-    </w:rPr>
-  </w:style>
-  <w:style w:type="paragraph" w:styleId="Title">
-    <w:name w:val="Title"/>
-    <w:basedOn w:val="Normal"/>
-    <w:next w:val="Normal"/>
-    <w:link w:val="TtuloChar"/>
-    <w:uiPriority w:val="10"/>
-    <w:qFormat/>
-    <w:rsid w:val="00c07d19"/>
-    <w:pPr>
-      <w:spacing w:lineRule="auto" w:line="240" w:before="0" w:after="80"/>
-      <w:contextualSpacing/>
-    </w:pPr>
-    <w:rPr>
-      <w:rFonts w:ascii="Calibri Light" w:hAnsi="Calibri Light" w:eastAsia="" w:cs="" w:asciiTheme="majorHAnsi" w:cstheme="majorBidi" w:eastAsiaTheme="majorEastAsia" w:hAnsiTheme="majorHAnsi"/>
-      <w:spacing w:val="-10"/>
-      <w:kern w:val="2"/>
-      <w:sz w:val="56"/>
-      <w:szCs w:val="56"/>
-    </w:rPr>
-  </w:style>
-  <w:style w:type="paragraph" w:styleId="Subtitle">
-    <w:name w:val="Subtitle"/>
-    <w:basedOn w:val="Normal"/>
-    <w:next w:val="Normal"/>
-    <w:link w:val="SubttuloChar"/>
-    <w:uiPriority w:val="11"/>
-    <w:qFormat/>
-    <w:rsid w:val="00c07d19"/>
-    <w:pPr/>
-    <w:rPr>
-      <w:rFonts w:eastAsia="" w:cs="" w:cstheme="majorBidi" w:eastAsiaTheme="majorEastAsia"/>
-      <w:color w:themeColor="text1" w:themeTint="a6" w:val="595959"/>
-      <w:spacing w:val="15"/>
-      <w:sz w:val="28"/>
-      <w:szCs w:val="28"/>
-    </w:rPr>
-  </w:style>
-  <w:style w:type="paragraph" w:styleId="Quote">
-    <w:name w:val="Quote"/>
-    <w:basedOn w:val="Normal"/>
-    <w:next w:val="Normal"/>
-    <w:link w:val="CitaoChar"/>
-    <w:uiPriority w:val="29"/>
-    <w:qFormat/>
-    <w:rsid w:val="00c07d19"/>
-    <w:pPr>
-      <w:spacing w:before="160" w:after="160"/>
-      <w:jc w:val="center"/>
-    </w:pPr>
-    <w:rPr>
-      <w:i/>
-      <w:iCs/>
-      <w:color w:themeColor="text1" w:themeTint="bf" w:val="404040"/>
-    </w:rPr>
-  </w:style>
-  <w:style w:type="paragraph" w:styleId="ListParagraph">
-    <w:name w:val="List Paragraph"/>
-    <w:basedOn w:val="Normal"/>
-    <w:uiPriority w:val="34"/>
-    <w:qFormat/>
-    <w:rsid w:val="00c07d19"/>
-    <w:pPr>
-      <w:spacing w:before="0" w:after="160"/>
-      <w:ind w:left="720"/>
-      <w:contextualSpacing/>
-    </w:pPr>
-    <w:rPr/>
-  </w:style>
-  <w:style w:type="paragraph" w:styleId="IntenseQuote">
-    <w:name w:val="Intense Quote"/>
-    <w:basedOn w:val="Normal"/>
-    <w:next w:val="Normal"/>
-    <w:link w:val="CitaoIntensaChar"/>
-    <w:uiPriority w:val="30"/>
-    <w:qFormat/>
-    <w:rsid w:val="00c07d19"/>
-    <w:pPr>
-      <w:pBdr>
-        <w:top w:val="single" w:sz="4" w:space="10" w:color="2F5496" w:themeColor="accent1" w:themeShade="bf"/>
-        <w:bottom w:val="single" w:sz="4" w:space="10" w:color="2F5496" w:themeColor="accent1" w:themeShade="bf"/>
-      </w:pBdr>
-      <w:spacing w:before="360" w:after="360"/>
-      <w:ind w:left="864" w:right="864"/>
-      <w:jc w:val="center"/>
-    </w:pPr>
-    <w:rPr>
-      <w:i/>
-      <w:iCs/>
-      <w:color w:themeColor="accent1" w:themeShade="bf" w:val="2F5496"/>
-    </w:rPr>
-  </w:style>
-  <w:style w:type="numbering" w:styleId="Semlista" w:default="1">
-    <w:name w:val="Sem lista"/>
-    <w:uiPriority w:val="99"/>
-    <w:semiHidden/>
-    <w:unhideWhenUsed/>
-    <w:qFormat/>
   </w:style>
   <w:style w:type="table" w:default="1" w:styleId="Tabelanormal">
     <w:name w:val="Normal Table"/>
@@ -2245,6 +1506,7 @@
     <w:semiHidden/>
     <w:unhideWhenUsed/>
     <w:tblPr>
+      <w:tblInd w:w="0" w:type="dxa"/>
       <w:tblCellMar>
         <w:top w:w="0" w:type="dxa"/>
         <w:left w:w="108" w:type="dxa"/>
@@ -2253,58 +1515,428 @@
       </w:tblCellMar>
     </w:tblPr>
   </w:style>
+  <w:style w:type="numbering" w:default="1" w:styleId="Semlista">
+    <w:name w:val="No List"/>
+    <w:uiPriority w:val="99"/>
+    <w:semiHidden/>
+    <w:unhideWhenUsed/>
+  </w:style>
+  <w:style w:type="character" w:customStyle="1" w:styleId="Ttulo1Char">
+    <w:name w:val="Título 1 Char"/>
+    <w:basedOn w:val="Fontepargpadro"/>
+    <w:link w:val="Ttulo1"/>
+    <w:uiPriority w:val="9"/>
+    <w:qFormat/>
+    <w:rsid w:val="00C07D19"/>
+    <w:rPr>
+      <w:rFonts w:asciiTheme="majorHAnsi" w:eastAsiaTheme="majorEastAsia" w:hAnsiTheme="majorHAnsi" w:cstheme="majorBidi"/>
+      <w:color w:val="2F5496" w:themeColor="accent1" w:themeShade="BF"/>
+      <w:sz w:val="40"/>
+      <w:szCs w:val="40"/>
+    </w:rPr>
+  </w:style>
+  <w:style w:type="character" w:customStyle="1" w:styleId="Ttulo2Char">
+    <w:name w:val="Título 2 Char"/>
+    <w:basedOn w:val="Fontepargpadro"/>
+    <w:link w:val="Ttulo2"/>
+    <w:uiPriority w:val="9"/>
+    <w:semiHidden/>
+    <w:qFormat/>
+    <w:rsid w:val="00C07D19"/>
+    <w:rPr>
+      <w:rFonts w:asciiTheme="majorHAnsi" w:eastAsiaTheme="majorEastAsia" w:hAnsiTheme="majorHAnsi" w:cstheme="majorBidi"/>
+      <w:color w:val="2F5496" w:themeColor="accent1" w:themeShade="BF"/>
+      <w:sz w:val="32"/>
+      <w:szCs w:val="32"/>
+    </w:rPr>
+  </w:style>
+  <w:style w:type="character" w:customStyle="1" w:styleId="Ttulo3Char">
+    <w:name w:val="Título 3 Char"/>
+    <w:basedOn w:val="Fontepargpadro"/>
+    <w:link w:val="Ttulo3"/>
+    <w:uiPriority w:val="9"/>
+    <w:semiHidden/>
+    <w:qFormat/>
+    <w:rsid w:val="00C07D19"/>
+    <w:rPr>
+      <w:rFonts w:eastAsiaTheme="majorEastAsia" w:cstheme="majorBidi"/>
+      <w:color w:val="2F5496" w:themeColor="accent1" w:themeShade="BF"/>
+      <w:sz w:val="28"/>
+      <w:szCs w:val="28"/>
+    </w:rPr>
+  </w:style>
+  <w:style w:type="character" w:customStyle="1" w:styleId="Ttulo4Char">
+    <w:name w:val="Título 4 Char"/>
+    <w:basedOn w:val="Fontepargpadro"/>
+    <w:link w:val="Ttulo4"/>
+    <w:uiPriority w:val="9"/>
+    <w:semiHidden/>
+    <w:qFormat/>
+    <w:rsid w:val="00C07D19"/>
+    <w:rPr>
+      <w:rFonts w:eastAsiaTheme="majorEastAsia" w:cstheme="majorBidi"/>
+      <w:i/>
+      <w:iCs/>
+      <w:color w:val="2F5496" w:themeColor="accent1" w:themeShade="BF"/>
+    </w:rPr>
+  </w:style>
+  <w:style w:type="character" w:customStyle="1" w:styleId="Ttulo5Char">
+    <w:name w:val="Título 5 Char"/>
+    <w:basedOn w:val="Fontepargpadro"/>
+    <w:link w:val="Ttulo5"/>
+    <w:uiPriority w:val="9"/>
+    <w:semiHidden/>
+    <w:qFormat/>
+    <w:rsid w:val="00C07D19"/>
+    <w:rPr>
+      <w:rFonts w:eastAsiaTheme="majorEastAsia" w:cstheme="majorBidi"/>
+      <w:color w:val="2F5496" w:themeColor="accent1" w:themeShade="BF"/>
+    </w:rPr>
+  </w:style>
+  <w:style w:type="character" w:customStyle="1" w:styleId="Ttulo6Char">
+    <w:name w:val="Título 6 Char"/>
+    <w:basedOn w:val="Fontepargpadro"/>
+    <w:link w:val="Ttulo6"/>
+    <w:uiPriority w:val="9"/>
+    <w:semiHidden/>
+    <w:qFormat/>
+    <w:rsid w:val="00C07D19"/>
+    <w:rPr>
+      <w:rFonts w:eastAsiaTheme="majorEastAsia" w:cstheme="majorBidi"/>
+      <w:i/>
+      <w:iCs/>
+      <w:color w:val="595959" w:themeColor="text1" w:themeTint="A6"/>
+    </w:rPr>
+  </w:style>
+  <w:style w:type="character" w:customStyle="1" w:styleId="Ttulo7Char">
+    <w:name w:val="Título 7 Char"/>
+    <w:basedOn w:val="Fontepargpadro"/>
+    <w:link w:val="Ttulo7"/>
+    <w:uiPriority w:val="9"/>
+    <w:semiHidden/>
+    <w:qFormat/>
+    <w:rsid w:val="00C07D19"/>
+    <w:rPr>
+      <w:rFonts w:eastAsiaTheme="majorEastAsia" w:cstheme="majorBidi"/>
+      <w:color w:val="595959" w:themeColor="text1" w:themeTint="A6"/>
+    </w:rPr>
+  </w:style>
+  <w:style w:type="character" w:customStyle="1" w:styleId="Ttulo8Char">
+    <w:name w:val="Título 8 Char"/>
+    <w:basedOn w:val="Fontepargpadro"/>
+    <w:link w:val="Ttulo8"/>
+    <w:uiPriority w:val="9"/>
+    <w:semiHidden/>
+    <w:qFormat/>
+    <w:rsid w:val="00C07D19"/>
+    <w:rPr>
+      <w:rFonts w:eastAsiaTheme="majorEastAsia" w:cstheme="majorBidi"/>
+      <w:i/>
+      <w:iCs/>
+      <w:color w:val="272727" w:themeColor="text1" w:themeTint="D8"/>
+    </w:rPr>
+  </w:style>
+  <w:style w:type="character" w:customStyle="1" w:styleId="Ttulo9Char">
+    <w:name w:val="Título 9 Char"/>
+    <w:basedOn w:val="Fontepargpadro"/>
+    <w:link w:val="Ttulo9"/>
+    <w:uiPriority w:val="9"/>
+    <w:semiHidden/>
+    <w:qFormat/>
+    <w:rsid w:val="00C07D19"/>
+    <w:rPr>
+      <w:rFonts w:eastAsiaTheme="majorEastAsia" w:cstheme="majorBidi"/>
+      <w:color w:val="272727" w:themeColor="text1" w:themeTint="D8"/>
+    </w:rPr>
+  </w:style>
+  <w:style w:type="character" w:customStyle="1" w:styleId="TtuloChar">
+    <w:name w:val="Título Char"/>
+    <w:basedOn w:val="Fontepargpadro"/>
+    <w:link w:val="Ttulo"/>
+    <w:uiPriority w:val="10"/>
+    <w:qFormat/>
+    <w:rsid w:val="00C07D19"/>
+    <w:rPr>
+      <w:rFonts w:asciiTheme="majorHAnsi" w:eastAsiaTheme="majorEastAsia" w:hAnsiTheme="majorHAnsi" w:cstheme="majorBidi"/>
+      <w:spacing w:val="-10"/>
+      <w:kern w:val="2"/>
+      <w:sz w:val="56"/>
+      <w:szCs w:val="56"/>
+    </w:rPr>
+  </w:style>
+  <w:style w:type="character" w:customStyle="1" w:styleId="SubttuloChar">
+    <w:name w:val="Subtítulo Char"/>
+    <w:basedOn w:val="Fontepargpadro"/>
+    <w:link w:val="Subttulo"/>
+    <w:uiPriority w:val="11"/>
+    <w:qFormat/>
+    <w:rsid w:val="00C07D19"/>
+    <w:rPr>
+      <w:rFonts w:eastAsiaTheme="majorEastAsia" w:cstheme="majorBidi"/>
+      <w:color w:val="595959" w:themeColor="text1" w:themeTint="A6"/>
+      <w:spacing w:val="15"/>
+      <w:sz w:val="28"/>
+      <w:szCs w:val="28"/>
+    </w:rPr>
+  </w:style>
+  <w:style w:type="character" w:customStyle="1" w:styleId="CitaoChar">
+    <w:name w:val="Citação Char"/>
+    <w:basedOn w:val="Fontepargpadro"/>
+    <w:link w:val="Citao"/>
+    <w:uiPriority w:val="29"/>
+    <w:qFormat/>
+    <w:rsid w:val="00C07D19"/>
+    <w:rPr>
+      <w:i/>
+      <w:iCs/>
+      <w:color w:val="404040" w:themeColor="text1" w:themeTint="BF"/>
+    </w:rPr>
+  </w:style>
+  <w:style w:type="character" w:styleId="nfaseIntensa">
+    <w:name w:val="Intense Emphasis"/>
+    <w:basedOn w:val="Fontepargpadro"/>
+    <w:uiPriority w:val="21"/>
+    <w:qFormat/>
+    <w:rsid w:val="00C07D19"/>
+    <w:rPr>
+      <w:i/>
+      <w:iCs/>
+      <w:color w:val="2F5496" w:themeColor="accent1" w:themeShade="BF"/>
+    </w:rPr>
+  </w:style>
+  <w:style w:type="character" w:customStyle="1" w:styleId="CitaoIntensaChar">
+    <w:name w:val="Citação Intensa Char"/>
+    <w:basedOn w:val="Fontepargpadro"/>
+    <w:link w:val="CitaoIntensa"/>
+    <w:uiPriority w:val="30"/>
+    <w:qFormat/>
+    <w:rsid w:val="00C07D19"/>
+    <w:rPr>
+      <w:i/>
+      <w:iCs/>
+      <w:color w:val="2F5496" w:themeColor="accent1" w:themeShade="BF"/>
+    </w:rPr>
+  </w:style>
+  <w:style w:type="character" w:styleId="RefernciaIntensa">
+    <w:name w:val="Intense Reference"/>
+    <w:basedOn w:val="Fontepargpadro"/>
+    <w:uiPriority w:val="32"/>
+    <w:qFormat/>
+    <w:rsid w:val="00C07D19"/>
+    <w:rPr>
+      <w:b/>
+      <w:bCs/>
+      <w:smallCaps/>
+      <w:color w:val="2F5496" w:themeColor="accent1" w:themeShade="BF"/>
+      <w:spacing w:val="5"/>
+    </w:rPr>
+  </w:style>
+  <w:style w:type="paragraph" w:styleId="Ttulo">
+    <w:name w:val="Title"/>
+    <w:basedOn w:val="Normal"/>
+    <w:next w:val="Corpodetexto"/>
+    <w:link w:val="TtuloChar"/>
+    <w:uiPriority w:val="10"/>
+    <w:qFormat/>
+    <w:rsid w:val="00C07D19"/>
+    <w:pPr>
+      <w:spacing w:after="80" w:line="240" w:lineRule="auto"/>
+      <w:contextualSpacing/>
+    </w:pPr>
+    <w:rPr>
+      <w:rFonts w:asciiTheme="majorHAnsi" w:eastAsiaTheme="majorEastAsia" w:hAnsiTheme="majorHAnsi" w:cstheme="majorBidi"/>
+      <w:spacing w:val="-10"/>
+      <w:sz w:val="56"/>
+      <w:szCs w:val="56"/>
+    </w:rPr>
+  </w:style>
+  <w:style w:type="paragraph" w:styleId="Corpodetexto">
+    <w:name w:val="Body Text"/>
+    <w:basedOn w:val="Normal"/>
+    <w:pPr>
+      <w:spacing w:after="140" w:line="276" w:lineRule="auto"/>
+    </w:pPr>
+  </w:style>
+  <w:style w:type="paragraph" w:styleId="Lista">
+    <w:name w:val="List"/>
+    <w:basedOn w:val="Corpodetexto"/>
+    <w:rPr>
+      <w:rFonts w:cs="Noto Sans Devanagari"/>
+    </w:rPr>
+  </w:style>
+  <w:style w:type="paragraph" w:styleId="Legenda">
+    <w:name w:val="caption"/>
+    <w:basedOn w:val="Normal"/>
+    <w:qFormat/>
+    <w:pPr>
+      <w:suppressLineNumbers/>
+      <w:spacing w:before="120" w:after="120"/>
+    </w:pPr>
+    <w:rPr>
+      <w:rFonts w:cs="Noto Sans Devanagari"/>
+      <w:i/>
+      <w:iCs/>
+      <w:sz w:val="24"/>
+      <w:szCs w:val="24"/>
+    </w:rPr>
+  </w:style>
+  <w:style w:type="paragraph" w:customStyle="1" w:styleId="ndice">
+    <w:name w:val="Índice"/>
+    <w:basedOn w:val="Normal"/>
+    <w:qFormat/>
+    <w:pPr>
+      <w:suppressLineNumbers/>
+    </w:pPr>
+    <w:rPr>
+      <w:rFonts w:cs="Noto Sans Devanagari"/>
+    </w:rPr>
+  </w:style>
+  <w:style w:type="paragraph" w:customStyle="1" w:styleId="Ttulouser">
+    <w:name w:val="Título (user)"/>
+    <w:basedOn w:val="Normal"/>
+    <w:next w:val="Corpodetexto"/>
+    <w:qFormat/>
+    <w:pPr>
+      <w:keepNext/>
+      <w:spacing w:before="240" w:after="120"/>
+    </w:pPr>
+    <w:rPr>
+      <w:rFonts w:ascii="Liberation Sans" w:eastAsia="Noto Sans CJK SC" w:hAnsi="Liberation Sans" w:cs="Noto Sans Devanagari"/>
+      <w:sz w:val="28"/>
+      <w:szCs w:val="28"/>
+    </w:rPr>
+  </w:style>
+  <w:style w:type="paragraph" w:customStyle="1" w:styleId="ndiceuser">
+    <w:name w:val="Índice (user)"/>
+    <w:basedOn w:val="Normal"/>
+    <w:qFormat/>
+    <w:pPr>
+      <w:suppressLineNumbers/>
+    </w:pPr>
+    <w:rPr>
+      <w:rFonts w:cs="Noto Sans Devanagari"/>
+    </w:rPr>
+  </w:style>
+  <w:style w:type="paragraph" w:styleId="Subttulo">
+    <w:name w:val="Subtitle"/>
+    <w:basedOn w:val="Normal"/>
+    <w:next w:val="Normal"/>
+    <w:link w:val="SubttuloChar"/>
+    <w:uiPriority w:val="11"/>
+    <w:qFormat/>
+    <w:rsid w:val="00C07D19"/>
+    <w:rPr>
+      <w:rFonts w:eastAsiaTheme="majorEastAsia" w:cstheme="majorBidi"/>
+      <w:color w:val="595959" w:themeColor="text1" w:themeTint="A6"/>
+      <w:spacing w:val="15"/>
+      <w:sz w:val="28"/>
+      <w:szCs w:val="28"/>
+    </w:rPr>
+  </w:style>
+  <w:style w:type="paragraph" w:styleId="Citao">
+    <w:name w:val="Quote"/>
+    <w:basedOn w:val="Normal"/>
+    <w:next w:val="Normal"/>
+    <w:link w:val="CitaoChar"/>
+    <w:uiPriority w:val="29"/>
+    <w:qFormat/>
+    <w:rsid w:val="00C07D19"/>
+    <w:pPr>
+      <w:spacing w:before="160"/>
+      <w:jc w:val="center"/>
+    </w:pPr>
+    <w:rPr>
+      <w:i/>
+      <w:iCs/>
+      <w:color w:val="404040" w:themeColor="text1" w:themeTint="BF"/>
+    </w:rPr>
+  </w:style>
+  <w:style w:type="paragraph" w:styleId="PargrafodaLista">
+    <w:name w:val="List Paragraph"/>
+    <w:basedOn w:val="Normal"/>
+    <w:uiPriority w:val="34"/>
+    <w:qFormat/>
+    <w:rsid w:val="00C07D19"/>
+    <w:pPr>
+      <w:ind w:left="720"/>
+      <w:contextualSpacing/>
+    </w:pPr>
+  </w:style>
+  <w:style w:type="paragraph" w:styleId="CitaoIntensa">
+    <w:name w:val="Intense Quote"/>
+    <w:basedOn w:val="Normal"/>
+    <w:next w:val="Normal"/>
+    <w:link w:val="CitaoIntensaChar"/>
+    <w:uiPriority w:val="30"/>
+    <w:qFormat/>
+    <w:rsid w:val="00C07D19"/>
+    <w:pPr>
+      <w:pBdr>
+        <w:top w:val="single" w:sz="4" w:space="10" w:color="2F5496" w:themeColor="accent1" w:themeShade="BF"/>
+        <w:bottom w:val="single" w:sz="4" w:space="10" w:color="2F5496" w:themeColor="accent1" w:themeShade="BF"/>
+      </w:pBdr>
+      <w:spacing w:before="360" w:after="360"/>
+      <w:ind w:left="864" w:right="864"/>
+      <w:jc w:val="center"/>
+    </w:pPr>
+    <w:rPr>
+      <w:i/>
+      <w:iCs/>
+      <w:color w:val="2F5496" w:themeColor="accent1" w:themeShade="BF"/>
+    </w:rPr>
+  </w:style>
 </w:styles>
 </file>
 
 <file path=word/theme/theme1.xml><?xml version="1.0" encoding="utf-8"?>
-<a:theme xmlns:a="http://schemas.openxmlformats.org/drawingml/2006/main" xmlns:r="http://schemas.openxmlformats.org/officeDocument/2006/relationships" name="Office Theme">
+<a:theme xmlns:a="http://schemas.openxmlformats.org/drawingml/2006/main" name="Office Theme">
   <a:themeElements>
     <a:clrScheme name="Office">
       <a:dk1>
         <a:srgbClr val="000000"/>
       </a:dk1>
       <a:lt1>
-        <a:srgbClr val="ffffff"/>
+        <a:srgbClr val="FFFFFF"/>
       </a:lt1>
       <a:dk2>
-        <a:srgbClr val="44546a"/>
+        <a:srgbClr val="44546A"/>
       </a:dk2>
       <a:lt2>
-        <a:srgbClr val="e7e6e6"/>
+        <a:srgbClr val="E7E6E6"/>
       </a:lt2>
       <a:accent1>
-        <a:srgbClr val="4472c4"/>
+        <a:srgbClr val="4472C4"/>
       </a:accent1>
       <a:accent2>
-        <a:srgbClr val="ed7d31"/>
+        <a:srgbClr val="ED7D31"/>
       </a:accent2>
       <a:accent3>
-        <a:srgbClr val="a5a5a5"/>
+        <a:srgbClr val="A5A5A5"/>
       </a:accent3>
       <a:accent4>
-        <a:srgbClr val="ffc000"/>
+        <a:srgbClr val="FFC000"/>
       </a:accent4>
       <a:accent5>
-        <a:srgbClr val="5b9bd5"/>
+        <a:srgbClr val="5B9BD5"/>
       </a:accent5>
       <a:accent6>
-        <a:srgbClr val="70ad47"/>
+        <a:srgbClr val="70AD47"/>
       </a:accent6>
       <a:hlink>
-        <a:srgbClr val="0563c1"/>
+        <a:srgbClr val="0563C1"/>
       </a:hlink>
       <a:folHlink>
-        <a:srgbClr val="954f72"/>
+        <a:srgbClr val="954F72"/>
       </a:folHlink>
     </a:clrScheme>
     <a:fontScheme name="Office">
       <a:majorFont>
-        <a:latin typeface="Calibri Light" panose="020F0302020204030204" pitchFamily="0" charset="1"/>
+        <a:latin typeface="Calibri Light" panose="020F0302020204030204"/>
         <a:ea typeface=""/>
         <a:cs typeface=""/>
       </a:majorFont>
       <a:minorFont>
-        <a:latin typeface="Calibri" panose="020F0502020204030204" pitchFamily="0" charset="1"/>
+        <a:latin typeface="Calibri" panose="020F0502020204030204"/>
         <a:ea typeface=""/>
         <a:cs typeface=""/>
       </a:minorFont>
@@ -2336,7 +1968,7 @@
             </a:gs>
           </a:gsLst>
           <a:lin ang="5400000" scaled="0"/>
-          <a:tileRect l="0" t="0" r="0" b="0"/>
+          <a:tileRect/>
         </a:gradFill>
         <a:gradFill>
           <a:gsLst>
@@ -2360,7 +1992,7 @@
             </a:gs>
           </a:gsLst>
           <a:lin ang="5400000" scaled="0"/>
-          <a:tileRect l="0" t="0" r="0" b="0"/>
+          <a:tileRect/>
         </a:gradFill>
       </a:fillStyleLst>
       <a:lnStyleLst>
@@ -2420,10 +2052,12 @@
             </a:gs>
           </a:gsLst>
           <a:lin ang="5400000" scaled="0"/>
-          <a:tileRect l="0" t="0" r="0" b="0"/>
+          <a:tileRect/>
         </a:gradFill>
       </a:bgFillStyleLst>
     </a:fmtScheme>
   </a:themeElements>
+  <a:objectDefaults/>
+  <a:extraClrSchemeLst/>
 </a:theme>
 </file>
</xml_diff>

<commit_message>
feat: formatando data de duração
</commit_message>
<xml_diff>
--- a/backend/storage/app/base_documents/guarulhos/relatorioFct.docx
+++ b/backend/storage/app/base_documents/guarulhos/relatorioFct.docx
@@ -1,23 +1,27 @@
 
 <file path=word/document.xml><?xml version="1.0" encoding="utf-8"?>
-<w:document xmlns:wpc="http://schemas.microsoft.com/office/word/2010/wordprocessingCanvas" xmlns:cx="http://schemas.microsoft.com/office/drawing/2014/chartex" xmlns:cx1="http://schemas.microsoft.com/office/drawing/2015/9/8/chartex" xmlns:cx2="http://schemas.microsoft.com/office/drawing/2015/10/21/chartex" xmlns:cx3="http://schemas.microsoft.com/office/drawing/2016/5/9/chartex" xmlns:cx4="http://schemas.microsoft.com/office/drawing/2016/5/10/chartex" xmlns:cx5="http://schemas.microsoft.com/office/drawing/2016/5/11/chartex" xmlns:cx6="http://schemas.microsoft.com/office/drawing/2016/5/12/chartex" xmlns:cx7="http://schemas.microsoft.com/office/drawing/2016/5/13/chartex" xmlns:cx8="http://schemas.microsoft.com/office/drawing/2016/5/14/chartex" xmlns:mc="http://schemas.openxmlformats.org/markup-compatibility/2006" xmlns:aink="http://schemas.microsoft.com/office/drawing/2016/ink" xmlns:am3d="http://schemas.microsoft.com/office/drawing/2017/model3d" xmlns:o="urn:schemas-microsoft-com:office:office" xmlns:oel="http://schemas.microsoft.com/office/2019/extlst" xmlns:r="http://schemas.openxmlformats.org/officeDocument/2006/relationships" xmlns:m="http://schemas.openxmlformats.org/officeDocument/2006/math" xmlns:v="urn:schemas-microsoft-com:vml" xmlns:wp14="http://schemas.microsoft.com/office/word/2010/wordprocessingDrawing" xmlns:wp="http://schemas.openxmlformats.org/drawingml/2006/wordprocessingDrawing" xmlns:w10="urn:schemas-microsoft-com:office:word" xmlns:w="http://schemas.openxmlformats.org/wordprocessingml/2006/main" xmlns:w14="http://schemas.microsoft.com/office/word/2010/wordml" xmlns:w15="http://schemas.microsoft.com/office/word/2012/wordml" xmlns:w16cex="http://schemas.microsoft.com/office/word/2018/wordml/cex" xmlns:w16cid="http://schemas.microsoft.com/office/word/2016/wordml/cid" xmlns:w16="http://schemas.microsoft.com/office/word/2018/wordml" xmlns:w16du="http://schemas.microsoft.com/office/word/2023/wordml/word16du" xmlns:w16sdtdh="http://schemas.microsoft.com/office/word/2020/wordml/sdtdatahash" xmlns:w16sdtfl="http://schemas.microsoft.com/office/word/2024/wordml/sdtformatlock" xmlns:w16se="http://schemas.microsoft.com/office/word/2015/wordml/symex" xmlns:wpg="http://schemas.microsoft.com/office/word/2010/wordprocessingGroup" xmlns:wpi="http://schemas.microsoft.com/office/word/2010/wordprocessingInk" xmlns:wne="http://schemas.microsoft.com/office/word/2006/wordml" xmlns:wps="http://schemas.microsoft.com/office/word/2010/wordprocessingShape" mc:Ignorable="w14 w15 w16se w16cid w16 w16cex w16sdtdh w16sdtfl w16du wp14">
+<w:document xmlns:o="urn:schemas-microsoft-com:office:office" xmlns:r="http://schemas.openxmlformats.org/officeDocument/2006/relationships" xmlns:v="urn:schemas-microsoft-com:vml" xmlns:w="http://schemas.openxmlformats.org/wordprocessingml/2006/main" xmlns:w10="urn:schemas-microsoft-com:office:word" xmlns:wp="http://schemas.openxmlformats.org/drawingml/2006/wordprocessingDrawing" xmlns:pic="http://schemas.openxmlformats.org/drawingml/2006/picture" xmlns:wps="http://schemas.microsoft.com/office/word/2010/wordprocessingShape" xmlns:wpg="http://schemas.microsoft.com/office/word/2010/wordprocessingGroup" xmlns:mc="http://schemas.openxmlformats.org/markup-compatibility/2006" xmlns:wp14="http://schemas.microsoft.com/office/word/2010/wordprocessingDrawing" xmlns:w14="http://schemas.microsoft.com/office/word/2010/wordml" xmlns:w15="http://schemas.microsoft.com/office/word/2012/wordml" mc:Ignorable="w14 wp14 w15">
   <w:body>
     <w:tbl>
       <w:tblPr>
         <w:tblW w:w="4347" w:type="dxa"/>
+        <w:jc w:val="left"/>
+        <w:tblInd w:w="0" w:type="dxa"/>
         <w:tblLayout w:type="fixed"/>
         <w:tblCellMar>
+          <w:top w:w="0" w:type="dxa"/>
           <w:left w:w="10" w:type="dxa"/>
+          <w:bottom w:w="0" w:type="dxa"/>
           <w:right w:w="10" w:type="dxa"/>
         </w:tblCellMar>
-        <w:tblLook w:val="04A0" w:firstRow="1" w:lastRow="0" w:firstColumn="1" w:lastColumn="0" w:noHBand="0" w:noVBand="1"/>
+        <w:tblLook w:val="04a0" w:noHBand="0" w:noVBand="1" w:firstColumn="1" w:lastRow="0" w:lastColumn="0" w:firstRow="1"/>
       </w:tblPr>
       <w:tblGrid>
         <w:gridCol w:w="4347"/>
       </w:tblGrid>
       <w:tr>
         <w:trPr>
-          <w:trHeight w:val="786"/>
+          <w:trHeight w:val="786" w:hRule="atLeast"/>
         </w:trPr>
         <w:tc>
           <w:tcPr>
@@ -28,17 +32,25 @@
               <w:bottom w:val="single" w:sz="4" w:space="0" w:color="000000"/>
               <w:right w:val="single" w:sz="4" w:space="0" w:color="000000"/>
             </w:tcBorders>
-            <w:shd w:val="clear" w:color="auto" w:fill="F2F2F2"/>
-          </w:tcPr>
-          <w:p>
-            <w:pPr>
-              <w:rPr>
-                <w:lang w:val="pt-PT"/>
-              </w:rPr>
-            </w:pPr>
-          </w:p>
-          <w:p>
-            <w:pPr>
+            <w:shd w:color="auto" w:fill="F2F2F2" w:val="clear"/>
+          </w:tcPr>
+          <w:p>
+            <w:pPr>
+              <w:pStyle w:val="Normal"/>
+              <w:rPr>
+                <w:lang w:val="pt-PT"/>
+              </w:rPr>
+            </w:pPr>
+            <w:r>
+              <w:rPr>
+                <w:lang w:val="pt-PT"/>
+              </w:rPr>
+            </w:r>
+          </w:p>
+          <w:p>
+            <w:pPr>
+              <w:pStyle w:val="Normal"/>
+              <w:spacing w:before="0" w:after="160"/>
               <w:rPr>
                 <w:lang w:val="pt-PT"/>
               </w:rPr>
@@ -57,33 +69,43 @@
     </w:tbl>
     <w:p>
       <w:pPr>
+        <w:pStyle w:val="Normal"/>
         <w:rPr>
           <w:lang w:val="pt-PT"/>
         </w:rPr>
       </w:pPr>
+      <w:r>
+        <w:rPr>
+          <w:lang w:val="pt-PT"/>
+        </w:rPr>
+      </w:r>
     </w:p>
     <w:tbl>
       <w:tblPr>
         <w:tblW w:w="8494" w:type="dxa"/>
+        <w:jc w:val="left"/>
+        <w:tblInd w:w="0" w:type="dxa"/>
         <w:tblLayout w:type="fixed"/>
         <w:tblCellMar>
+          <w:top w:w="0" w:type="dxa"/>
           <w:left w:w="10" w:type="dxa"/>
+          <w:bottom w:w="0" w:type="dxa"/>
           <w:right w:w="10" w:type="dxa"/>
         </w:tblCellMar>
-        <w:tblLook w:val="04A0" w:firstRow="1" w:lastRow="0" w:firstColumn="1" w:lastColumn="0" w:noHBand="0" w:noVBand="1"/>
+        <w:tblLook w:val="04a0" w:noHBand="0" w:noVBand="1" w:firstColumn="1" w:lastRow="0" w:lastColumn="0" w:firstRow="1"/>
       </w:tblPr>
       <w:tblGrid>
-        <w:gridCol w:w="2157"/>
+        <w:gridCol w:w="2156"/>
         <w:gridCol w:w="574"/>
         <w:gridCol w:w="1049"/>
-        <w:gridCol w:w="1279"/>
-        <w:gridCol w:w="593"/>
+        <w:gridCol w:w="1280"/>
+        <w:gridCol w:w="592"/>
         <w:gridCol w:w="592"/>
         <w:gridCol w:w="2250"/>
       </w:tblGrid>
       <w:tr>
         <w:trPr>
-          <w:trHeight w:val="419"/>
+          <w:trHeight w:val="419" w:hRule="atLeast"/>
         </w:trPr>
         <w:tc>
           <w:tcPr>
@@ -95,11 +117,13 @@
               <w:bottom w:val="single" w:sz="4" w:space="0" w:color="000000"/>
               <w:right w:val="single" w:sz="4" w:space="0" w:color="000000"/>
             </w:tcBorders>
-            <w:shd w:val="clear" w:color="auto" w:fill="F2F2F2"/>
-            <w:vAlign w:val="center"/>
-          </w:tcPr>
-          <w:p>
-            <w:pPr>
+            <w:shd w:color="auto" w:fill="F2F2F2" w:val="clear"/>
+            <w:vAlign w:val="center"/>
+          </w:tcPr>
+          <w:p>
+            <w:pPr>
+              <w:pStyle w:val="Normal"/>
+              <w:spacing w:before="0" w:after="160"/>
               <w:rPr>
                 <w:lang w:val="pt-PT"/>
               </w:rPr>
@@ -117,7 +141,7 @@
       </w:tr>
       <w:tr>
         <w:trPr>
-          <w:trHeight w:val="694"/>
+          <w:trHeight w:val="694" w:hRule="atLeast"/>
         </w:trPr>
         <w:tc>
           <w:tcPr>
@@ -131,6 +155,15 @@
             <w:vAlign w:val="center"/>
           </w:tcPr>
           <w:p>
+            <w:pPr>
+              <w:pStyle w:val="Normal"/>
+              <w:widowControl/>
+              <w:suppressAutoHyphens w:val="true"/>
+              <w:bidi w:val="0"/>
+              <w:spacing w:lineRule="auto" w:line="259" w:before="0" w:after="160"/>
+              <w:jc w:val="left"/>
+              <w:rPr/>
+            </w:pPr>
             <w:r>
               <w:rPr>
                 <w:b/>
@@ -154,6 +187,7 @@
           </w:tcPr>
           <w:p>
             <w:pPr>
+              <w:pStyle w:val="Normal"/>
               <w:rPr>
                 <w:lang w:val="pt-PT"/>
               </w:rPr>
@@ -176,6 +210,7 @@
           </w:p>
           <w:p>
             <w:pPr>
+              <w:pStyle w:val="Normal"/>
               <w:rPr>
                 <w:lang w:val="pt-PT"/>
               </w:rPr>
@@ -198,6 +233,8 @@
           </w:p>
           <w:p>
             <w:pPr>
+              <w:pStyle w:val="Normal"/>
+              <w:spacing w:before="0" w:after="160"/>
               <w:rPr>
                 <w:lang w:val="pt-PT"/>
               </w:rPr>
@@ -222,7 +259,7 @@
       </w:tr>
       <w:tr>
         <w:trPr>
-          <w:trHeight w:val="402"/>
+          <w:trHeight w:val="402" w:hRule="atLeast"/>
         </w:trPr>
         <w:tc>
           <w:tcPr>
@@ -236,6 +273,15 @@
             <w:vAlign w:val="center"/>
           </w:tcPr>
           <w:p>
+            <w:pPr>
+              <w:pStyle w:val="Normal"/>
+              <w:widowControl/>
+              <w:suppressAutoHyphens w:val="true"/>
+              <w:bidi w:val="0"/>
+              <w:spacing w:lineRule="auto" w:line="259" w:before="0" w:after="160"/>
+              <w:jc w:val="left"/>
+              <w:rPr/>
+            </w:pPr>
             <w:r>
               <w:rPr>
                 <w:b/>
@@ -258,6 +304,10 @@
             <w:vAlign w:val="center"/>
           </w:tcPr>
           <w:p>
+            <w:pPr>
+              <w:pStyle w:val="Normal"/>
+              <w:rPr/>
+            </w:pPr>
             <w:r>
               <w:rPr>
                 <w:b/>
@@ -273,6 +323,15 @@
             </w:r>
           </w:p>
           <w:p>
+            <w:pPr>
+              <w:pStyle w:val="Normal"/>
+              <w:widowControl/>
+              <w:suppressAutoHyphens w:val="true"/>
+              <w:bidi w:val="0"/>
+              <w:spacing w:lineRule="auto" w:line="259" w:before="0" w:after="160"/>
+              <w:jc w:val="left"/>
+              <w:rPr/>
+            </w:pPr>
             <w:r>
               <w:rPr>
                 <w:b/>
@@ -291,7 +350,7 @@
       </w:tr>
       <w:tr>
         <w:trPr>
-          <w:trHeight w:val="551"/>
+          <w:trHeight w:val="551" w:hRule="atLeast"/>
         </w:trPr>
         <w:tc>
           <w:tcPr>
@@ -305,6 +364,15 @@
             <w:vAlign w:val="center"/>
           </w:tcPr>
           <w:p>
+            <w:pPr>
+              <w:pStyle w:val="Normal"/>
+              <w:widowControl/>
+              <w:suppressAutoHyphens w:val="true"/>
+              <w:bidi w:val="0"/>
+              <w:spacing w:lineRule="auto" w:line="259" w:before="0" w:after="160"/>
+              <w:jc w:val="left"/>
+              <w:rPr/>
+            </w:pPr>
             <w:r>
               <w:rPr>
                 <w:b/>
@@ -327,6 +395,7 @@
           </w:tcPr>
           <w:p>
             <w:pPr>
+              <w:pStyle w:val="Normal"/>
               <w:rPr>
                 <w:lang w:val="pt-PT"/>
               </w:rPr>
@@ -342,6 +411,7 @@
           </w:p>
           <w:p>
             <w:pPr>
+              <w:pStyle w:val="Normal"/>
               <w:rPr>
                 <w:lang w:val="pt-PT"/>
               </w:rPr>
@@ -363,6 +433,8 @@
           </w:p>
           <w:p>
             <w:pPr>
+              <w:pStyle w:val="Normal"/>
+              <w:spacing w:before="0" w:after="160"/>
               <w:rPr>
                 <w:lang w:val="pt-PT"/>
               </w:rPr>
@@ -379,14 +451,14 @@
               <w:rPr>
                 <w:lang w:val="pt-PT"/>
               </w:rPr>
-              <w:t>${monthsDuration} meses</w:t>
+              <w:t>${monthsDuration}</w:t>
             </w:r>
           </w:p>
         </w:tc>
       </w:tr>
       <w:tr>
         <w:trPr>
-          <w:trHeight w:val="301"/>
+          <w:trHeight w:val="301" w:hRule="atLeast"/>
         </w:trPr>
         <w:tc>
           <w:tcPr>
@@ -401,7 +473,17 @@
             <w:vAlign w:val="center"/>
           </w:tcPr>
           <w:p>
-            <w:r>
+            <w:pPr>
+              <w:pStyle w:val="Normal"/>
+              <w:widowControl/>
+              <w:suppressAutoHyphens w:val="true"/>
+              <w:bidi w:val="0"/>
+              <w:spacing w:lineRule="auto" w:line="259" w:before="0" w:after="160"/>
+              <w:jc w:val="left"/>
+              <w:rPr/>
+            </w:pPr>
+            <w:r>
+              <w:rPr/>
               <w:t>REGISTO DE PRESENÇAS</w:t>
             </w:r>
           </w:p>
@@ -419,7 +501,17 @@
             <w:vAlign w:val="center"/>
           </w:tcPr>
           <w:p>
-            <w:r>
+            <w:pPr>
+              <w:pStyle w:val="Normal"/>
+              <w:widowControl/>
+              <w:suppressAutoHyphens w:val="true"/>
+              <w:bidi w:val="0"/>
+              <w:spacing w:lineRule="auto" w:line="259" w:before="0" w:after="160"/>
+              <w:jc w:val="left"/>
+              <w:rPr/>
+            </w:pPr>
+            <w:r>
+              <w:rPr/>
               <w:t>Dias</w:t>
             </w:r>
           </w:p>
@@ -437,12 +529,27 @@
             <w:vAlign w:val="center"/>
           </w:tcPr>
           <w:p>
-            <w:r>
+            <w:pPr>
+              <w:pStyle w:val="Normal"/>
+              <w:rPr/>
+            </w:pPr>
+            <w:r>
+              <w:rPr/>
               <w:t>Presenças</w:t>
             </w:r>
           </w:p>
           <w:p>
-            <w:r>
+            <w:pPr>
+              <w:pStyle w:val="Normal"/>
+              <w:widowControl/>
+              <w:suppressAutoHyphens w:val="true"/>
+              <w:bidi w:val="0"/>
+              <w:spacing w:lineRule="auto" w:line="259" w:before="0" w:after="160"/>
+              <w:jc w:val="left"/>
+              <w:rPr/>
+            </w:pPr>
+            <w:r>
+              <w:rPr/>
               <w:t>(Horas)</w:t>
             </w:r>
           </w:p>
@@ -460,11 +567,18 @@
             <w:vAlign w:val="center"/>
           </w:tcPr>
           <w:p>
-            <w:r>
+            <w:pPr>
+              <w:pStyle w:val="Normal"/>
+              <w:widowControl/>
+              <w:suppressAutoHyphens w:val="true"/>
+              <w:bidi w:val="0"/>
+              <w:spacing w:lineRule="auto" w:line="259" w:before="0" w:after="160"/>
+              <w:jc w:val="left"/>
+              <w:rPr/>
+            </w:pPr>
+            <w:r>
+              <w:rPr/>
               <w:t>Atividades</w:t>
-            </w:r>
-            <w:r>
-              <w:t xml:space="preserve"> </w:t>
             </w:r>
           </w:p>
         </w:tc>
@@ -481,7 +595,17 @@
             <w:vAlign w:val="center"/>
           </w:tcPr>
           <w:p>
-            <w:r>
+            <w:pPr>
+              <w:pStyle w:val="Normal"/>
+              <w:widowControl/>
+              <w:suppressAutoHyphens w:val="true"/>
+              <w:bidi w:val="0"/>
+              <w:spacing w:lineRule="auto" w:line="259" w:before="0" w:after="160"/>
+              <w:jc w:val="left"/>
+              <w:rPr/>
+            </w:pPr>
+            <w:r>
+              <w:rPr/>
               <w:t>Observações</w:t>
             </w:r>
           </w:p>
@@ -489,12 +613,12 @@
       </w:tr>
       <w:tr>
         <w:trPr>
-          <w:trHeight w:val="345"/>
+          <w:trHeight w:val="345" w:hRule="atLeast"/>
         </w:trPr>
         <w:tc>
           <w:tcPr>
             <w:tcW w:w="2156" w:type="dxa"/>
-            <w:vMerge/>
+            <w:vMerge w:val="continue"/>
             <w:tcBorders>
               <w:top w:val="single" w:sz="4" w:space="0" w:color="000000"/>
               <w:left w:val="single" w:sz="4" w:space="0" w:color="000000"/>
@@ -509,12 +633,21 @@
             </w:tcMar>
             <w:vAlign w:val="center"/>
           </w:tcPr>
-          <w:p/>
+          <w:p>
+            <w:pPr>
+              <w:pStyle w:val="Normal"/>
+              <w:spacing w:before="0" w:after="160"/>
+              <w:rPr/>
+            </w:pPr>
+            <w:r>
+              <w:rPr/>
+            </w:r>
+          </w:p>
         </w:tc>
         <w:tc>
           <w:tcPr>
             <w:tcW w:w="574" w:type="dxa"/>
-            <w:vMerge/>
+            <w:vMerge w:val="continue"/>
             <w:tcBorders>
               <w:top w:val="single" w:sz="4" w:space="0" w:color="000000"/>
               <w:left w:val="single" w:sz="4" w:space="0" w:color="000000"/>
@@ -529,12 +662,21 @@
             </w:tcMar>
             <w:vAlign w:val="center"/>
           </w:tcPr>
-          <w:p/>
+          <w:p>
+            <w:pPr>
+              <w:pStyle w:val="Normal"/>
+              <w:spacing w:before="0" w:after="160"/>
+              <w:rPr/>
+            </w:pPr>
+            <w:r>
+              <w:rPr/>
+            </w:r>
+          </w:p>
         </w:tc>
         <w:tc>
           <w:tcPr>
             <w:tcW w:w="1049" w:type="dxa"/>
-            <w:vMerge/>
+            <w:vMerge w:val="continue"/>
             <w:tcBorders>
               <w:top w:val="single" w:sz="4" w:space="0" w:color="000000"/>
               <w:left w:val="single" w:sz="4" w:space="0" w:color="000000"/>
@@ -549,11 +691,20 @@
             </w:tcMar>
             <w:vAlign w:val="center"/>
           </w:tcPr>
-          <w:p/>
-        </w:tc>
-        <w:tc>
-          <w:tcPr>
-            <w:tcW w:w="1279" w:type="dxa"/>
+          <w:p>
+            <w:pPr>
+              <w:pStyle w:val="Normal"/>
+              <w:spacing w:before="0" w:after="160"/>
+              <w:rPr/>
+            </w:pPr>
+            <w:r>
+              <w:rPr/>
+            </w:r>
+          </w:p>
+        </w:tc>
+        <w:tc>
+          <w:tcPr>
+            <w:tcW w:w="1280" w:type="dxa"/>
             <w:tcBorders>
               <w:top w:val="single" w:sz="4" w:space="0" w:color="000000"/>
               <w:left w:val="single" w:sz="4" w:space="0" w:color="000000"/>
@@ -563,14 +714,24 @@
             <w:vAlign w:val="center"/>
           </w:tcPr>
           <w:p>
-            <w:r>
+            <w:pPr>
+              <w:pStyle w:val="Normal"/>
+              <w:widowControl/>
+              <w:suppressAutoHyphens w:val="true"/>
+              <w:bidi w:val="0"/>
+              <w:spacing w:lineRule="auto" w:line="259" w:before="0" w:after="160"/>
+              <w:jc w:val="left"/>
+              <w:rPr/>
+            </w:pPr>
+            <w:r>
+              <w:rPr/>
               <w:t>Título da Atividade</w:t>
             </w:r>
           </w:p>
         </w:tc>
         <w:tc>
           <w:tcPr>
-            <w:tcW w:w="1185" w:type="dxa"/>
+            <w:tcW w:w="1184" w:type="dxa"/>
             <w:gridSpan w:val="2"/>
             <w:tcBorders>
               <w:top w:val="single" w:sz="4" w:space="0" w:color="000000"/>
@@ -581,7 +742,17 @@
             <w:vAlign w:val="center"/>
           </w:tcPr>
           <w:p>
-            <w:r>
+            <w:pPr>
+              <w:pStyle w:val="Normal"/>
+              <w:widowControl/>
+              <w:suppressAutoHyphens w:val="true"/>
+              <w:bidi w:val="0"/>
+              <w:spacing w:lineRule="auto" w:line="259" w:before="0" w:after="160"/>
+              <w:jc w:val="left"/>
+              <w:rPr/>
+            </w:pPr>
+            <w:r>
+              <w:rPr/>
               <w:t>Anotações</w:t>
             </w:r>
           </w:p>
@@ -589,7 +760,7 @@
         <w:tc>
           <w:tcPr>
             <w:tcW w:w="2250" w:type="dxa"/>
-            <w:vMerge/>
+            <w:vMerge w:val="continue"/>
             <w:tcBorders>
               <w:top w:val="single" w:sz="4" w:space="0" w:color="000000"/>
               <w:left w:val="single" w:sz="4" w:space="0" w:color="000000"/>
@@ -604,17 +775,26 @@
             </w:tcMar>
             <w:vAlign w:val="center"/>
           </w:tcPr>
-          <w:p/>
+          <w:p>
+            <w:pPr>
+              <w:pStyle w:val="Normal"/>
+              <w:spacing w:before="0" w:after="160"/>
+              <w:rPr/>
+            </w:pPr>
+            <w:r>
+              <w:rPr/>
+            </w:r>
+          </w:p>
         </w:tc>
       </w:tr>
       <w:tr>
         <w:trPr>
-          <w:trHeight w:val="340"/>
+          <w:trHeight w:val="340" w:hRule="atLeast"/>
         </w:trPr>
         <w:tc>
           <w:tcPr>
             <w:tcW w:w="2156" w:type="dxa"/>
-            <w:vMerge/>
+            <w:vMerge w:val="continue"/>
             <w:tcBorders>
               <w:top w:val="single" w:sz="4" w:space="0" w:color="000000"/>
               <w:left w:val="single" w:sz="4" w:space="0" w:color="000000"/>
@@ -629,7 +809,16 @@
             </w:tcMar>
             <w:vAlign w:val="center"/>
           </w:tcPr>
-          <w:p/>
+          <w:p>
+            <w:pPr>
+              <w:pStyle w:val="Normal"/>
+              <w:spacing w:before="0" w:after="160"/>
+              <w:rPr/>
+            </w:pPr>
+            <w:r>
+              <w:rPr/>
+            </w:r>
+          </w:p>
         </w:tc>
         <w:tc>
           <w:tcPr>
@@ -643,7 +832,17 @@
             <w:vAlign w:val="center"/>
           </w:tcPr>
           <w:p>
-            <w:r>
+            <w:pPr>
+              <w:pStyle w:val="Normal"/>
+              <w:widowControl/>
+              <w:suppressAutoHyphens w:val="true"/>
+              <w:bidi w:val="0"/>
+              <w:spacing w:lineRule="auto" w:line="259" w:before="0" w:after="160"/>
+              <w:jc w:val="left"/>
+              <w:rPr/>
+            </w:pPr>
+            <w:r>
+              <w:rPr/>
               <w:t>${date}</w:t>
             </w:r>
           </w:p>
@@ -660,14 +859,24 @@
             <w:vAlign w:val="center"/>
           </w:tcPr>
           <w:p>
-            <w:r>
+            <w:pPr>
+              <w:pStyle w:val="Normal"/>
+              <w:widowControl/>
+              <w:suppressAutoHyphens w:val="true"/>
+              <w:bidi w:val="0"/>
+              <w:spacing w:lineRule="auto" w:line="259" w:before="0" w:after="160"/>
+              <w:jc w:val="left"/>
+              <w:rPr/>
+            </w:pPr>
+            <w:r>
+              <w:rPr/>
               <w:t>${hours}</w:t>
             </w:r>
           </w:p>
         </w:tc>
         <w:tc>
           <w:tcPr>
-            <w:tcW w:w="1279" w:type="dxa"/>
+            <w:tcW w:w="1280" w:type="dxa"/>
             <w:tcBorders>
               <w:top w:val="single" w:sz="4" w:space="0" w:color="000000"/>
               <w:left w:val="single" w:sz="4" w:space="0" w:color="000000"/>
@@ -677,20 +886,24 @@
             <w:vAlign w:val="center"/>
           </w:tcPr>
           <w:p>
-            <w:r>
-              <w:t>${</w:t>
-            </w:r>
-            <w:r>
-              <w:t>title</w:t>
-            </w:r>
-            <w:r>
-              <w:t>}</w:t>
-            </w:r>
-          </w:p>
-        </w:tc>
-        <w:tc>
-          <w:tcPr>
-            <w:tcW w:w="1185" w:type="dxa"/>
+            <w:pPr>
+              <w:pStyle w:val="Normal"/>
+              <w:widowControl/>
+              <w:suppressAutoHyphens w:val="true"/>
+              <w:bidi w:val="0"/>
+              <w:spacing w:lineRule="auto" w:line="259" w:before="0" w:after="160"/>
+              <w:jc w:val="left"/>
+              <w:rPr/>
+            </w:pPr>
+            <w:r>
+              <w:rPr/>
+              <w:t>${title}</w:t>
+            </w:r>
+          </w:p>
+        </w:tc>
+        <w:tc>
+          <w:tcPr>
+            <w:tcW w:w="1184" w:type="dxa"/>
             <w:gridSpan w:val="2"/>
             <w:tcBorders>
               <w:top w:val="single" w:sz="4" w:space="0" w:color="000000"/>
@@ -701,14 +914,18 @@
             <w:vAlign w:val="center"/>
           </w:tcPr>
           <w:p>
-            <w:r>
-              <w:t>${</w:t>
-            </w:r>
-            <w:r>
-              <w:t>description</w:t>
-            </w:r>
-            <w:r>
-              <w:t>}</w:t>
+            <w:pPr>
+              <w:pStyle w:val="Normal"/>
+              <w:widowControl/>
+              <w:suppressAutoHyphens w:val="true"/>
+              <w:bidi w:val="0"/>
+              <w:spacing w:lineRule="auto" w:line="259" w:before="0" w:after="160"/>
+              <w:jc w:val="left"/>
+              <w:rPr/>
+            </w:pPr>
+            <w:r>
+              <w:rPr/>
+              <w:t>${description}</w:t>
             </w:r>
           </w:p>
         </w:tc>
@@ -724,7 +941,17 @@
             <w:vAlign w:val="center"/>
           </w:tcPr>
           <w:p>
-            <w:r>
+            <w:pPr>
+              <w:pStyle w:val="Normal"/>
+              <w:widowControl/>
+              <w:suppressAutoHyphens w:val="true"/>
+              <w:bidi w:val="0"/>
+              <w:spacing w:lineRule="auto" w:line="259" w:before="0" w:after="160"/>
+              <w:jc w:val="left"/>
+              <w:rPr/>
+            </w:pPr>
+            <w:r>
+              <w:rPr/>
               <w:t>${justification}</w:t>
             </w:r>
           </w:p>
@@ -732,19 +959,54 @@
       </w:tr>
       <w:tr>
         <w:trPr>
-          <w:trHeight w:val="399"/>
+          <w:trHeight w:val="399" w:hRule="atLeast"/>
         </w:trPr>
         <w:tc>
           <w:tcPr>
             <w:tcW w:w="2730" w:type="dxa"/>
             <w:gridSpan w:val="2"/>
-            <w:vAlign w:val="center"/>
-          </w:tcPr>
-          <w:p/>
-          <w:p/>
-          <w:p/>
-          <w:p>
-            <w:r>
+            <w:tcBorders/>
+            <w:vAlign w:val="center"/>
+          </w:tcPr>
+          <w:p>
+            <w:pPr>
+              <w:pStyle w:val="Normal"/>
+              <w:rPr/>
+            </w:pPr>
+            <w:r>
+              <w:rPr/>
+            </w:r>
+          </w:p>
+          <w:p>
+            <w:pPr>
+              <w:pStyle w:val="Normal"/>
+              <w:rPr/>
+            </w:pPr>
+            <w:r>
+              <w:rPr/>
+            </w:r>
+          </w:p>
+          <w:p>
+            <w:pPr>
+              <w:pStyle w:val="Normal"/>
+              <w:rPr/>
+            </w:pPr>
+            <w:r>
+              <w:rPr/>
+            </w:r>
+          </w:p>
+          <w:p>
+            <w:pPr>
+              <w:pStyle w:val="Normal"/>
+              <w:widowControl/>
+              <w:suppressAutoHyphens w:val="true"/>
+              <w:bidi w:val="0"/>
+              <w:spacing w:lineRule="auto" w:line="259" w:before="0" w:after="160"/>
+              <w:jc w:val="left"/>
+              <w:rPr/>
+            </w:pPr>
+            <w:r>
+              <w:rPr/>
               <w:t>O aluno</w:t>
             </w:r>
           </w:p>
@@ -753,31 +1015,52 @@
           <w:tcPr>
             <w:tcW w:w="2921" w:type="dxa"/>
             <w:gridSpan w:val="3"/>
-            <w:vAlign w:val="center"/>
-          </w:tcPr>
-          <w:p>
-            <w:pPr>
+            <w:tcBorders/>
+            <w:vAlign w:val="center"/>
+          </w:tcPr>
+          <w:p>
+            <w:pPr>
+              <w:pStyle w:val="Normal"/>
               <w:rPr>
                 <w:lang w:val="pt-BR"/>
               </w:rPr>
             </w:pPr>
-          </w:p>
-          <w:p>
-            <w:pPr>
+            <w:r>
               <w:rPr>
                 <w:lang w:val="pt-BR"/>
               </w:rPr>
-            </w:pPr>
-          </w:p>
-          <w:p>
-            <w:pPr>
+            </w:r>
+          </w:p>
+          <w:p>
+            <w:pPr>
+              <w:pStyle w:val="Normal"/>
               <w:rPr>
                 <w:lang w:val="pt-BR"/>
               </w:rPr>
             </w:pPr>
-          </w:p>
-          <w:p>
-            <w:pPr>
+            <w:r>
+              <w:rPr>
+                <w:lang w:val="pt-BR"/>
+              </w:rPr>
+            </w:r>
+          </w:p>
+          <w:p>
+            <w:pPr>
+              <w:pStyle w:val="Normal"/>
+              <w:rPr>
+                <w:lang w:val="pt-BR"/>
+              </w:rPr>
+            </w:pPr>
+            <w:r>
+              <w:rPr>
+                <w:lang w:val="pt-BR"/>
+              </w:rPr>
+            </w:r>
+          </w:p>
+          <w:p>
+            <w:pPr>
+              <w:pStyle w:val="Normal"/>
+              <w:spacing w:before="0" w:after="160"/>
               <w:rPr>
                 <w:lang w:val="pt-PT"/>
               </w:rPr>
@@ -794,31 +1077,60 @@
           <w:tcPr>
             <w:tcW w:w="2842" w:type="dxa"/>
             <w:gridSpan w:val="2"/>
-            <w:vAlign w:val="center"/>
-          </w:tcPr>
-          <w:p>
-            <w:pPr>
-              <w:rPr>
-                <w:lang w:val="pt-PT"/>
-              </w:rPr>
-            </w:pPr>
-          </w:p>
-          <w:p>
-            <w:pPr>
-              <w:rPr>
-                <w:lang w:val="pt-PT"/>
-              </w:rPr>
-            </w:pPr>
-          </w:p>
-          <w:p>
-            <w:pPr>
-              <w:rPr>
-                <w:lang w:val="pt-PT"/>
-              </w:rPr>
-            </w:pPr>
-          </w:p>
-          <w:p>
-            <w:r>
+            <w:tcBorders/>
+            <w:vAlign w:val="center"/>
+          </w:tcPr>
+          <w:p>
+            <w:pPr>
+              <w:pStyle w:val="Normal"/>
+              <w:rPr>
+                <w:lang w:val="pt-PT"/>
+              </w:rPr>
+            </w:pPr>
+            <w:r>
+              <w:rPr>
+                <w:lang w:val="pt-PT"/>
+              </w:rPr>
+            </w:r>
+          </w:p>
+          <w:p>
+            <w:pPr>
+              <w:pStyle w:val="Normal"/>
+              <w:rPr>
+                <w:lang w:val="pt-PT"/>
+              </w:rPr>
+            </w:pPr>
+            <w:r>
+              <w:rPr>
+                <w:lang w:val="pt-PT"/>
+              </w:rPr>
+            </w:r>
+          </w:p>
+          <w:p>
+            <w:pPr>
+              <w:pStyle w:val="Normal"/>
+              <w:rPr>
+                <w:lang w:val="pt-PT"/>
+              </w:rPr>
+            </w:pPr>
+            <w:r>
+              <w:rPr>
+                <w:lang w:val="pt-PT"/>
+              </w:rPr>
+            </w:r>
+          </w:p>
+          <w:p>
+            <w:pPr>
+              <w:pStyle w:val="Normal"/>
+              <w:widowControl/>
+              <w:suppressAutoHyphens w:val="true"/>
+              <w:bidi w:val="0"/>
+              <w:spacing w:lineRule="auto" w:line="259" w:before="0" w:after="160"/>
+              <w:jc w:val="left"/>
+              <w:rPr/>
+            </w:pPr>
+            <w:r>
+              <w:rPr/>
               <w:t>A Empresa</w:t>
             </w:r>
           </w:p>
@@ -826,16 +1138,27 @@
       </w:tr>
       <w:tr>
         <w:trPr>
-          <w:trHeight w:val="399"/>
+          <w:trHeight w:val="399" w:hRule="atLeast"/>
         </w:trPr>
         <w:tc>
           <w:tcPr>
             <w:tcW w:w="2730" w:type="dxa"/>
             <w:gridSpan w:val="2"/>
-            <w:vAlign w:val="center"/>
-          </w:tcPr>
-          <w:p>
-            <w:r>
+            <w:tcBorders/>
+            <w:vAlign w:val="center"/>
+          </w:tcPr>
+          <w:p>
+            <w:pPr>
+              <w:pStyle w:val="Normal"/>
+              <w:widowControl/>
+              <w:suppressAutoHyphens w:val="true"/>
+              <w:bidi w:val="0"/>
+              <w:spacing w:lineRule="auto" w:line="259" w:before="0" w:after="160"/>
+              <w:jc w:val="left"/>
+              <w:rPr/>
+            </w:pPr>
+            <w:r>
+              <w:rPr/>
               <w:t>_______________________</w:t>
             </w:r>
           </w:p>
@@ -844,10 +1167,21 @@
           <w:tcPr>
             <w:tcW w:w="2921" w:type="dxa"/>
             <w:gridSpan w:val="3"/>
-            <w:vAlign w:val="center"/>
-          </w:tcPr>
-          <w:p>
-            <w:r>
+            <w:tcBorders/>
+            <w:vAlign w:val="center"/>
+          </w:tcPr>
+          <w:p>
+            <w:pPr>
+              <w:pStyle w:val="Normal"/>
+              <w:widowControl/>
+              <w:suppressAutoHyphens w:val="true"/>
+              <w:bidi w:val="0"/>
+              <w:spacing w:lineRule="auto" w:line="259" w:before="0" w:after="160"/>
+              <w:jc w:val="left"/>
+              <w:rPr/>
+            </w:pPr>
+            <w:r>
+              <w:rPr/>
               <w:t>__________________________</w:t>
             </w:r>
           </w:p>
@@ -856,10 +1190,21 @@
           <w:tcPr>
             <w:tcW w:w="2842" w:type="dxa"/>
             <w:gridSpan w:val="2"/>
-            <w:vAlign w:val="center"/>
-          </w:tcPr>
-          <w:p>
-            <w:r>
+            <w:tcBorders/>
+            <w:vAlign w:val="center"/>
+          </w:tcPr>
+          <w:p>
+            <w:pPr>
+              <w:pStyle w:val="Normal"/>
+              <w:widowControl/>
+              <w:suppressAutoHyphens w:val="true"/>
+              <w:bidi w:val="0"/>
+              <w:spacing w:lineRule="auto" w:line="259" w:before="0" w:after="160"/>
+              <w:jc w:val="left"/>
+              <w:rPr/>
+            </w:pPr>
+            <w:r>
+              <w:rPr/>
               <w:t>_________________________</w:t>
             </w:r>
           </w:p>
@@ -867,32 +1212,50 @@
       </w:tr>
     </w:tbl>
     <w:p>
+      <w:pPr>
+        <w:pStyle w:val="Normal"/>
+        <w:rPr/>
+      </w:pPr>
       <w:r>
+        <w:rPr/>
         <w:br/>
-      </w:r>
-      <w:r>
         <w:tab/>
         <w:t>Em __/__/____                           Em __/__/____                                Em __/__/____</w:t>
       </w:r>
     </w:p>
-    <w:p/>
+    <w:p>
+      <w:pPr>
+        <w:pStyle w:val="Normal"/>
+        <w:widowControl/>
+        <w:suppressAutoHyphens w:val="true"/>
+        <w:bidi w:val="0"/>
+        <w:spacing w:lineRule="auto" w:line="259" w:before="0" w:after="160"/>
+        <w:jc w:val="left"/>
+        <w:rPr/>
+      </w:pPr>
+      <w:r>
+        <w:rPr/>
+      </w:r>
+    </w:p>
     <w:sectPr>
+      <w:type w:val="nextPage"/>
       <w:pgSz w:w="11906" w:h="16838"/>
-      <w:pgMar w:top="1417" w:right="1701" w:bottom="1417" w:left="1701" w:header="0" w:footer="0" w:gutter="0"/>
-      <w:cols w:space="720"/>
-      <w:formProt w:val="0"/>
-      <w:docGrid w:linePitch="360" w:charSpace="4096"/>
+      <w:pgMar w:left="1701" w:right="1701" w:gutter="0" w:header="0" w:top="1417" w:footer="0" w:bottom="1417"/>
+      <w:pgNumType w:fmt="decimal"/>
+      <w:formProt w:val="false"/>
+      <w:textDirection w:val="lrTb"/>
+      <w:docGrid w:type="default" w:linePitch="360" w:charSpace="4096"/>
     </w:sectPr>
   </w:body>
 </w:document>
 </file>
 
 <file path=word/styles.xml><?xml version="1.0" encoding="utf-8"?>
-<w:styles xmlns:mc="http://schemas.openxmlformats.org/markup-compatibility/2006" xmlns:r="http://schemas.openxmlformats.org/officeDocument/2006/relationships" xmlns:w="http://schemas.openxmlformats.org/wordprocessingml/2006/main" xmlns:w14="http://schemas.microsoft.com/office/word/2010/wordml" xmlns:w15="http://schemas.microsoft.com/office/word/2012/wordml" xmlns:w16cex="http://schemas.microsoft.com/office/word/2018/wordml/cex" xmlns:w16cid="http://schemas.microsoft.com/office/word/2016/wordml/cid" xmlns:w16="http://schemas.microsoft.com/office/word/2018/wordml" xmlns:w16du="http://schemas.microsoft.com/office/word/2023/wordml/word16du" xmlns:w16sdtdh="http://schemas.microsoft.com/office/word/2020/wordml/sdtdatahash" xmlns:w16sdtfl="http://schemas.microsoft.com/office/word/2024/wordml/sdtformatlock" xmlns:w16se="http://schemas.microsoft.com/office/word/2015/wordml/symex" mc:Ignorable="w14 w15 w16se w16cid w16 w16cex w16sdtdh w16sdtfl w16du">
+<w:styles xmlns:w="http://schemas.openxmlformats.org/wordprocessingml/2006/main" xmlns:w14="http://schemas.microsoft.com/office/word/2010/wordml" xmlns:mc="http://schemas.openxmlformats.org/markup-compatibility/2006" mc:Ignorable="w14">
   <w:docDefaults>
     <w:rPrDefault>
       <w:rPr>
-        <w:rFonts w:asciiTheme="minorHAnsi" w:eastAsiaTheme="minorHAnsi" w:hAnsiTheme="minorHAnsi" w:cstheme="minorBidi"/>
+        <w:rFonts w:ascii="Calibri" w:hAnsi="Calibri" w:eastAsia="Calibri" w:cs="" w:asciiTheme="minorHAnsi" w:cstheme="minorBidi" w:eastAsiaTheme="minorHAnsi" w:hAnsiTheme="minorHAnsi"/>
         <w:kern w:val="2"/>
         <w:sz w:val="22"/>
         <w:szCs w:val="22"/>
@@ -902,21 +1265,21 @@
     </w:rPrDefault>
     <w:pPrDefault>
       <w:pPr>
-        <w:suppressAutoHyphens/>
+        <w:suppressAutoHyphens w:val="true"/>
       </w:pPr>
     </w:pPrDefault>
   </w:docDefaults>
   <w:latentStyles w:defLockedState="0" w:defUIPriority="99" w:defSemiHidden="0" w:defUnhideWhenUsed="0" w:defQFormat="0" w:count="376">
     <w:lsdException w:name="Normal" w:uiPriority="0" w:qFormat="1"/>
     <w:lsdException w:name="heading 1" w:uiPriority="9" w:qFormat="1"/>
-    <w:lsdException w:name="heading 2" w:semiHidden="1" w:uiPriority="9" w:unhideWhenUsed="1" w:qFormat="1"/>
-    <w:lsdException w:name="heading 3" w:semiHidden="1" w:uiPriority="9" w:unhideWhenUsed="1" w:qFormat="1"/>
-    <w:lsdException w:name="heading 4" w:semiHidden="1" w:uiPriority="9" w:unhideWhenUsed="1" w:qFormat="1"/>
-    <w:lsdException w:name="heading 5" w:semiHidden="1" w:uiPriority="9" w:unhideWhenUsed="1" w:qFormat="1"/>
-    <w:lsdException w:name="heading 6" w:semiHidden="1" w:uiPriority="9" w:unhideWhenUsed="1" w:qFormat="1"/>
-    <w:lsdException w:name="heading 7" w:semiHidden="1" w:uiPriority="9" w:unhideWhenUsed="1" w:qFormat="1"/>
-    <w:lsdException w:name="heading 8" w:semiHidden="1" w:uiPriority="9" w:unhideWhenUsed="1" w:qFormat="1"/>
-    <w:lsdException w:name="heading 9" w:semiHidden="1" w:uiPriority="9" w:unhideWhenUsed="1" w:qFormat="1"/>
+    <w:lsdException w:name="heading 2" w:uiPriority="9" w:semiHidden="1" w:unhideWhenUsed="1" w:qFormat="1"/>
+    <w:lsdException w:name="heading 3" w:uiPriority="9" w:semiHidden="1" w:unhideWhenUsed="1" w:qFormat="1"/>
+    <w:lsdException w:name="heading 4" w:uiPriority="9" w:semiHidden="1" w:unhideWhenUsed="1" w:qFormat="1"/>
+    <w:lsdException w:name="heading 5" w:uiPriority="9" w:semiHidden="1" w:unhideWhenUsed="1" w:qFormat="1"/>
+    <w:lsdException w:name="heading 6" w:uiPriority="9" w:semiHidden="1" w:unhideWhenUsed="1" w:qFormat="1"/>
+    <w:lsdException w:name="heading 7" w:uiPriority="9" w:semiHidden="1" w:unhideWhenUsed="1" w:qFormat="1"/>
+    <w:lsdException w:name="heading 8" w:uiPriority="9" w:semiHidden="1" w:unhideWhenUsed="1" w:qFormat="1"/>
+    <w:lsdException w:name="heading 9" w:uiPriority="9" w:semiHidden="1" w:unhideWhenUsed="1" w:qFormat="1"/>
     <w:lsdException w:name="index 1" w:semiHidden="1" w:unhideWhenUsed="1"/>
     <w:lsdException w:name="index 2" w:semiHidden="1" w:unhideWhenUsed="1"/>
     <w:lsdException w:name="index 3" w:semiHidden="1" w:unhideWhenUsed="1"/>
@@ -926,22 +1289,22 @@
     <w:lsdException w:name="index 7" w:semiHidden="1" w:unhideWhenUsed="1"/>
     <w:lsdException w:name="index 8" w:semiHidden="1" w:unhideWhenUsed="1"/>
     <w:lsdException w:name="index 9" w:semiHidden="1" w:unhideWhenUsed="1"/>
-    <w:lsdException w:name="toc 1" w:semiHidden="1" w:uiPriority="39" w:unhideWhenUsed="1"/>
-    <w:lsdException w:name="toc 2" w:semiHidden="1" w:uiPriority="39" w:unhideWhenUsed="1"/>
-    <w:lsdException w:name="toc 3" w:semiHidden="1" w:uiPriority="39" w:unhideWhenUsed="1"/>
-    <w:lsdException w:name="toc 4" w:semiHidden="1" w:uiPriority="39" w:unhideWhenUsed="1"/>
-    <w:lsdException w:name="toc 5" w:semiHidden="1" w:uiPriority="39" w:unhideWhenUsed="1"/>
-    <w:lsdException w:name="toc 6" w:semiHidden="1" w:uiPriority="39" w:unhideWhenUsed="1"/>
-    <w:lsdException w:name="toc 7" w:semiHidden="1" w:uiPriority="39" w:unhideWhenUsed="1"/>
-    <w:lsdException w:name="toc 8" w:semiHidden="1" w:uiPriority="39" w:unhideWhenUsed="1"/>
-    <w:lsdException w:name="toc 9" w:semiHidden="1" w:uiPriority="39" w:unhideWhenUsed="1"/>
+    <w:lsdException w:name="toc 1" w:uiPriority="39" w:semiHidden="1" w:unhideWhenUsed="1"/>
+    <w:lsdException w:name="toc 2" w:uiPriority="39" w:semiHidden="1" w:unhideWhenUsed="1"/>
+    <w:lsdException w:name="toc 3" w:uiPriority="39" w:semiHidden="1" w:unhideWhenUsed="1"/>
+    <w:lsdException w:name="toc 4" w:uiPriority="39" w:semiHidden="1" w:unhideWhenUsed="1"/>
+    <w:lsdException w:name="toc 5" w:uiPriority="39" w:semiHidden="1" w:unhideWhenUsed="1"/>
+    <w:lsdException w:name="toc 6" w:uiPriority="39" w:semiHidden="1" w:unhideWhenUsed="1"/>
+    <w:lsdException w:name="toc 7" w:uiPriority="39" w:semiHidden="1" w:unhideWhenUsed="1"/>
+    <w:lsdException w:name="toc 8" w:uiPriority="39" w:semiHidden="1" w:unhideWhenUsed="1"/>
+    <w:lsdException w:name="toc 9" w:uiPriority="39" w:semiHidden="1" w:unhideWhenUsed="1"/>
     <w:lsdException w:name="Normal Indent" w:semiHidden="1" w:unhideWhenUsed="1"/>
     <w:lsdException w:name="footnote text" w:semiHidden="1" w:unhideWhenUsed="1"/>
     <w:lsdException w:name="annotation text" w:semiHidden="1" w:unhideWhenUsed="1"/>
     <w:lsdException w:name="header" w:semiHidden="1" w:unhideWhenUsed="1"/>
     <w:lsdException w:name="footer" w:semiHidden="1" w:unhideWhenUsed="1"/>
     <w:lsdException w:name="index heading" w:semiHidden="1" w:unhideWhenUsed="1"/>
-    <w:lsdException w:name="caption" w:semiHidden="1" w:uiPriority="35" w:unhideWhenUsed="1" w:qFormat="1"/>
+    <w:lsdException w:name="caption" w:uiPriority="35" w:semiHidden="1" w:unhideWhenUsed="1" w:qFormat="1"/>
     <w:lsdException w:name="table of figures" w:semiHidden="1" w:unhideWhenUsed="1"/>
     <w:lsdException w:name="envelope address" w:semiHidden="1" w:unhideWhenUsed="1"/>
     <w:lsdException w:name="envelope return" w:semiHidden="1" w:unhideWhenUsed="1"/>
@@ -972,7 +1335,7 @@
     <w:lsdException w:name="Title" w:uiPriority="10" w:qFormat="1"/>
     <w:lsdException w:name="Closing" w:semiHidden="1" w:unhideWhenUsed="1"/>
     <w:lsdException w:name="Signature" w:semiHidden="1" w:unhideWhenUsed="1"/>
-    <w:lsdException w:name="Default Paragraph Font" w:semiHidden="1" w:uiPriority="1" w:unhideWhenUsed="1"/>
+    <w:lsdException w:name="Default Paragraph Font" w:uiPriority="1" w:semiHidden="1" w:unhideWhenUsed="1"/>
     <w:lsdException w:name="Body Text" w:semiHidden="1" w:unhideWhenUsed="1"/>
     <w:lsdException w:name="Body Text Indent" w:semiHidden="1" w:unhideWhenUsed="1"/>
     <w:lsdException w:name="List Continue" w:semiHidden="1" w:unhideWhenUsed="1"/>
@@ -1172,8 +1535,8 @@
     <w:lsdException w:name="Subtle Reference" w:uiPriority="31" w:qFormat="1"/>
     <w:lsdException w:name="Intense Reference" w:uiPriority="32" w:qFormat="1"/>
     <w:lsdException w:name="Book Title" w:uiPriority="33" w:qFormat="1"/>
-    <w:lsdException w:name="Bibliography" w:semiHidden="1" w:uiPriority="37" w:unhideWhenUsed="1"/>
-    <w:lsdException w:name="TOC Heading" w:semiHidden="1" w:uiPriority="39" w:unhideWhenUsed="1" w:qFormat="1"/>
+    <w:lsdException w:name="Bibliography" w:uiPriority="37" w:semiHidden="1" w:unhideWhenUsed="1"/>
+    <w:lsdException w:name="TOC Heading" w:uiPriority="39" w:semiHidden="1" w:unhideWhenUsed="1" w:qFormat="1"/>
     <w:lsdException w:name="Plain Table 1" w:uiPriority="41"/>
     <w:lsdException w:name="Plain Table 2" w:uiPriority="42"/>
     <w:lsdException w:name="Plain Table 3" w:uiPriority="43"/>
@@ -1284,39 +1647,49 @@
     <w:lsdException w:name="Unresolved Mention" w:semiHidden="1" w:unhideWhenUsed="1"/>
     <w:lsdException w:name="Smart Link" w:semiHidden="1" w:unhideWhenUsed="1"/>
   </w:latentStyles>
-  <w:style w:type="paragraph" w:default="1" w:styleId="Normal">
+  <w:style w:type="paragraph" w:styleId="Normal" w:default="1">
     <w:name w:val="Normal"/>
     <w:qFormat/>
-    <w:rsid w:val="00C07D19"/>
+    <w:rsid w:val="00c07d19"/>
     <w:pPr>
-      <w:spacing w:after="160" w:line="259" w:lineRule="auto"/>
+      <w:widowControl/>
+      <w:suppressAutoHyphens w:val="true"/>
+      <w:bidi w:val="0"/>
+      <w:spacing w:lineRule="auto" w:line="259" w:before="0" w:after="160"/>
+      <w:jc w:val="left"/>
     </w:pPr>
     <w:rPr>
-      <w:lang w:val="en-US"/>
-    </w:rPr>
-  </w:style>
-  <w:style w:type="paragraph" w:styleId="Ttulo1">
+      <w:rFonts w:ascii="Calibri" w:hAnsi="Calibri" w:eastAsia="Calibri" w:cs="" w:asciiTheme="minorHAnsi" w:cstheme="minorBidi" w:eastAsiaTheme="minorHAnsi" w:hAnsiTheme="minorHAnsi"/>
+      <w:color w:val="auto"/>
+      <w:kern w:val="2"/>
+      <w:sz w:val="22"/>
+      <w:szCs w:val="22"/>
+      <w:lang w:val="en-US" w:eastAsia="en-US" w:bidi="ar-SA"/>
+      <w14:ligatures w14:val="standardContextual"/>
+    </w:rPr>
+  </w:style>
+  <w:style w:type="paragraph" w:styleId="Heading1">
     <w:name w:val="heading 1"/>
     <w:basedOn w:val="Normal"/>
     <w:next w:val="Normal"/>
     <w:link w:val="Ttulo1Char"/>
     <w:uiPriority w:val="9"/>
     <w:qFormat/>
-    <w:rsid w:val="00C07D19"/>
+    <w:rsid w:val="00c07d19"/>
     <w:pPr>
-      <w:keepNext/>
+      <w:keepNext w:val="true"/>
       <w:keepLines/>
       <w:spacing w:before="360" w:after="80"/>
       <w:outlineLvl w:val="0"/>
     </w:pPr>
     <w:rPr>
-      <w:rFonts w:asciiTheme="majorHAnsi" w:eastAsiaTheme="majorEastAsia" w:hAnsiTheme="majorHAnsi" w:cstheme="majorBidi"/>
-      <w:color w:val="2F5496" w:themeColor="accent1" w:themeShade="BF"/>
+      <w:rFonts w:ascii="Calibri Light" w:hAnsi="Calibri Light" w:eastAsia="" w:cs="" w:asciiTheme="majorHAnsi" w:cstheme="majorBidi" w:eastAsiaTheme="majorEastAsia" w:hAnsiTheme="majorHAnsi"/>
+      <w:color w:themeColor="accent1" w:themeShade="bf" w:val="2F5496"/>
       <w:sz w:val="40"/>
       <w:szCs w:val="40"/>
     </w:rPr>
   </w:style>
-  <w:style w:type="paragraph" w:styleId="Ttulo2">
+  <w:style w:type="paragraph" w:styleId="Heading2">
     <w:name w:val="heading 2"/>
     <w:basedOn w:val="Normal"/>
     <w:next w:val="Normal"/>
@@ -1325,21 +1698,21 @@
     <w:semiHidden/>
     <w:unhideWhenUsed/>
     <w:qFormat/>
-    <w:rsid w:val="00C07D19"/>
+    <w:rsid w:val="00c07d19"/>
     <w:pPr>
-      <w:keepNext/>
+      <w:keepNext w:val="true"/>
       <w:keepLines/>
       <w:spacing w:before="160" w:after="80"/>
       <w:outlineLvl w:val="1"/>
     </w:pPr>
     <w:rPr>
-      <w:rFonts w:asciiTheme="majorHAnsi" w:eastAsiaTheme="majorEastAsia" w:hAnsiTheme="majorHAnsi" w:cstheme="majorBidi"/>
-      <w:color w:val="2F5496" w:themeColor="accent1" w:themeShade="BF"/>
+      <w:rFonts w:ascii="Calibri Light" w:hAnsi="Calibri Light" w:eastAsia="" w:cs="" w:asciiTheme="majorHAnsi" w:cstheme="majorBidi" w:eastAsiaTheme="majorEastAsia" w:hAnsiTheme="majorHAnsi"/>
+      <w:color w:themeColor="accent1" w:themeShade="bf" w:val="2F5496"/>
       <w:sz w:val="32"/>
       <w:szCs w:val="32"/>
     </w:rPr>
   </w:style>
-  <w:style w:type="paragraph" w:styleId="Ttulo3">
+  <w:style w:type="paragraph" w:styleId="Heading3">
     <w:name w:val="heading 3"/>
     <w:basedOn w:val="Normal"/>
     <w:next w:val="Normal"/>
@@ -1348,21 +1721,21 @@
     <w:semiHidden/>
     <w:unhideWhenUsed/>
     <w:qFormat/>
-    <w:rsid w:val="00C07D19"/>
+    <w:rsid w:val="00c07d19"/>
     <w:pPr>
-      <w:keepNext/>
+      <w:keepNext w:val="true"/>
       <w:keepLines/>
       <w:spacing w:before="160" w:after="80"/>
       <w:outlineLvl w:val="2"/>
     </w:pPr>
     <w:rPr>
-      <w:rFonts w:eastAsiaTheme="majorEastAsia" w:cstheme="majorBidi"/>
-      <w:color w:val="2F5496" w:themeColor="accent1" w:themeShade="BF"/>
+      <w:rFonts w:eastAsia="" w:cs="" w:cstheme="majorBidi" w:eastAsiaTheme="majorEastAsia"/>
+      <w:color w:themeColor="accent1" w:themeShade="bf" w:val="2F5496"/>
       <w:sz w:val="28"/>
       <w:szCs w:val="28"/>
     </w:rPr>
   </w:style>
-  <w:style w:type="paragraph" w:styleId="Ttulo4">
+  <w:style w:type="paragraph" w:styleId="Heading4">
     <w:name w:val="heading 4"/>
     <w:basedOn w:val="Normal"/>
     <w:next w:val="Normal"/>
@@ -1371,21 +1744,21 @@
     <w:semiHidden/>
     <w:unhideWhenUsed/>
     <w:qFormat/>
-    <w:rsid w:val="00C07D19"/>
+    <w:rsid w:val="00c07d19"/>
     <w:pPr>
-      <w:keepNext/>
+      <w:keepNext w:val="true"/>
       <w:keepLines/>
       <w:spacing w:before="80" w:after="40"/>
       <w:outlineLvl w:val="3"/>
     </w:pPr>
     <w:rPr>
-      <w:rFonts w:eastAsiaTheme="majorEastAsia" w:cstheme="majorBidi"/>
+      <w:rFonts w:eastAsia="" w:cs="" w:cstheme="majorBidi" w:eastAsiaTheme="majorEastAsia"/>
       <w:i/>
       <w:iCs/>
-      <w:color w:val="2F5496" w:themeColor="accent1" w:themeShade="BF"/>
-    </w:rPr>
-  </w:style>
-  <w:style w:type="paragraph" w:styleId="Ttulo5">
+      <w:color w:themeColor="accent1" w:themeShade="bf" w:val="2F5496"/>
+    </w:rPr>
+  </w:style>
+  <w:style w:type="paragraph" w:styleId="Heading5">
     <w:name w:val="heading 5"/>
     <w:basedOn w:val="Normal"/>
     <w:next w:val="Normal"/>
@@ -1394,19 +1767,19 @@
     <w:semiHidden/>
     <w:unhideWhenUsed/>
     <w:qFormat/>
-    <w:rsid w:val="00C07D19"/>
+    <w:rsid w:val="00c07d19"/>
     <w:pPr>
-      <w:keepNext/>
+      <w:keepNext w:val="true"/>
       <w:keepLines/>
       <w:spacing w:before="80" w:after="40"/>
       <w:outlineLvl w:val="4"/>
     </w:pPr>
     <w:rPr>
-      <w:rFonts w:eastAsiaTheme="majorEastAsia" w:cstheme="majorBidi"/>
-      <w:color w:val="2F5496" w:themeColor="accent1" w:themeShade="BF"/>
-    </w:rPr>
-  </w:style>
-  <w:style w:type="paragraph" w:styleId="Ttulo6">
+      <w:rFonts w:eastAsia="" w:cs="" w:cstheme="majorBidi" w:eastAsiaTheme="majorEastAsia"/>
+      <w:color w:themeColor="accent1" w:themeShade="bf" w:val="2F5496"/>
+    </w:rPr>
+  </w:style>
+  <w:style w:type="paragraph" w:styleId="Heading6">
     <w:name w:val="heading 6"/>
     <w:basedOn w:val="Normal"/>
     <w:next w:val="Normal"/>
@@ -1415,21 +1788,21 @@
     <w:semiHidden/>
     <w:unhideWhenUsed/>
     <w:qFormat/>
-    <w:rsid w:val="00C07D19"/>
+    <w:rsid w:val="00c07d19"/>
     <w:pPr>
-      <w:keepNext/>
+      <w:keepNext w:val="true"/>
       <w:keepLines/>
       <w:spacing w:before="40" w:after="0"/>
       <w:outlineLvl w:val="5"/>
     </w:pPr>
     <w:rPr>
-      <w:rFonts w:eastAsiaTheme="majorEastAsia" w:cstheme="majorBidi"/>
+      <w:rFonts w:eastAsia="" w:cs="" w:cstheme="majorBidi" w:eastAsiaTheme="majorEastAsia"/>
       <w:i/>
       <w:iCs/>
-      <w:color w:val="595959" w:themeColor="text1" w:themeTint="A6"/>
-    </w:rPr>
-  </w:style>
-  <w:style w:type="paragraph" w:styleId="Ttulo7">
+      <w:color w:themeColor="text1" w:themeTint="a6" w:val="595959"/>
+    </w:rPr>
+  </w:style>
+  <w:style w:type="paragraph" w:styleId="Heading7">
     <w:name w:val="heading 7"/>
     <w:basedOn w:val="Normal"/>
     <w:next w:val="Normal"/>
@@ -1438,19 +1811,19 @@
     <w:semiHidden/>
     <w:unhideWhenUsed/>
     <w:qFormat/>
-    <w:rsid w:val="00C07D19"/>
+    <w:rsid w:val="00c07d19"/>
     <w:pPr>
-      <w:keepNext/>
+      <w:keepNext w:val="true"/>
       <w:keepLines/>
       <w:spacing w:before="40" w:after="0"/>
       <w:outlineLvl w:val="6"/>
     </w:pPr>
     <w:rPr>
-      <w:rFonts w:eastAsiaTheme="majorEastAsia" w:cstheme="majorBidi"/>
-      <w:color w:val="595959" w:themeColor="text1" w:themeTint="A6"/>
-    </w:rPr>
-  </w:style>
-  <w:style w:type="paragraph" w:styleId="Ttulo8">
+      <w:rFonts w:eastAsia="" w:cs="" w:cstheme="majorBidi" w:eastAsiaTheme="majorEastAsia"/>
+      <w:color w:themeColor="text1" w:themeTint="a6" w:val="595959"/>
+    </w:rPr>
+  </w:style>
+  <w:style w:type="paragraph" w:styleId="Heading8">
     <w:name w:val="heading 8"/>
     <w:basedOn w:val="Normal"/>
     <w:next w:val="Normal"/>
@@ -1459,21 +1832,21 @@
     <w:semiHidden/>
     <w:unhideWhenUsed/>
     <w:qFormat/>
-    <w:rsid w:val="00C07D19"/>
+    <w:rsid w:val="00c07d19"/>
     <w:pPr>
-      <w:keepNext/>
+      <w:keepNext w:val="true"/>
       <w:keepLines/>
-      <w:spacing w:after="0"/>
+      <w:spacing w:before="0" w:after="0"/>
       <w:outlineLvl w:val="7"/>
     </w:pPr>
     <w:rPr>
-      <w:rFonts w:eastAsiaTheme="majorEastAsia" w:cstheme="majorBidi"/>
+      <w:rFonts w:eastAsia="" w:cs="" w:cstheme="majorBidi" w:eastAsiaTheme="majorEastAsia"/>
       <w:i/>
       <w:iCs/>
-      <w:color w:val="272727" w:themeColor="text1" w:themeTint="D8"/>
-    </w:rPr>
-  </w:style>
-  <w:style w:type="paragraph" w:styleId="Ttulo9">
+      <w:color w:themeColor="text1" w:themeTint="d8" w:val="272727"/>
+    </w:rPr>
+  </w:style>
+  <w:style w:type="paragraph" w:styleId="Heading9">
     <w:name w:val="heading 9"/>
     <w:basedOn w:val="Normal"/>
     <w:next w:val="Normal"/>
@@ -1482,23 +1855,390 @@
     <w:semiHidden/>
     <w:unhideWhenUsed/>
     <w:qFormat/>
-    <w:rsid w:val="00C07D19"/>
+    <w:rsid w:val="00c07d19"/>
     <w:pPr>
-      <w:keepNext/>
+      <w:keepNext w:val="true"/>
       <w:keepLines/>
-      <w:spacing w:after="0"/>
+      <w:spacing w:before="0" w:after="0"/>
       <w:outlineLvl w:val="8"/>
     </w:pPr>
     <w:rPr>
-      <w:rFonts w:eastAsiaTheme="majorEastAsia" w:cstheme="majorBidi"/>
-      <w:color w:val="272727" w:themeColor="text1" w:themeTint="D8"/>
-    </w:rPr>
-  </w:style>
-  <w:style w:type="character" w:default="1" w:styleId="Fontepargpadro">
+      <w:rFonts w:eastAsia="" w:cs="" w:cstheme="majorBidi" w:eastAsiaTheme="majorEastAsia"/>
+      <w:color w:themeColor="text1" w:themeTint="d8" w:val="272727"/>
+    </w:rPr>
+  </w:style>
+  <w:style w:type="character" w:styleId="DefaultParagraphFont" w:default="1">
     <w:name w:val="Default Paragraph Font"/>
     <w:uiPriority w:val="1"/>
     <w:semiHidden/>
     <w:unhideWhenUsed/>
+    <w:qFormat/>
+    <w:rPr/>
+  </w:style>
+  <w:style w:type="character" w:styleId="Ttulo1Char" w:customStyle="1">
+    <w:name w:val="Título 1 Char"/>
+    <w:basedOn w:val="DefaultParagraphFont"/>
+    <w:uiPriority w:val="9"/>
+    <w:qFormat/>
+    <w:rsid w:val="00c07d19"/>
+    <w:rPr>
+      <w:rFonts w:ascii="Calibri Light" w:hAnsi="Calibri Light" w:eastAsia="" w:cs="" w:asciiTheme="majorHAnsi" w:cstheme="majorBidi" w:eastAsiaTheme="majorEastAsia" w:hAnsiTheme="majorHAnsi"/>
+      <w:color w:themeColor="accent1" w:themeShade="bf" w:val="2F5496"/>
+      <w:sz w:val="40"/>
+      <w:szCs w:val="40"/>
+    </w:rPr>
+  </w:style>
+  <w:style w:type="character" w:styleId="Ttulo2Char" w:customStyle="1">
+    <w:name w:val="Título 2 Char"/>
+    <w:basedOn w:val="DefaultParagraphFont"/>
+    <w:uiPriority w:val="9"/>
+    <w:semiHidden/>
+    <w:qFormat/>
+    <w:rsid w:val="00c07d19"/>
+    <w:rPr>
+      <w:rFonts w:ascii="Calibri Light" w:hAnsi="Calibri Light" w:eastAsia="" w:cs="" w:asciiTheme="majorHAnsi" w:cstheme="majorBidi" w:eastAsiaTheme="majorEastAsia" w:hAnsiTheme="majorHAnsi"/>
+      <w:color w:themeColor="accent1" w:themeShade="bf" w:val="2F5496"/>
+      <w:sz w:val="32"/>
+      <w:szCs w:val="32"/>
+    </w:rPr>
+  </w:style>
+  <w:style w:type="character" w:styleId="Ttulo3Char" w:customStyle="1">
+    <w:name w:val="Título 3 Char"/>
+    <w:basedOn w:val="DefaultParagraphFont"/>
+    <w:uiPriority w:val="9"/>
+    <w:semiHidden/>
+    <w:qFormat/>
+    <w:rsid w:val="00c07d19"/>
+    <w:rPr>
+      <w:rFonts w:eastAsia="" w:cs="" w:cstheme="majorBidi" w:eastAsiaTheme="majorEastAsia"/>
+      <w:color w:themeColor="accent1" w:themeShade="bf" w:val="2F5496"/>
+      <w:sz w:val="28"/>
+      <w:szCs w:val="28"/>
+    </w:rPr>
+  </w:style>
+  <w:style w:type="character" w:styleId="Ttulo4Char" w:customStyle="1">
+    <w:name w:val="Título 4 Char"/>
+    <w:basedOn w:val="DefaultParagraphFont"/>
+    <w:uiPriority w:val="9"/>
+    <w:semiHidden/>
+    <w:qFormat/>
+    <w:rsid w:val="00c07d19"/>
+    <w:rPr>
+      <w:rFonts w:eastAsia="" w:cs="" w:cstheme="majorBidi" w:eastAsiaTheme="majorEastAsia"/>
+      <w:i/>
+      <w:iCs/>
+      <w:color w:themeColor="accent1" w:themeShade="bf" w:val="2F5496"/>
+    </w:rPr>
+  </w:style>
+  <w:style w:type="character" w:styleId="Ttulo5Char" w:customStyle="1">
+    <w:name w:val="Título 5 Char"/>
+    <w:basedOn w:val="DefaultParagraphFont"/>
+    <w:uiPriority w:val="9"/>
+    <w:semiHidden/>
+    <w:qFormat/>
+    <w:rsid w:val="00c07d19"/>
+    <w:rPr>
+      <w:rFonts w:eastAsia="" w:cs="" w:cstheme="majorBidi" w:eastAsiaTheme="majorEastAsia"/>
+      <w:color w:themeColor="accent1" w:themeShade="bf" w:val="2F5496"/>
+    </w:rPr>
+  </w:style>
+  <w:style w:type="character" w:styleId="Ttulo6Char" w:customStyle="1">
+    <w:name w:val="Título 6 Char"/>
+    <w:basedOn w:val="DefaultParagraphFont"/>
+    <w:uiPriority w:val="9"/>
+    <w:semiHidden/>
+    <w:qFormat/>
+    <w:rsid w:val="00c07d19"/>
+    <w:rPr>
+      <w:rFonts w:eastAsia="" w:cs="" w:cstheme="majorBidi" w:eastAsiaTheme="majorEastAsia"/>
+      <w:i/>
+      <w:iCs/>
+      <w:color w:themeColor="text1" w:themeTint="a6" w:val="595959"/>
+    </w:rPr>
+  </w:style>
+  <w:style w:type="character" w:styleId="Ttulo7Char" w:customStyle="1">
+    <w:name w:val="Título 7 Char"/>
+    <w:basedOn w:val="DefaultParagraphFont"/>
+    <w:uiPriority w:val="9"/>
+    <w:semiHidden/>
+    <w:qFormat/>
+    <w:rsid w:val="00c07d19"/>
+    <w:rPr>
+      <w:rFonts w:eastAsia="" w:cs="" w:cstheme="majorBidi" w:eastAsiaTheme="majorEastAsia"/>
+      <w:color w:themeColor="text1" w:themeTint="a6" w:val="595959"/>
+    </w:rPr>
+  </w:style>
+  <w:style w:type="character" w:styleId="Ttulo8Char" w:customStyle="1">
+    <w:name w:val="Título 8 Char"/>
+    <w:basedOn w:val="DefaultParagraphFont"/>
+    <w:uiPriority w:val="9"/>
+    <w:semiHidden/>
+    <w:qFormat/>
+    <w:rsid w:val="00c07d19"/>
+    <w:rPr>
+      <w:rFonts w:eastAsia="" w:cs="" w:cstheme="majorBidi" w:eastAsiaTheme="majorEastAsia"/>
+      <w:i/>
+      <w:iCs/>
+      <w:color w:themeColor="text1" w:themeTint="d8" w:val="272727"/>
+    </w:rPr>
+  </w:style>
+  <w:style w:type="character" w:styleId="Ttulo9Char" w:customStyle="1">
+    <w:name w:val="Título 9 Char"/>
+    <w:basedOn w:val="DefaultParagraphFont"/>
+    <w:uiPriority w:val="9"/>
+    <w:semiHidden/>
+    <w:qFormat/>
+    <w:rsid w:val="00c07d19"/>
+    <w:rPr>
+      <w:rFonts w:eastAsia="" w:cs="" w:cstheme="majorBidi" w:eastAsiaTheme="majorEastAsia"/>
+      <w:color w:themeColor="text1" w:themeTint="d8" w:val="272727"/>
+    </w:rPr>
+  </w:style>
+  <w:style w:type="character" w:styleId="TtuloChar" w:customStyle="1">
+    <w:name w:val="Título Char"/>
+    <w:basedOn w:val="DefaultParagraphFont"/>
+    <w:uiPriority w:val="10"/>
+    <w:qFormat/>
+    <w:rsid w:val="00c07d19"/>
+    <w:rPr>
+      <w:rFonts w:ascii="Calibri Light" w:hAnsi="Calibri Light" w:eastAsia="" w:cs="" w:asciiTheme="majorHAnsi" w:cstheme="majorBidi" w:eastAsiaTheme="majorEastAsia" w:hAnsiTheme="majorHAnsi"/>
+      <w:spacing w:val="-10"/>
+      <w:kern w:val="2"/>
+      <w:sz w:val="56"/>
+      <w:szCs w:val="56"/>
+    </w:rPr>
+  </w:style>
+  <w:style w:type="character" w:styleId="SubttuloChar" w:customStyle="1">
+    <w:name w:val="Subtítulo Char"/>
+    <w:basedOn w:val="DefaultParagraphFont"/>
+    <w:uiPriority w:val="11"/>
+    <w:qFormat/>
+    <w:rsid w:val="00c07d19"/>
+    <w:rPr>
+      <w:rFonts w:eastAsia="" w:cs="" w:cstheme="majorBidi" w:eastAsiaTheme="majorEastAsia"/>
+      <w:color w:themeColor="text1" w:themeTint="a6" w:val="595959"/>
+      <w:spacing w:val="15"/>
+      <w:sz w:val="28"/>
+      <w:szCs w:val="28"/>
+    </w:rPr>
+  </w:style>
+  <w:style w:type="character" w:styleId="CitaoChar" w:customStyle="1">
+    <w:name w:val="Citação Char"/>
+    <w:basedOn w:val="DefaultParagraphFont"/>
+    <w:link w:val="Quote"/>
+    <w:uiPriority w:val="29"/>
+    <w:qFormat/>
+    <w:rsid w:val="00c07d19"/>
+    <w:rPr>
+      <w:i/>
+      <w:iCs/>
+      <w:color w:themeColor="text1" w:themeTint="bf" w:val="404040"/>
+    </w:rPr>
+  </w:style>
+  <w:style w:type="character" w:styleId="IntenseEmphasis">
+    <w:name w:val="Intense Emphasis"/>
+    <w:basedOn w:val="DefaultParagraphFont"/>
+    <w:uiPriority w:val="21"/>
+    <w:qFormat/>
+    <w:rsid w:val="00c07d19"/>
+    <w:rPr>
+      <w:i/>
+      <w:iCs/>
+      <w:color w:themeColor="accent1" w:themeShade="bf" w:val="2F5496"/>
+    </w:rPr>
+  </w:style>
+  <w:style w:type="character" w:styleId="CitaoIntensaChar" w:customStyle="1">
+    <w:name w:val="Citação Intensa Char"/>
+    <w:basedOn w:val="DefaultParagraphFont"/>
+    <w:link w:val="IntenseQuote"/>
+    <w:uiPriority w:val="30"/>
+    <w:qFormat/>
+    <w:rsid w:val="00c07d19"/>
+    <w:rPr>
+      <w:i/>
+      <w:iCs/>
+      <w:color w:themeColor="accent1" w:themeShade="bf" w:val="2F5496"/>
+    </w:rPr>
+  </w:style>
+  <w:style w:type="character" w:styleId="IntenseReference">
+    <w:name w:val="Intense Reference"/>
+    <w:basedOn w:val="DefaultParagraphFont"/>
+    <w:uiPriority w:val="32"/>
+    <w:qFormat/>
+    <w:rsid w:val="00c07d19"/>
+    <w:rPr>
+      <w:b/>
+      <w:bCs/>
+      <w:smallCaps/>
+      <w:color w:themeColor="accent1" w:themeShade="bf" w:val="2F5496"/>
+      <w:spacing w:val="5"/>
+    </w:rPr>
+  </w:style>
+  <w:style w:type="paragraph" w:styleId="Ttulo" w:customStyle="1">
+    <w:name w:val="Título"/>
+    <w:basedOn w:val="Normal"/>
+    <w:next w:val="BodyText"/>
+    <w:qFormat/>
+    <w:pPr>
+      <w:keepNext w:val="true"/>
+      <w:spacing w:before="240" w:after="120"/>
+    </w:pPr>
+    <w:rPr>
+      <w:rFonts w:ascii="Liberation Sans" w:hAnsi="Liberation Sans" w:eastAsia="Noto Sans CJK SC" w:cs="Noto Sans Devanagari"/>
+      <w:sz w:val="28"/>
+      <w:szCs w:val="28"/>
+    </w:rPr>
+  </w:style>
+  <w:style w:type="paragraph" w:styleId="BodyText">
+    <w:name w:val="Body Text"/>
+    <w:basedOn w:val="Normal"/>
+    <w:pPr>
+      <w:spacing w:lineRule="auto" w:line="276" w:before="0" w:after="140"/>
+    </w:pPr>
+    <w:rPr/>
+  </w:style>
+  <w:style w:type="paragraph" w:styleId="List">
+    <w:name w:val="List"/>
+    <w:basedOn w:val="BodyText"/>
+    <w:pPr/>
+    <w:rPr>
+      <w:rFonts w:cs="Noto Sans Devanagari"/>
+    </w:rPr>
+  </w:style>
+  <w:style w:type="paragraph" w:styleId="Caption">
+    <w:name w:val="caption"/>
+    <w:basedOn w:val="Normal"/>
+    <w:qFormat/>
+    <w:pPr>
+      <w:suppressLineNumbers/>
+      <w:spacing w:before="120" w:after="120"/>
+    </w:pPr>
+    <w:rPr>
+      <w:rFonts w:cs="Noto Sans Devanagari"/>
+      <w:i/>
+      <w:iCs/>
+      <w:sz w:val="24"/>
+      <w:szCs w:val="24"/>
+    </w:rPr>
+  </w:style>
+  <w:style w:type="paragraph" w:styleId="ndice" w:customStyle="1">
+    <w:name w:val="Índice"/>
+    <w:basedOn w:val="Normal"/>
+    <w:qFormat/>
+    <w:pPr>
+      <w:suppressLineNumbers/>
+    </w:pPr>
+    <w:rPr>
+      <w:rFonts w:cs="Noto Sans Devanagari"/>
+    </w:rPr>
+  </w:style>
+  <w:style w:type="paragraph" w:styleId="Title">
+    <w:name w:val="Title"/>
+    <w:basedOn w:val="Normal"/>
+    <w:next w:val="BodyText"/>
+    <w:link w:val="TtuloChar"/>
+    <w:uiPriority w:val="10"/>
+    <w:qFormat/>
+    <w:rsid w:val="00c07d19"/>
+    <w:pPr>
+      <w:spacing w:lineRule="auto" w:line="240" w:before="0" w:after="80"/>
+      <w:contextualSpacing/>
+    </w:pPr>
+    <w:rPr>
+      <w:rFonts w:ascii="Calibri Light" w:hAnsi="Calibri Light" w:eastAsia="" w:cs="" w:asciiTheme="majorHAnsi" w:cstheme="majorBidi" w:eastAsiaTheme="majorEastAsia" w:hAnsiTheme="majorHAnsi"/>
+      <w:spacing w:val="-10"/>
+      <w:sz w:val="56"/>
+      <w:szCs w:val="56"/>
+    </w:rPr>
+  </w:style>
+  <w:style w:type="paragraph" w:styleId="ndiceuser" w:customStyle="1">
+    <w:name w:val="Índice (user)"/>
+    <w:basedOn w:val="Normal"/>
+    <w:qFormat/>
+    <w:pPr>
+      <w:suppressLineNumbers/>
+    </w:pPr>
+    <w:rPr>
+      <w:rFonts w:cs="Noto Sans Devanagari"/>
+    </w:rPr>
+  </w:style>
+  <w:style w:type="paragraph" w:styleId="Subtitle">
+    <w:name w:val="Subtitle"/>
+    <w:basedOn w:val="Normal"/>
+    <w:next w:val="Normal"/>
+    <w:link w:val="SubttuloChar"/>
+    <w:uiPriority w:val="11"/>
+    <w:qFormat/>
+    <w:rsid w:val="00c07d19"/>
+    <w:pPr/>
+    <w:rPr>
+      <w:rFonts w:eastAsia="" w:cs="" w:cstheme="majorBidi" w:eastAsiaTheme="majorEastAsia"/>
+      <w:color w:themeColor="text1" w:themeTint="a6" w:val="595959"/>
+      <w:spacing w:val="15"/>
+      <w:sz w:val="28"/>
+      <w:szCs w:val="28"/>
+    </w:rPr>
+  </w:style>
+  <w:style w:type="paragraph" w:styleId="Quote">
+    <w:name w:val="Quote"/>
+    <w:basedOn w:val="Normal"/>
+    <w:next w:val="Normal"/>
+    <w:link w:val="CitaoChar"/>
+    <w:uiPriority w:val="29"/>
+    <w:qFormat/>
+    <w:rsid w:val="00c07d19"/>
+    <w:pPr>
+      <w:spacing w:before="160" w:after="160"/>
+      <w:jc w:val="center"/>
+    </w:pPr>
+    <w:rPr>
+      <w:i/>
+      <w:iCs/>
+      <w:color w:themeColor="text1" w:themeTint="bf" w:val="404040"/>
+    </w:rPr>
+  </w:style>
+  <w:style w:type="paragraph" w:styleId="ListParagraph">
+    <w:name w:val="List Paragraph"/>
+    <w:basedOn w:val="Normal"/>
+    <w:uiPriority w:val="34"/>
+    <w:qFormat/>
+    <w:rsid w:val="00c07d19"/>
+    <w:pPr>
+      <w:spacing w:before="0" w:after="160"/>
+      <w:ind w:left="720"/>
+      <w:contextualSpacing/>
+    </w:pPr>
+    <w:rPr/>
+  </w:style>
+  <w:style w:type="paragraph" w:styleId="IntenseQuote">
+    <w:name w:val="Intense Quote"/>
+    <w:basedOn w:val="Normal"/>
+    <w:next w:val="Normal"/>
+    <w:link w:val="CitaoIntensaChar"/>
+    <w:uiPriority w:val="30"/>
+    <w:qFormat/>
+    <w:rsid w:val="00c07d19"/>
+    <w:pPr>
+      <w:pBdr>
+        <w:top w:val="single" w:sz="4" w:space="10" w:color="2F5496" w:themeColor="accent1" w:themeShade="bf"/>
+        <w:bottom w:val="single" w:sz="4" w:space="10" w:color="2F5496" w:themeColor="accent1" w:themeShade="bf"/>
+      </w:pBdr>
+      <w:spacing w:before="360" w:after="360"/>
+      <w:ind w:left="864" w:right="864"/>
+      <w:jc w:val="center"/>
+    </w:pPr>
+    <w:rPr>
+      <w:i/>
+      <w:iCs/>
+      <w:color w:themeColor="accent1" w:themeShade="bf" w:val="2F5496"/>
+    </w:rPr>
+  </w:style>
+  <w:style w:type="numbering" w:styleId="Semlista" w:default="1">
+    <w:name w:val="Sem lista"/>
+    <w:uiPriority w:val="99"/>
+    <w:semiHidden/>
+    <w:unhideWhenUsed/>
+    <w:qFormat/>
   </w:style>
   <w:style w:type="table" w:default="1" w:styleId="Tabelanormal">
     <w:name w:val="Normal Table"/>
@@ -1506,7 +2246,6 @@
     <w:semiHidden/>
     <w:unhideWhenUsed/>
     <w:tblPr>
-      <w:tblInd w:w="0" w:type="dxa"/>
       <w:tblCellMar>
         <w:top w:w="0" w:type="dxa"/>
         <w:left w:w="108" w:type="dxa"/>
@@ -1515,428 +2254,58 @@
       </w:tblCellMar>
     </w:tblPr>
   </w:style>
-  <w:style w:type="numbering" w:default="1" w:styleId="Semlista">
-    <w:name w:val="No List"/>
-    <w:uiPriority w:val="99"/>
-    <w:semiHidden/>
-    <w:unhideWhenUsed/>
-  </w:style>
-  <w:style w:type="character" w:customStyle="1" w:styleId="Ttulo1Char">
-    <w:name w:val="Título 1 Char"/>
-    <w:basedOn w:val="Fontepargpadro"/>
-    <w:link w:val="Ttulo1"/>
-    <w:uiPriority w:val="9"/>
-    <w:qFormat/>
-    <w:rsid w:val="00C07D19"/>
-    <w:rPr>
-      <w:rFonts w:asciiTheme="majorHAnsi" w:eastAsiaTheme="majorEastAsia" w:hAnsiTheme="majorHAnsi" w:cstheme="majorBidi"/>
-      <w:color w:val="2F5496" w:themeColor="accent1" w:themeShade="BF"/>
-      <w:sz w:val="40"/>
-      <w:szCs w:val="40"/>
-    </w:rPr>
-  </w:style>
-  <w:style w:type="character" w:customStyle="1" w:styleId="Ttulo2Char">
-    <w:name w:val="Título 2 Char"/>
-    <w:basedOn w:val="Fontepargpadro"/>
-    <w:link w:val="Ttulo2"/>
-    <w:uiPriority w:val="9"/>
-    <w:semiHidden/>
-    <w:qFormat/>
-    <w:rsid w:val="00C07D19"/>
-    <w:rPr>
-      <w:rFonts w:asciiTheme="majorHAnsi" w:eastAsiaTheme="majorEastAsia" w:hAnsiTheme="majorHAnsi" w:cstheme="majorBidi"/>
-      <w:color w:val="2F5496" w:themeColor="accent1" w:themeShade="BF"/>
-      <w:sz w:val="32"/>
-      <w:szCs w:val="32"/>
-    </w:rPr>
-  </w:style>
-  <w:style w:type="character" w:customStyle="1" w:styleId="Ttulo3Char">
-    <w:name w:val="Título 3 Char"/>
-    <w:basedOn w:val="Fontepargpadro"/>
-    <w:link w:val="Ttulo3"/>
-    <w:uiPriority w:val="9"/>
-    <w:semiHidden/>
-    <w:qFormat/>
-    <w:rsid w:val="00C07D19"/>
-    <w:rPr>
-      <w:rFonts w:eastAsiaTheme="majorEastAsia" w:cstheme="majorBidi"/>
-      <w:color w:val="2F5496" w:themeColor="accent1" w:themeShade="BF"/>
-      <w:sz w:val="28"/>
-      <w:szCs w:val="28"/>
-    </w:rPr>
-  </w:style>
-  <w:style w:type="character" w:customStyle="1" w:styleId="Ttulo4Char">
-    <w:name w:val="Título 4 Char"/>
-    <w:basedOn w:val="Fontepargpadro"/>
-    <w:link w:val="Ttulo4"/>
-    <w:uiPriority w:val="9"/>
-    <w:semiHidden/>
-    <w:qFormat/>
-    <w:rsid w:val="00C07D19"/>
-    <w:rPr>
-      <w:rFonts w:eastAsiaTheme="majorEastAsia" w:cstheme="majorBidi"/>
-      <w:i/>
-      <w:iCs/>
-      <w:color w:val="2F5496" w:themeColor="accent1" w:themeShade="BF"/>
-    </w:rPr>
-  </w:style>
-  <w:style w:type="character" w:customStyle="1" w:styleId="Ttulo5Char">
-    <w:name w:val="Título 5 Char"/>
-    <w:basedOn w:val="Fontepargpadro"/>
-    <w:link w:val="Ttulo5"/>
-    <w:uiPriority w:val="9"/>
-    <w:semiHidden/>
-    <w:qFormat/>
-    <w:rsid w:val="00C07D19"/>
-    <w:rPr>
-      <w:rFonts w:eastAsiaTheme="majorEastAsia" w:cstheme="majorBidi"/>
-      <w:color w:val="2F5496" w:themeColor="accent1" w:themeShade="BF"/>
-    </w:rPr>
-  </w:style>
-  <w:style w:type="character" w:customStyle="1" w:styleId="Ttulo6Char">
-    <w:name w:val="Título 6 Char"/>
-    <w:basedOn w:val="Fontepargpadro"/>
-    <w:link w:val="Ttulo6"/>
-    <w:uiPriority w:val="9"/>
-    <w:semiHidden/>
-    <w:qFormat/>
-    <w:rsid w:val="00C07D19"/>
-    <w:rPr>
-      <w:rFonts w:eastAsiaTheme="majorEastAsia" w:cstheme="majorBidi"/>
-      <w:i/>
-      <w:iCs/>
-      <w:color w:val="595959" w:themeColor="text1" w:themeTint="A6"/>
-    </w:rPr>
-  </w:style>
-  <w:style w:type="character" w:customStyle="1" w:styleId="Ttulo7Char">
-    <w:name w:val="Título 7 Char"/>
-    <w:basedOn w:val="Fontepargpadro"/>
-    <w:link w:val="Ttulo7"/>
-    <w:uiPriority w:val="9"/>
-    <w:semiHidden/>
-    <w:qFormat/>
-    <w:rsid w:val="00C07D19"/>
-    <w:rPr>
-      <w:rFonts w:eastAsiaTheme="majorEastAsia" w:cstheme="majorBidi"/>
-      <w:color w:val="595959" w:themeColor="text1" w:themeTint="A6"/>
-    </w:rPr>
-  </w:style>
-  <w:style w:type="character" w:customStyle="1" w:styleId="Ttulo8Char">
-    <w:name w:val="Título 8 Char"/>
-    <w:basedOn w:val="Fontepargpadro"/>
-    <w:link w:val="Ttulo8"/>
-    <w:uiPriority w:val="9"/>
-    <w:semiHidden/>
-    <w:qFormat/>
-    <w:rsid w:val="00C07D19"/>
-    <w:rPr>
-      <w:rFonts w:eastAsiaTheme="majorEastAsia" w:cstheme="majorBidi"/>
-      <w:i/>
-      <w:iCs/>
-      <w:color w:val="272727" w:themeColor="text1" w:themeTint="D8"/>
-    </w:rPr>
-  </w:style>
-  <w:style w:type="character" w:customStyle="1" w:styleId="Ttulo9Char">
-    <w:name w:val="Título 9 Char"/>
-    <w:basedOn w:val="Fontepargpadro"/>
-    <w:link w:val="Ttulo9"/>
-    <w:uiPriority w:val="9"/>
-    <w:semiHidden/>
-    <w:qFormat/>
-    <w:rsid w:val="00C07D19"/>
-    <w:rPr>
-      <w:rFonts w:eastAsiaTheme="majorEastAsia" w:cstheme="majorBidi"/>
-      <w:color w:val="272727" w:themeColor="text1" w:themeTint="D8"/>
-    </w:rPr>
-  </w:style>
-  <w:style w:type="character" w:customStyle="1" w:styleId="TtuloChar">
-    <w:name w:val="Título Char"/>
-    <w:basedOn w:val="Fontepargpadro"/>
-    <w:link w:val="Ttulo"/>
-    <w:uiPriority w:val="10"/>
-    <w:qFormat/>
-    <w:rsid w:val="00C07D19"/>
-    <w:rPr>
-      <w:rFonts w:asciiTheme="majorHAnsi" w:eastAsiaTheme="majorEastAsia" w:hAnsiTheme="majorHAnsi" w:cstheme="majorBidi"/>
-      <w:spacing w:val="-10"/>
-      <w:kern w:val="2"/>
-      <w:sz w:val="56"/>
-      <w:szCs w:val="56"/>
-    </w:rPr>
-  </w:style>
-  <w:style w:type="character" w:customStyle="1" w:styleId="SubttuloChar">
-    <w:name w:val="Subtítulo Char"/>
-    <w:basedOn w:val="Fontepargpadro"/>
-    <w:link w:val="Subttulo"/>
-    <w:uiPriority w:val="11"/>
-    <w:qFormat/>
-    <w:rsid w:val="00C07D19"/>
-    <w:rPr>
-      <w:rFonts w:eastAsiaTheme="majorEastAsia" w:cstheme="majorBidi"/>
-      <w:color w:val="595959" w:themeColor="text1" w:themeTint="A6"/>
-      <w:spacing w:val="15"/>
-      <w:sz w:val="28"/>
-      <w:szCs w:val="28"/>
-    </w:rPr>
-  </w:style>
-  <w:style w:type="character" w:customStyle="1" w:styleId="CitaoChar">
-    <w:name w:val="Citação Char"/>
-    <w:basedOn w:val="Fontepargpadro"/>
-    <w:link w:val="Citao"/>
-    <w:uiPriority w:val="29"/>
-    <w:qFormat/>
-    <w:rsid w:val="00C07D19"/>
-    <w:rPr>
-      <w:i/>
-      <w:iCs/>
-      <w:color w:val="404040" w:themeColor="text1" w:themeTint="BF"/>
-    </w:rPr>
-  </w:style>
-  <w:style w:type="character" w:styleId="nfaseIntensa">
-    <w:name w:val="Intense Emphasis"/>
-    <w:basedOn w:val="Fontepargpadro"/>
-    <w:uiPriority w:val="21"/>
-    <w:qFormat/>
-    <w:rsid w:val="00C07D19"/>
-    <w:rPr>
-      <w:i/>
-      <w:iCs/>
-      <w:color w:val="2F5496" w:themeColor="accent1" w:themeShade="BF"/>
-    </w:rPr>
-  </w:style>
-  <w:style w:type="character" w:customStyle="1" w:styleId="CitaoIntensaChar">
-    <w:name w:val="Citação Intensa Char"/>
-    <w:basedOn w:val="Fontepargpadro"/>
-    <w:link w:val="CitaoIntensa"/>
-    <w:uiPriority w:val="30"/>
-    <w:qFormat/>
-    <w:rsid w:val="00C07D19"/>
-    <w:rPr>
-      <w:i/>
-      <w:iCs/>
-      <w:color w:val="2F5496" w:themeColor="accent1" w:themeShade="BF"/>
-    </w:rPr>
-  </w:style>
-  <w:style w:type="character" w:styleId="RefernciaIntensa">
-    <w:name w:val="Intense Reference"/>
-    <w:basedOn w:val="Fontepargpadro"/>
-    <w:uiPriority w:val="32"/>
-    <w:qFormat/>
-    <w:rsid w:val="00C07D19"/>
-    <w:rPr>
-      <w:b/>
-      <w:bCs/>
-      <w:smallCaps/>
-      <w:color w:val="2F5496" w:themeColor="accent1" w:themeShade="BF"/>
-      <w:spacing w:val="5"/>
-    </w:rPr>
-  </w:style>
-  <w:style w:type="paragraph" w:styleId="Ttulo">
-    <w:name w:val="Title"/>
-    <w:basedOn w:val="Normal"/>
-    <w:next w:val="Corpodetexto"/>
-    <w:link w:val="TtuloChar"/>
-    <w:uiPriority w:val="10"/>
-    <w:qFormat/>
-    <w:rsid w:val="00C07D19"/>
-    <w:pPr>
-      <w:spacing w:after="80" w:line="240" w:lineRule="auto"/>
-      <w:contextualSpacing/>
-    </w:pPr>
-    <w:rPr>
-      <w:rFonts w:asciiTheme="majorHAnsi" w:eastAsiaTheme="majorEastAsia" w:hAnsiTheme="majorHAnsi" w:cstheme="majorBidi"/>
-      <w:spacing w:val="-10"/>
-      <w:sz w:val="56"/>
-      <w:szCs w:val="56"/>
-    </w:rPr>
-  </w:style>
-  <w:style w:type="paragraph" w:styleId="Corpodetexto">
-    <w:name w:val="Body Text"/>
-    <w:basedOn w:val="Normal"/>
-    <w:pPr>
-      <w:spacing w:after="140" w:line="276" w:lineRule="auto"/>
-    </w:pPr>
-  </w:style>
-  <w:style w:type="paragraph" w:styleId="Lista">
-    <w:name w:val="List"/>
-    <w:basedOn w:val="Corpodetexto"/>
-    <w:rPr>
-      <w:rFonts w:cs="Noto Sans Devanagari"/>
-    </w:rPr>
-  </w:style>
-  <w:style w:type="paragraph" w:styleId="Legenda">
-    <w:name w:val="caption"/>
-    <w:basedOn w:val="Normal"/>
-    <w:qFormat/>
-    <w:pPr>
-      <w:suppressLineNumbers/>
-      <w:spacing w:before="120" w:after="120"/>
-    </w:pPr>
-    <w:rPr>
-      <w:rFonts w:cs="Noto Sans Devanagari"/>
-      <w:i/>
-      <w:iCs/>
-      <w:sz w:val="24"/>
-      <w:szCs w:val="24"/>
-    </w:rPr>
-  </w:style>
-  <w:style w:type="paragraph" w:customStyle="1" w:styleId="ndice">
-    <w:name w:val="Índice"/>
-    <w:basedOn w:val="Normal"/>
-    <w:qFormat/>
-    <w:pPr>
-      <w:suppressLineNumbers/>
-    </w:pPr>
-    <w:rPr>
-      <w:rFonts w:cs="Noto Sans Devanagari"/>
-    </w:rPr>
-  </w:style>
-  <w:style w:type="paragraph" w:customStyle="1" w:styleId="Ttulouser">
-    <w:name w:val="Título (user)"/>
-    <w:basedOn w:val="Normal"/>
-    <w:next w:val="Corpodetexto"/>
-    <w:qFormat/>
-    <w:pPr>
-      <w:keepNext/>
-      <w:spacing w:before="240" w:after="120"/>
-    </w:pPr>
-    <w:rPr>
-      <w:rFonts w:ascii="Liberation Sans" w:eastAsia="Noto Sans CJK SC" w:hAnsi="Liberation Sans" w:cs="Noto Sans Devanagari"/>
-      <w:sz w:val="28"/>
-      <w:szCs w:val="28"/>
-    </w:rPr>
-  </w:style>
-  <w:style w:type="paragraph" w:customStyle="1" w:styleId="ndiceuser">
-    <w:name w:val="Índice (user)"/>
-    <w:basedOn w:val="Normal"/>
-    <w:qFormat/>
-    <w:pPr>
-      <w:suppressLineNumbers/>
-    </w:pPr>
-    <w:rPr>
-      <w:rFonts w:cs="Noto Sans Devanagari"/>
-    </w:rPr>
-  </w:style>
-  <w:style w:type="paragraph" w:styleId="Subttulo">
-    <w:name w:val="Subtitle"/>
-    <w:basedOn w:val="Normal"/>
-    <w:next w:val="Normal"/>
-    <w:link w:val="SubttuloChar"/>
-    <w:uiPriority w:val="11"/>
-    <w:qFormat/>
-    <w:rsid w:val="00C07D19"/>
-    <w:rPr>
-      <w:rFonts w:eastAsiaTheme="majorEastAsia" w:cstheme="majorBidi"/>
-      <w:color w:val="595959" w:themeColor="text1" w:themeTint="A6"/>
-      <w:spacing w:val="15"/>
-      <w:sz w:val="28"/>
-      <w:szCs w:val="28"/>
-    </w:rPr>
-  </w:style>
-  <w:style w:type="paragraph" w:styleId="Citao">
-    <w:name w:val="Quote"/>
-    <w:basedOn w:val="Normal"/>
-    <w:next w:val="Normal"/>
-    <w:link w:val="CitaoChar"/>
-    <w:uiPriority w:val="29"/>
-    <w:qFormat/>
-    <w:rsid w:val="00C07D19"/>
-    <w:pPr>
-      <w:spacing w:before="160"/>
-      <w:jc w:val="center"/>
-    </w:pPr>
-    <w:rPr>
-      <w:i/>
-      <w:iCs/>
-      <w:color w:val="404040" w:themeColor="text1" w:themeTint="BF"/>
-    </w:rPr>
-  </w:style>
-  <w:style w:type="paragraph" w:styleId="PargrafodaLista">
-    <w:name w:val="List Paragraph"/>
-    <w:basedOn w:val="Normal"/>
-    <w:uiPriority w:val="34"/>
-    <w:qFormat/>
-    <w:rsid w:val="00C07D19"/>
-    <w:pPr>
-      <w:ind w:left="720"/>
-      <w:contextualSpacing/>
-    </w:pPr>
-  </w:style>
-  <w:style w:type="paragraph" w:styleId="CitaoIntensa">
-    <w:name w:val="Intense Quote"/>
-    <w:basedOn w:val="Normal"/>
-    <w:next w:val="Normal"/>
-    <w:link w:val="CitaoIntensaChar"/>
-    <w:uiPriority w:val="30"/>
-    <w:qFormat/>
-    <w:rsid w:val="00C07D19"/>
-    <w:pPr>
-      <w:pBdr>
-        <w:top w:val="single" w:sz="4" w:space="10" w:color="2F5496" w:themeColor="accent1" w:themeShade="BF"/>
-        <w:bottom w:val="single" w:sz="4" w:space="10" w:color="2F5496" w:themeColor="accent1" w:themeShade="BF"/>
-      </w:pBdr>
-      <w:spacing w:before="360" w:after="360"/>
-      <w:ind w:left="864" w:right="864"/>
-      <w:jc w:val="center"/>
-    </w:pPr>
-    <w:rPr>
-      <w:i/>
-      <w:iCs/>
-      <w:color w:val="2F5496" w:themeColor="accent1" w:themeShade="BF"/>
-    </w:rPr>
-  </w:style>
 </w:styles>
 </file>
 
 <file path=word/theme/theme1.xml><?xml version="1.0" encoding="utf-8"?>
-<a:theme xmlns:a="http://schemas.openxmlformats.org/drawingml/2006/main" name="Office Theme">
+<a:theme xmlns:a="http://schemas.openxmlformats.org/drawingml/2006/main" xmlns:r="http://schemas.openxmlformats.org/officeDocument/2006/relationships" name="Office Theme">
   <a:themeElements>
     <a:clrScheme name="Office">
       <a:dk1>
         <a:srgbClr val="000000"/>
       </a:dk1>
       <a:lt1>
-        <a:srgbClr val="FFFFFF"/>
+        <a:srgbClr val="ffffff"/>
       </a:lt1>
       <a:dk2>
-        <a:srgbClr val="44546A"/>
+        <a:srgbClr val="44546a"/>
       </a:dk2>
       <a:lt2>
-        <a:srgbClr val="E7E6E6"/>
+        <a:srgbClr val="e7e6e6"/>
       </a:lt2>
       <a:accent1>
-        <a:srgbClr val="4472C4"/>
+        <a:srgbClr val="4472c4"/>
       </a:accent1>
       <a:accent2>
-        <a:srgbClr val="ED7D31"/>
+        <a:srgbClr val="ed7d31"/>
       </a:accent2>
       <a:accent3>
-        <a:srgbClr val="A5A5A5"/>
+        <a:srgbClr val="a5a5a5"/>
       </a:accent3>
       <a:accent4>
-        <a:srgbClr val="FFC000"/>
+        <a:srgbClr val="ffc000"/>
       </a:accent4>
       <a:accent5>
-        <a:srgbClr val="5B9BD5"/>
+        <a:srgbClr val="5b9bd5"/>
       </a:accent5>
       <a:accent6>
-        <a:srgbClr val="70AD47"/>
+        <a:srgbClr val="70ad47"/>
       </a:accent6>
       <a:hlink>
-        <a:srgbClr val="0563C1"/>
+        <a:srgbClr val="0563c1"/>
       </a:hlink>
       <a:folHlink>
-        <a:srgbClr val="954F72"/>
+        <a:srgbClr val="954f72"/>
       </a:folHlink>
     </a:clrScheme>
     <a:fontScheme name="Office">
       <a:majorFont>
-        <a:latin typeface="Calibri Light" panose="020F0302020204030204"/>
+        <a:latin typeface="Calibri Light" panose="020F0302020204030204" pitchFamily="0" charset="1"/>
         <a:ea typeface=""/>
         <a:cs typeface=""/>
       </a:majorFont>
       <a:minorFont>
-        <a:latin typeface="Calibri" panose="020F0502020204030204"/>
+        <a:latin typeface="Calibri" panose="020F0502020204030204" pitchFamily="0" charset="1"/>
         <a:ea typeface=""/>
         <a:cs typeface=""/>
       </a:minorFont>
@@ -1968,7 +2337,7 @@
             </a:gs>
           </a:gsLst>
           <a:lin ang="5400000" scaled="0"/>
-          <a:tileRect/>
+          <a:tileRect l="0" t="0" r="0" b="0"/>
         </a:gradFill>
         <a:gradFill>
           <a:gsLst>
@@ -1992,7 +2361,7 @@
             </a:gs>
           </a:gsLst>
           <a:lin ang="5400000" scaled="0"/>
-          <a:tileRect/>
+          <a:tileRect l="0" t="0" r="0" b="0"/>
         </a:gradFill>
       </a:fillStyleLst>
       <a:lnStyleLst>
@@ -2052,12 +2421,10 @@
             </a:gs>
           </a:gsLst>
           <a:lin ang="5400000" scaled="0"/>
-          <a:tileRect/>
+          <a:tileRect l="0" t="0" r="0" b="0"/>
         </a:gradFill>
       </a:bgFillStyleLst>
     </a:fmtScheme>
   </a:themeElements>
-  <a:objectDefaults/>
-  <a:extraClrSchemeLst/>
 </a:theme>
 </file>
</xml_diff>

<commit_message>
Revert "Merge branch 'fluxo-entrevista' into luiza"
This reverts commit f57306b92af2c17c349626203fd680fc3410c41c, reversing
changes made to 0c505586ed9232d80e74601e51ae75fea5c48ca6.
</commit_message>
<xml_diff>
--- a/backend/storage/app/base_documents/guarulhos/relatorioFct.docx
+++ b/backend/storage/app/base_documents/guarulhos/relatorioFct.docx
@@ -98,8 +98,8 @@
         <w:gridCol w:w="2156"/>
         <w:gridCol w:w="574"/>
         <w:gridCol w:w="1049"/>
-        <w:gridCol w:w="1280"/>
-        <w:gridCol w:w="592"/>
+        <w:gridCol w:w="1279"/>
+        <w:gridCol w:w="593"/>
         <w:gridCol w:w="592"/>
         <w:gridCol w:w="2250"/>
       </w:tblGrid>
@@ -158,7 +158,6 @@
             <w:pPr>
               <w:pStyle w:val="Normal"/>
               <w:widowControl/>
-              <w:suppressAutoHyphens w:val="true"/>
               <w:bidi w:val="0"/>
               <w:spacing w:lineRule="auto" w:line="259" w:before="0" w:after="160"/>
               <w:jc w:val="left"/>
@@ -188,6 +187,7 @@
           <w:p>
             <w:pPr>
               <w:pStyle w:val="Normal"/>
+              <w:bidi w:val="0"/>
               <w:rPr>
                 <w:lang w:val="pt-PT"/>
               </w:rPr>
@@ -225,6 +225,10 @@
             </w:r>
             <w:r>
               <w:rPr>
+                <w:b w:val="false"/>
+                <w:bCs w:val="false"/>
+                <w:strike w:val="false"/>
+                <w:dstrike w:val="false"/>
                 <w:u w:val="single"/>
                 <w:lang w:val="pt-PT"/>
               </w:rPr>
@@ -249,6 +253,8 @@
             </w:r>
             <w:r>
               <w:rPr>
+                <w:b w:val="false"/>
+                <w:bCs w:val="false"/>
                 <w:u w:val="single"/>
                 <w:lang w:val="pt-PT"/>
               </w:rPr>
@@ -276,7 +282,6 @@
             <w:pPr>
               <w:pStyle w:val="Normal"/>
               <w:widowControl/>
-              <w:suppressAutoHyphens w:val="true"/>
               <w:bidi w:val="0"/>
               <w:spacing w:lineRule="auto" w:line="259" w:before="0" w:after="160"/>
               <w:jc w:val="left"/>
@@ -317,6 +322,8 @@
             </w:r>
             <w:r>
               <w:rPr>
+                <w:b w:val="false"/>
+                <w:bCs w:val="false"/>
                 <w:u w:val="single"/>
               </w:rPr>
               <w:t>${studentName}</w:t>
@@ -325,11 +332,7 @@
           <w:p>
             <w:pPr>
               <w:pStyle w:val="Normal"/>
-              <w:widowControl/>
-              <w:suppressAutoHyphens w:val="true"/>
-              <w:bidi w:val="0"/>
-              <w:spacing w:lineRule="auto" w:line="259" w:before="0" w:after="160"/>
-              <w:jc w:val="left"/>
+              <w:spacing w:before="0" w:after="160"/>
               <w:rPr/>
             </w:pPr>
             <w:r>
@@ -341,6 +344,8 @@
             </w:r>
             <w:r>
               <w:rPr>
+                <w:b w:val="false"/>
+                <w:bCs w:val="false"/>
                 <w:u w:val="single"/>
               </w:rPr>
               <w:t>${studentPhone}</w:t>
@@ -367,7 +372,6 @@
             <w:pPr>
               <w:pStyle w:val="Normal"/>
               <w:widowControl/>
-              <w:suppressAutoHyphens w:val="true"/>
               <w:bidi w:val="0"/>
               <w:spacing w:lineRule="auto" w:line="259" w:before="0" w:after="160"/>
               <w:jc w:val="left"/>
@@ -396,6 +400,7 @@
           <w:p>
             <w:pPr>
               <w:pStyle w:val="Normal"/>
+              <w:bidi w:val="0"/>
               <w:rPr>
                 <w:lang w:val="pt-PT"/>
               </w:rPr>
@@ -412,6 +417,7 @@
           <w:p>
             <w:pPr>
               <w:pStyle w:val="Normal"/>
+              <w:bidi w:val="0"/>
               <w:rPr>
                 <w:lang w:val="pt-PT"/>
               </w:rPr>
@@ -434,6 +440,7 @@
           <w:p>
             <w:pPr>
               <w:pStyle w:val="Normal"/>
+              <w:bidi w:val="0"/>
               <w:spacing w:before="0" w:after="160"/>
               <w:rPr>
                 <w:lang w:val="pt-PT"/>
@@ -451,7 +458,7 @@
               <w:rPr>
                 <w:lang w:val="pt-PT"/>
               </w:rPr>
-              <w:t>${monthsDuration}</w:t>
+              <w:t>${monthsDuration} meses</w:t>
             </w:r>
           </w:p>
         </w:tc>
@@ -476,7 +483,6 @@
             <w:pPr>
               <w:pStyle w:val="Normal"/>
               <w:widowControl/>
-              <w:suppressAutoHyphens w:val="true"/>
               <w:bidi w:val="0"/>
               <w:spacing w:lineRule="auto" w:line="259" w:before="0" w:after="160"/>
               <w:jc w:val="left"/>
@@ -504,7 +510,6 @@
             <w:pPr>
               <w:pStyle w:val="Normal"/>
               <w:widowControl/>
-              <w:suppressAutoHyphens w:val="true"/>
               <w:bidi w:val="0"/>
               <w:spacing w:lineRule="auto" w:line="259" w:before="0" w:after="160"/>
               <w:jc w:val="left"/>
@@ -542,7 +547,6 @@
             <w:pPr>
               <w:pStyle w:val="Normal"/>
               <w:widowControl/>
-              <w:suppressAutoHyphens w:val="true"/>
               <w:bidi w:val="0"/>
               <w:spacing w:lineRule="auto" w:line="259" w:before="0" w:after="160"/>
               <w:jc w:val="left"/>
@@ -570,7 +574,6 @@
             <w:pPr>
               <w:pStyle w:val="Normal"/>
               <w:widowControl/>
-              <w:suppressAutoHyphens w:val="true"/>
               <w:bidi w:val="0"/>
               <w:spacing w:lineRule="auto" w:line="259" w:before="0" w:after="160"/>
               <w:jc w:val="left"/>
@@ -578,7 +581,7 @@
             </w:pPr>
             <w:r>
               <w:rPr/>
-              <w:t>Atividades</w:t>
+              <w:t>FALTAS (Horas)</w:t>
             </w:r>
           </w:p>
         </w:tc>
@@ -598,7 +601,6 @@
             <w:pPr>
               <w:pStyle w:val="Normal"/>
               <w:widowControl/>
-              <w:suppressAutoHyphens w:val="true"/>
               <w:bidi w:val="0"/>
               <w:spacing w:lineRule="auto" w:line="259" w:before="0" w:after="160"/>
               <w:jc w:val="left"/>
@@ -704,7 +706,7 @@
         </w:tc>
         <w:tc>
           <w:tcPr>
-            <w:tcW w:w="1280" w:type="dxa"/>
+            <w:tcW w:w="1279" w:type="dxa"/>
             <w:tcBorders>
               <w:top w:val="single" w:sz="4" w:space="0" w:color="000000"/>
               <w:left w:val="single" w:sz="4" w:space="0" w:color="000000"/>
@@ -717,7 +719,6 @@
             <w:pPr>
               <w:pStyle w:val="Normal"/>
               <w:widowControl/>
-              <w:suppressAutoHyphens w:val="true"/>
               <w:bidi w:val="0"/>
               <w:spacing w:lineRule="auto" w:line="259" w:before="0" w:after="160"/>
               <w:jc w:val="left"/>
@@ -725,13 +726,13 @@
             </w:pPr>
             <w:r>
               <w:rPr/>
-              <w:t>Título da Atividade</w:t>
-            </w:r>
-          </w:p>
-        </w:tc>
-        <w:tc>
-          <w:tcPr>
-            <w:tcW w:w="1184" w:type="dxa"/>
+              <w:t>Justificadas</w:t>
+            </w:r>
+          </w:p>
+        </w:tc>
+        <w:tc>
+          <w:tcPr>
+            <w:tcW w:w="1185" w:type="dxa"/>
             <w:gridSpan w:val="2"/>
             <w:tcBorders>
               <w:top w:val="single" w:sz="4" w:space="0" w:color="000000"/>
@@ -745,7 +746,6 @@
             <w:pPr>
               <w:pStyle w:val="Normal"/>
               <w:widowControl/>
-              <w:suppressAutoHyphens w:val="true"/>
               <w:bidi w:val="0"/>
               <w:spacing w:lineRule="auto" w:line="259" w:before="0" w:after="160"/>
               <w:jc w:val="left"/>
@@ -753,7 +753,7 @@
             </w:pPr>
             <w:r>
               <w:rPr/>
-              <w:t>Anotações</w:t>
+              <w:t>Injustificadas</w:t>
             </w:r>
           </w:p>
         </w:tc>
@@ -834,11 +834,7 @@
           <w:p>
             <w:pPr>
               <w:pStyle w:val="Normal"/>
-              <w:widowControl/>
-              <w:suppressAutoHyphens w:val="true"/>
-              <w:bidi w:val="0"/>
-              <w:spacing w:lineRule="auto" w:line="259" w:before="0" w:after="160"/>
-              <w:jc w:val="left"/>
+              <w:spacing w:before="0" w:after="160"/>
               <w:rPr/>
             </w:pPr>
             <w:r>
@@ -861,11 +857,7 @@
           <w:p>
             <w:pPr>
               <w:pStyle w:val="Normal"/>
-              <w:widowControl/>
-              <w:suppressAutoHyphens w:val="true"/>
-              <w:bidi w:val="0"/>
-              <w:spacing w:lineRule="auto" w:line="259" w:before="0" w:after="160"/>
-              <w:jc w:val="left"/>
+              <w:spacing w:before="0" w:after="160"/>
               <w:rPr/>
             </w:pPr>
             <w:r>
@@ -876,7 +868,7 @@
         </w:tc>
         <w:tc>
           <w:tcPr>
-            <w:tcW w:w="1280" w:type="dxa"/>
+            <w:tcW w:w="1279" w:type="dxa"/>
             <w:tcBorders>
               <w:top w:val="single" w:sz="4" w:space="0" w:color="000000"/>
               <w:left w:val="single" w:sz="4" w:space="0" w:color="000000"/>
@@ -888,22 +880,26 @@
           <w:p>
             <w:pPr>
               <w:pStyle w:val="Normal"/>
-              <w:widowControl/>
-              <w:suppressAutoHyphens w:val="true"/>
-              <w:bidi w:val="0"/>
-              <w:spacing w:lineRule="auto" w:line="259" w:before="0" w:after="160"/>
-              <w:jc w:val="left"/>
-              <w:rPr/>
-            </w:pPr>
-            <w:r>
-              <w:rPr/>
-              <w:t>${title}</w:t>
-            </w:r>
-          </w:p>
-        </w:tc>
-        <w:tc>
-          <w:tcPr>
-            <w:tcW w:w="1184" w:type="dxa"/>
+              <w:spacing w:before="0" w:after="160"/>
+              <w:rPr/>
+            </w:pPr>
+            <w:r>
+              <w:rPr/>
+              <w:t>${</w:t>
+            </w:r>
+            <w:r>
+              <w:rPr/>
+              <w:t>justification</w:t>
+            </w:r>
+            <w:r>
+              <w:rPr/>
+              <w:t>}</w:t>
+            </w:r>
+          </w:p>
+        </w:tc>
+        <w:tc>
+          <w:tcPr>
+            <w:tcW w:w="1185" w:type="dxa"/>
             <w:gridSpan w:val="2"/>
             <w:tcBorders>
               <w:top w:val="single" w:sz="4" w:space="0" w:color="000000"/>
@@ -917,7 +913,6 @@
             <w:pPr>
               <w:pStyle w:val="Normal"/>
               <w:widowControl/>
-              <w:suppressAutoHyphens w:val="true"/>
               <w:bidi w:val="0"/>
               <w:spacing w:lineRule="auto" w:line="259" w:before="0" w:after="160"/>
               <w:jc w:val="left"/>
@@ -925,7 +920,6 @@
             </w:pPr>
             <w:r>
               <w:rPr/>
-              <w:t>${description}</w:t>
             </w:r>
           </w:p>
         </w:tc>
@@ -943,16 +937,11 @@
           <w:p>
             <w:pPr>
               <w:pStyle w:val="Normal"/>
-              <w:widowControl/>
-              <w:suppressAutoHyphens w:val="true"/>
-              <w:bidi w:val="0"/>
-              <w:spacing w:lineRule="auto" w:line="259" w:before="0" w:after="160"/>
-              <w:jc w:val="left"/>
-              <w:rPr/>
-            </w:pPr>
-            <w:r>
-              <w:rPr/>
-              <w:t>${justification}</w:t>
+              <w:spacing w:before="0" w:after="160"/>
+              <w:rPr/>
+            </w:pPr>
+            <w:r>
+              <w:rPr/>
             </w:r>
           </w:p>
         </w:tc>
@@ -999,7 +988,6 @@
             <w:pPr>
               <w:pStyle w:val="Normal"/>
               <w:widowControl/>
-              <w:suppressAutoHyphens w:val="true"/>
               <w:bidi w:val="0"/>
               <w:spacing w:lineRule="auto" w:line="259" w:before="0" w:after="160"/>
               <w:jc w:val="left"/>
@@ -1123,7 +1111,6 @@
             <w:pPr>
               <w:pStyle w:val="Normal"/>
               <w:widowControl/>
-              <w:suppressAutoHyphens w:val="true"/>
               <w:bidi w:val="0"/>
               <w:spacing w:lineRule="auto" w:line="259" w:before="0" w:after="160"/>
               <w:jc w:val="left"/>
@@ -1151,7 +1138,6 @@
             <w:pPr>
               <w:pStyle w:val="Normal"/>
               <w:widowControl/>
-              <w:suppressAutoHyphens w:val="true"/>
               <w:bidi w:val="0"/>
               <w:spacing w:lineRule="auto" w:line="259" w:before="0" w:after="160"/>
               <w:jc w:val="left"/>
@@ -1174,7 +1160,6 @@
             <w:pPr>
               <w:pStyle w:val="Normal"/>
               <w:widowControl/>
-              <w:suppressAutoHyphens w:val="true"/>
               <w:bidi w:val="0"/>
               <w:spacing w:lineRule="auto" w:line="259" w:before="0" w:after="160"/>
               <w:jc w:val="left"/>
@@ -1197,7 +1182,6 @@
             <w:pPr>
               <w:pStyle w:val="Normal"/>
               <w:widowControl/>
-              <w:suppressAutoHyphens w:val="true"/>
               <w:bidi w:val="0"/>
               <w:spacing w:lineRule="auto" w:line="259" w:before="0" w:after="160"/>
               <w:jc w:val="left"/>
@@ -1227,7 +1211,6 @@
       <w:pPr>
         <w:pStyle w:val="Normal"/>
         <w:widowControl/>
-        <w:suppressAutoHyphens w:val="true"/>
         <w:bidi w:val="0"/>
         <w:spacing w:lineRule="auto" w:line="259" w:before="0" w:after="160"/>
         <w:jc w:val="left"/>
@@ -2074,7 +2057,7 @@
       <w:spacing w:val="5"/>
     </w:rPr>
   </w:style>
-  <w:style w:type="paragraph" w:styleId="Ttulo" w:customStyle="1">
+  <w:style w:type="paragraph" w:styleId="Ttulo">
     <w:name w:val="Título"/>
     <w:basedOn w:val="Normal"/>
     <w:next w:val="BodyText"/>
@@ -2121,7 +2104,7 @@
       <w:szCs w:val="24"/>
     </w:rPr>
   </w:style>
-  <w:style w:type="paragraph" w:styleId="ndice" w:customStyle="1">
+  <w:style w:type="paragraph" w:styleId="ndice">
     <w:name w:val="Índice"/>
     <w:basedOn w:val="Normal"/>
     <w:qFormat/>
@@ -2132,10 +2115,36 @@
       <w:rFonts w:cs="Noto Sans Devanagari"/>
     </w:rPr>
   </w:style>
+  <w:style w:type="paragraph" w:styleId="Ttulouser">
+    <w:name w:val="Título (user)"/>
+    <w:basedOn w:val="Normal"/>
+    <w:next w:val="BodyText"/>
+    <w:qFormat/>
+    <w:pPr>
+      <w:keepNext w:val="true"/>
+      <w:spacing w:before="240" w:after="120"/>
+    </w:pPr>
+    <w:rPr>
+      <w:rFonts w:ascii="Liberation Sans" w:hAnsi="Liberation Sans" w:eastAsia="Noto Sans CJK SC" w:cs="Noto Sans Devanagari"/>
+      <w:sz w:val="28"/>
+      <w:szCs w:val="28"/>
+    </w:rPr>
+  </w:style>
+  <w:style w:type="paragraph" w:styleId="ndiceuser">
+    <w:name w:val="Índice (user)"/>
+    <w:basedOn w:val="Normal"/>
+    <w:qFormat/>
+    <w:pPr>
+      <w:suppressLineNumbers/>
+    </w:pPr>
+    <w:rPr>
+      <w:rFonts w:cs="Noto Sans Devanagari"/>
+    </w:rPr>
+  </w:style>
   <w:style w:type="paragraph" w:styleId="Title">
     <w:name w:val="Title"/>
     <w:basedOn w:val="Normal"/>
-    <w:next w:val="BodyText"/>
+    <w:next w:val="Normal"/>
     <w:link w:val="TtuloChar"/>
     <w:uiPriority w:val="10"/>
     <w:qFormat/>
@@ -2147,19 +2156,9 @@
     <w:rPr>
       <w:rFonts w:ascii="Calibri Light" w:hAnsi="Calibri Light" w:eastAsia="" w:cs="" w:asciiTheme="majorHAnsi" w:cstheme="majorBidi" w:eastAsiaTheme="majorEastAsia" w:hAnsiTheme="majorHAnsi"/>
       <w:spacing w:val="-10"/>
+      <w:kern w:val="2"/>
       <w:sz w:val="56"/>
       <w:szCs w:val="56"/>
-    </w:rPr>
-  </w:style>
-  <w:style w:type="paragraph" w:styleId="ndiceuser" w:customStyle="1">
-    <w:name w:val="Índice (user)"/>
-    <w:basedOn w:val="Normal"/>
-    <w:qFormat/>
-    <w:pPr>
-      <w:suppressLineNumbers/>
-    </w:pPr>
-    <w:rPr>
-      <w:rFonts w:cs="Noto Sans Devanagari"/>
     </w:rPr>
   </w:style>
   <w:style w:type="paragraph" w:styleId="Subtitle">

</xml_diff>